<commit_message>
ci(lab5): publish approved report and keep artifacts for one day (SGT-15)
</commit_message>
<xml_diff>
--- a/reports/Отчёт_по_лабораторной_работе_№_5.docx
+++ b/reports/Отчёт_по_лабораторной_работе_№_5.docx
@@ -4,7 +4,6 @@
   <w:body>
     <w:p>
       <w:pPr>
-        <w:pBdr/>
         <w:spacing w:after="0" w:line="240" w:lineRule="auto"/>
         <w:ind/>
         <w:jc w:val="center"/>
@@ -43,7 +42,6 @@
     </w:p>
     <w:p>
       <w:pPr>
-        <w:pBdr/>
         <w:spacing w:after="0" w:line="240" w:lineRule="auto"/>
         <w:ind/>
         <w:jc w:val="center"/>
@@ -92,7 +90,6 @@
     </w:p>
     <w:p>
       <w:pPr>
-        <w:pBdr/>
         <w:spacing w:after="0" w:line="240" w:lineRule="auto"/>
         <w:ind/>
         <w:jc w:val="center"/>
@@ -131,7 +128,6 @@
     </w:p>
     <w:p>
       <w:pPr>
-        <w:pBdr/>
         <w:spacing w:after="0" w:line="240" w:lineRule="auto"/>
         <w:ind/>
         <w:jc w:val="center"/>
@@ -187,7 +183,6 @@
           </w:tcPr>
           <w:p>
             <w:pPr>
-              <w:pBdr/>
               <w:spacing w:after="0" w:line="240" w:lineRule="auto"/>
               <w:ind/>
               <w:jc w:val="both"/>
@@ -228,7 +223,6 @@
           </w:tcPr>
           <w:p>
             <w:pPr>
-              <w:pBdr/>
               <w:spacing w:after="0" w:line="240" w:lineRule="auto"/>
               <w:ind/>
               <w:jc w:val="center"/>
@@ -270,7 +264,6 @@
           </w:tcPr>
           <w:p>
             <w:pPr>
-              <w:pBdr/>
               <w:spacing w:after="0" w:line="240" w:lineRule="auto"/>
               <w:ind/>
               <w:jc w:val="both"/>
@@ -312,7 +305,6 @@
           </w:tcPr>
           <w:p>
             <w:pPr>
-              <w:pBdr/>
               <w:spacing w:after="0" w:line="240" w:lineRule="auto"/>
               <w:ind/>
               <w:jc w:val="center"/>
@@ -355,7 +347,6 @@
           </w:tcPr>
           <w:p>
             <w:pPr>
-              <w:pBdr/>
               <w:spacing w:after="0" w:line="240" w:lineRule="auto"/>
               <w:ind/>
               <w:jc w:val="both"/>
@@ -397,7 +388,6 @@
           </w:tcPr>
           <w:p>
             <w:pPr>
-              <w:pBdr/>
               <w:spacing w:after="0" w:line="240" w:lineRule="auto"/>
               <w:ind/>
               <w:jc w:val="center"/>
@@ -454,7 +444,6 @@
     </w:tbl>
     <w:p>
       <w:pPr>
-        <w:pBdr/>
         <w:spacing/>
         <w:ind/>
         <w:rPr>
@@ -491,7 +480,6 @@
     </w:p>
     <w:p>
       <w:pPr>
-        <w:pBdr/>
         <w:spacing w:after="0" w:line="240" w:lineRule="auto"/>
         <w:ind/>
         <w:jc w:val="center"/>
@@ -538,7 +526,6 @@
     </w:p>
     <w:p>
       <w:pPr>
-        <w:pBdr/>
         <w:spacing w:after="0" w:line="240" w:lineRule="auto"/>
         <w:ind/>
         <w:jc w:val="center"/>
@@ -596,7 +583,6 @@
     </w:p>
     <w:p>
       <w:pPr>
-        <w:pBdr/>
         <w:spacing w:after="0" w:line="240" w:lineRule="auto"/>
         <w:ind/>
         <w:jc w:val="center"/>
@@ -653,7 +639,6 @@
     </w:p>
     <w:p>
       <w:pPr>
-        <w:pBdr/>
         <w:spacing w:after="0" w:line="240" w:lineRule="auto"/>
         <w:ind/>
         <w:jc w:val="center"/>
@@ -717,7 +702,6 @@
           </w:tcPr>
           <w:p>
             <w:pPr>
-              <w:pBdr/>
               <w:spacing w:after="0" w:line="240" w:lineRule="auto"/>
               <w:ind/>
               <w:jc w:val="both"/>
@@ -764,7 +748,6 @@
           </w:tcPr>
           <w:p>
             <w:pPr>
-              <w:pBdr/>
               <w:spacing w:after="0" w:line="240" w:lineRule="auto"/>
               <w:ind/>
               <w:jc w:val="center"/>
@@ -806,7 +789,6 @@
     </w:tbl>
     <w:p>
       <w:pPr>
-        <w:pBdr/>
         <w:spacing w:after="0" w:line="240" w:lineRule="auto"/>
         <w:ind/>
         <w:jc w:val="center"/>
@@ -871,7 +853,6 @@
           </w:tcPr>
           <w:p>
             <w:pPr>
-              <w:pBdr/>
               <w:spacing w:after="0" w:line="240" w:lineRule="auto"/>
               <w:ind/>
               <w:jc w:val="both"/>
@@ -918,7 +899,6 @@
           </w:tcPr>
           <w:p>
             <w:pPr>
-              <w:pBdr/>
               <w:spacing w:after="0" w:line="240" w:lineRule="auto"/>
               <w:ind/>
               <w:jc w:val="both"/>
@@ -964,7 +944,6 @@
           </w:tcPr>
           <w:p>
             <w:pPr>
-              <w:pBdr/>
               <w:spacing w:after="0" w:line="240" w:lineRule="auto"/>
               <w:ind/>
               <w:jc w:val="center"/>
@@ -1012,7 +991,6 @@
           </w:tcPr>
           <w:p>
             <w:pPr>
-              <w:pBdr/>
               <w:spacing w:after="0" w:line="240" w:lineRule="auto"/>
               <w:ind/>
               <w:jc w:val="both"/>
@@ -1059,7 +1037,6 @@
           </w:tcPr>
           <w:p>
             <w:pPr>
-              <w:pBdr/>
               <w:spacing w:after="0" w:line="240" w:lineRule="auto"/>
               <w:ind/>
               <w:jc w:val="center"/>
@@ -1111,7 +1088,6 @@
           </w:tcPr>
           <w:p>
             <w:pPr>
-              <w:pBdr/>
               <w:spacing w:after="0" w:line="240" w:lineRule="auto"/>
               <w:ind/>
               <w:jc w:val="center"/>
@@ -1157,7 +1133,6 @@
     </w:tbl>
     <w:p>
       <w:pPr>
-        <w:pBdr/>
         <w:spacing w:after="0" w:line="240" w:lineRule="auto"/>
         <w:ind/>
         <w:jc w:val="both"/>
@@ -1217,7 +1192,6 @@
           </w:tcPr>
           <w:p>
             <w:pPr>
-              <w:pBdr/>
               <w:spacing w:after="0" w:line="240" w:lineRule="auto"/>
               <w:ind/>
               <w:rPr>
@@ -1264,7 +1238,6 @@
           </w:tcPr>
           <w:p>
             <w:pPr>
-              <w:pBdr/>
               <w:spacing w:after="0" w:line="240" w:lineRule="auto"/>
               <w:ind/>
               <w:jc w:val="center"/>
@@ -1310,7 +1283,6 @@
           </w:tcPr>
           <w:p>
             <w:pPr>
-              <w:pBdr/>
               <w:spacing w:after="0" w:line="240" w:lineRule="auto"/>
               <w:ind/>
               <w:jc w:val="both"/>
@@ -1357,7 +1329,6 @@
           </w:tcPr>
           <w:p>
             <w:pPr>
-              <w:pBdr/>
               <w:spacing w:after="0" w:line="240" w:lineRule="auto"/>
               <w:ind/>
               <w:jc w:val="center"/>
@@ -1406,7 +1377,6 @@
           </w:tcPr>
           <w:p>
             <w:pPr>
-              <w:pBdr/>
               <w:spacing w:after="0" w:line="240" w:lineRule="auto"/>
               <w:ind/>
               <w:rPr>
@@ -1454,7 +1424,6 @@
           </w:tcPr>
           <w:p>
             <w:pPr>
-              <w:pBdr/>
               <w:spacing w:after="0" w:line="240" w:lineRule="auto"/>
               <w:ind/>
               <w:jc w:val="center"/>
@@ -1503,7 +1472,6 @@
           </w:tcPr>
           <w:p>
             <w:pPr>
-              <w:pBdr/>
               <w:spacing w:after="0" w:line="240" w:lineRule="auto"/>
               <w:ind/>
               <w:rPr>
@@ -1551,7 +1519,6 @@
           <w:p>
             <w:pPr>
               <w:pStyle w:val="829"/>
-              <w:pBdr/>
               <w:spacing w:after="0" w:before="0" w:line="240" w:lineRule="auto"/>
               <w:ind/>
               <w:jc w:val="center"/>
@@ -1600,7 +1567,6 @@
           </w:tcPr>
           <w:p>
             <w:pPr>
-              <w:pBdr/>
               <w:spacing w:after="0" w:line="240" w:lineRule="auto"/>
               <w:ind/>
               <w:jc w:val="both"/>
@@ -1647,7 +1613,6 @@
           </w:tcPr>
           <w:p>
             <w:pPr>
-              <w:pBdr/>
               <w:spacing w:after="0" w:line="240" w:lineRule="auto"/>
               <w:ind/>
               <w:jc w:val="center"/>
@@ -1693,7 +1658,6 @@
     </w:tbl>
     <w:p>
       <w:pPr>
-        <w:pBdr/>
         <w:spacing w:after="0" w:line="240" w:lineRule="auto"/>
         <w:ind/>
         <w:rPr>
@@ -1730,7 +1694,6 @@
     </w:p>
     <w:p>
       <w:pPr>
-        <w:pBdr/>
         <w:spacing w:after="0" w:line="240" w:lineRule="auto"/>
         <w:ind/>
         <w:rPr>
@@ -1822,7 +1785,6 @@
     </w:p>
     <w:p>
       <w:pPr>
-        <w:pBdr/>
         <w:spacing w:after="0" w:line="240" w:lineRule="auto"/>
         <w:ind/>
         <w:rPr>
@@ -1859,7 +1821,6 @@
     </w:p>
     <w:p>
       <w:pPr>
-        <w:pBdr/>
         <w:spacing w:after="0" w:line="240" w:lineRule="auto"/>
         <w:ind/>
         <w:rPr>
@@ -1896,7 +1857,6 @@
     </w:p>
     <w:p>
       <w:pPr>
-        <w:pBdr/>
         <w:spacing w:after="0" w:line="240" w:lineRule="auto"/>
         <w:ind/>
         <w:rPr>
@@ -1933,7 +1893,6 @@
     </w:p>
     <w:p>
       <w:pPr>
-        <w:pBdr/>
         <w:spacing w:after="0" w:line="240" w:lineRule="auto"/>
         <w:ind w:firstLine="708" w:left="4248"/>
         <w:rPr>
@@ -1971,7 +1930,6 @@
     </w:p>
     <w:p>
       <w:pPr>
-        <w:pBdr/>
         <w:spacing w:after="0" w:line="240" w:lineRule="auto"/>
         <w:ind/>
         <w:rPr>
@@ -2064,7 +2022,6 @@
     </w:p>
     <w:p>
       <w:pPr>
-        <w:pBdr/>
         <w:spacing w:after="0" w:line="240" w:lineRule="auto"/>
         <w:ind w:left="5669"/>
         <w:rPr>
@@ -2101,7 +2058,6 @@
     </w:p>
     <w:p>
       <w:pPr>
-        <w:pBdr/>
         <w:spacing w:after="0" w:line="240" w:lineRule="auto"/>
         <w:ind/>
         <w:rPr>
@@ -2194,7 +2150,6 @@
     </w:p>
     <w:p>
       <w:pPr>
-        <w:pBdr/>
         <w:spacing w:after="0" w:line="240" w:lineRule="auto"/>
         <w:ind/>
         <w:rPr>
@@ -2287,7 +2242,6 @@
     </w:p>
     <w:p>
       <w:pPr>
-        <w:pBdr/>
         <w:spacing w:after="0" w:line="240" w:lineRule="auto"/>
         <w:ind w:left="5669"/>
         <w:rPr>
@@ -2324,7 +2278,6 @@
     </w:p>
     <w:p>
       <w:pPr>
-        <w:pBdr/>
         <w:spacing w:after="0" w:line="240" w:lineRule="auto"/>
         <w:ind/>
         <w:rPr>
@@ -2417,7 +2370,6 @@
     </w:p>
     <w:p>
       <w:pPr>
-        <w:pBdr/>
         <w:spacing w:after="0" w:line="240" w:lineRule="auto"/>
         <w:ind/>
         <w:rPr>
@@ -2510,7 +2462,6 @@
     </w:p>
     <w:p>
       <w:pPr>
-        <w:pBdr/>
         <w:spacing w:after="0" w:line="240" w:lineRule="auto"/>
         <w:ind/>
         <w:rPr>
@@ -2547,7 +2498,6 @@
     </w:p>
     <w:p>
       <w:pPr>
-        <w:pBdr/>
         <w:spacing w:after="0" w:line="240" w:lineRule="auto"/>
         <w:ind/>
         <w:rPr>
@@ -2584,7 +2534,6 @@
     </w:p>
     <w:p>
       <w:pPr>
-        <w:pBdr/>
         <w:spacing w:after="0" w:line="240" w:lineRule="auto"/>
         <w:ind/>
         <w:rPr>
@@ -2621,7 +2570,6 @@
     </w:p>
     <w:p>
       <w:pPr>
-        <w:pBdr/>
         <w:spacing w:after="0" w:line="240" w:lineRule="auto"/>
         <w:ind/>
         <w:rPr>
@@ -2658,7 +2606,6 @@
     </w:p>
     <w:p>
       <w:pPr>
-        <w:pBdr/>
         <w:spacing w:after="0" w:line="240" w:lineRule="auto"/>
         <w:ind/>
         <w:rPr>
@@ -2695,7 +2642,6 @@
     </w:p>
     <w:p>
       <w:pPr>
-        <w:pBdr/>
         <w:spacing w:after="0" w:line="240" w:lineRule="auto"/>
         <w:ind/>
         <w:rPr>
@@ -2732,7 +2678,6 @@
     </w:p>
     <w:p>
       <w:pPr>
-        <w:pBdr/>
         <w:spacing w:after="0" w:line="240" w:lineRule="auto"/>
         <w:ind/>
         <w:rPr>
@@ -2769,7 +2714,6 @@
     </w:p>
     <w:p>
       <w:pPr>
-        <w:pBdr/>
         <w:spacing w:after="0" w:line="240" w:lineRule="auto"/>
         <w:ind/>
         <w:rPr>
@@ -2806,7 +2750,6 @@
     </w:p>
     <w:p>
       <w:pPr>
-        <w:pBdr/>
         <w:spacing w:after="0" w:line="240" w:lineRule="auto"/>
         <w:ind/>
         <w:jc w:val="center"/>
@@ -2845,7 +2788,6 @@
     </w:p>
     <w:p>
       <w:pPr>
-        <w:pBdr/>
         <w:spacing w:after="0" w:line="240" w:lineRule="auto"/>
         <w:ind/>
         <w:jc w:val="center"/>
@@ -2884,7 +2826,6 @@
     </w:p>
     <w:p>
       <w:pPr>
-        <w:pBdr/>
         <w:spacing/>
         <w:ind/>
         <w:rPr/>
@@ -2894,7 +2835,6 @@
     </w:p>
     <w:p>
       <w:pPr>
-        <w:pBdr/>
         <w:spacing/>
         <w:ind/>
         <w:rPr/>
@@ -2906,7 +2846,6 @@
     </w:p>
     <w:p>
       <w:pPr>
-        <w:pBdr/>
         <w:spacing w:after="120" w:line="276" w:lineRule="auto"/>
         <w:ind/>
         <w:jc w:val="center"/>
@@ -2925,12 +2864,17 @@
         </w:rPr>
         <w:t xml:space="preserve">Лабораторная работа № 5</w:t>
       </w:r>
+      <w:r>
+        <w:rPr>
+          <w:sz w:val="28"/>
+          <w:szCs w:val="28"/>
+        </w:rPr>
+      </w:r>
     </w:p>
     <w:p>
       <w:pPr>
         <w:pStyle w:val="848"/>
         <w:keepNext w:val="true"/>
-        <w:pBdr/>
         <w:spacing w:after="160" w:before="0"/>
         <w:ind/>
         <w:jc w:val="center"/>
@@ -2949,10 +2893,15 @@
         </w:rPr>
         <w:t xml:space="preserve">Управление исходным кодом и отслеживание метрик</w:t>
       </w:r>
+      <w:r>
+        <w:rPr>
+          <w:sz w:val="28"/>
+          <w:szCs w:val="28"/>
+        </w:rPr>
+      </w:r>
     </w:p>
     <w:p>
       <w:pPr>
-        <w:pBdr/>
         <w:spacing w:after="120" w:line="276" w:lineRule="auto"/>
         <w:ind/>
         <w:jc w:val="both"/>
@@ -2969,14 +2918,29 @@
           <w:sz w:val="28"/>
           <w:szCs w:val="28"/>
         </w:rPr>
-        <w:t xml:space="preserve">Цель работы — настроить управление исходным кодом, автоматические проверки, сборку и сбор метрик качества для проекта справочника городского транспорта. Подготовлен работающий учебный срез на Go, PostgreSQL и React; результаты проверены локально и в GitHub Actions.</w:t>
+        <w:t xml:space="preserve">Цель рабо</w:t>
+      </w:r>
+      <w:r>
+        <w:rPr>
+          <w:rFonts w:ascii="Times New Roman" w:hAnsi="Times New Roman"/>
+          <w:b w:val="0"/>
+          <w:color w:val="000000"/>
+          <w:sz w:val="28"/>
+          <w:szCs w:val="28"/>
+        </w:rPr>
+        <w:t xml:space="preserve">ты — настроить управление исходным кодом, автоматические проверки, сборку и сбор метрик качества для проекта справочника городского транспорта. Подготовлен работающий учебный срез на Go, PostgreSQL и React; результаты проверены локально и в GitHub Actions.</w:t>
+      </w:r>
+      <w:r>
+        <w:rPr>
+          <w:sz w:val="28"/>
+          <w:szCs w:val="28"/>
+        </w:rPr>
       </w:r>
     </w:p>
     <w:p>
       <w:pPr>
         <w:keepNext w:val="true"/>
         <w:pageBreakBefore w:val="false"/>
-        <w:pBdr/>
         <w:spacing w:after="120" w:before="180" w:line="276" w:lineRule="auto"/>
         <w:ind/>
         <w:jc w:val="center"/>
@@ -2995,10 +2959,15 @@
         </w:rPr>
         <w:t xml:space="preserve">Репозиторий и границы реализации</w:t>
       </w:r>
+      <w:r>
+        <w:rPr>
+          <w:sz w:val="28"/>
+          <w:szCs w:val="28"/>
+        </w:rPr>
+      </w:r>
     </w:p>
     <w:p>
       <w:pPr>
-        <w:pBdr/>
         <w:spacing w:after="120" w:line="276" w:lineRule="auto"/>
         <w:ind/>
         <w:jc w:val="both"/>
@@ -3015,20 +2984,8 @@
           <w:sz w:val="28"/>
           <w:szCs w:val="28"/>
         </w:rPr>
-        <w:t xml:space="preserve">Использован публичный репозиторий GitHub vasmaae/software-engineering. Go API читает три демонстрационных маршрута из PostgreSQL; React отображает каталог, поиск по номеру и фильтр транспорта. Данные вымышленные. Администрирование, связанные остановки и расписания остаются задачами последующих итераций.</w:t>
+        <w:t xml:space="preserve">Использован публичный репозиторий GitHub vasmaae</w:t>
       </w:r>
-    </w:p>
-    <w:p>
-      <w:pPr>
-        <w:pBdr/>
-        <w:spacing w:after="120" w:line="276" w:lineRule="auto"/>
-        <w:ind/>
-        <w:jc w:val="both"/>
-        <w:rPr>
-          <w:sz w:val="28"/>
-          <w:szCs w:val="28"/>
-        </w:rPr>
-      </w:pPr>
       <w:r>
         <w:rPr>
           <w:rFonts w:ascii="Times New Roman" w:hAnsi="Times New Roman"/>
@@ -3037,14 +2994,56 @@
           <w:sz w:val="28"/>
           <w:szCs w:val="28"/>
         </w:rPr>
-        <w:t xml:space="preserve">Исходники API размещены в cmd/api и internal/catalog, интерфейс — в web, SQL — в db, контейнеры — в deploy. Файлы README.md, docs/contributing.md и docs/quality.md описывают запуск, правила Git и метрики. Предыдущие отчёты сохранены в reports. Зависимости фиксируются package-lock.json и go.sum; .env исключён из Git.</w:t>
+        <w:t xml:space="preserve">/software-engineering. Go API читает три демонстрационных маршрута из PostgreSQL; React отображает каталог, поиск по номеру и фильтр транспорта. Данные вымышленные. Администрирование, связанные остановки и расписания остаются задачами последующих итераций.</w:t>
+      </w:r>
+      <w:r>
+        <w:rPr>
+          <w:sz w:val="28"/>
+          <w:szCs w:val="28"/>
+        </w:rPr>
       </w:r>
     </w:p>
     <w:p>
       <w:pPr>
+        <w:spacing w:after="120" w:line="276" w:lineRule="auto"/>
+        <w:ind/>
+        <w:jc w:val="both"/>
+        <w:rPr>
+          <w:sz w:val="28"/>
+          <w:szCs w:val="28"/>
+        </w:rPr>
+      </w:pPr>
+      <w:r>
+        <w:rPr>
+          <w:rFonts w:ascii="Times New Roman" w:hAnsi="Times New Roman"/>
+          <w:b w:val="0"/>
+          <w:color w:val="000000"/>
+          <w:sz w:val="28"/>
+          <w:szCs w:val="28"/>
+        </w:rPr>
+        <w:t xml:space="preserve">Исходники API размещены в cmd/api и internal/catalog, интерфе</w:t>
+      </w:r>
+      <w:r>
+        <w:rPr>
+          <w:rFonts w:ascii="Times New Roman" w:hAnsi="Times New Roman"/>
+          <w:b w:val="0"/>
+          <w:color w:val="000000"/>
+          <w:sz w:val="28"/>
+          <w:szCs w:val="28"/>
+        </w:rPr>
+        <w:t xml:space="preserve">йс — в web, SQL — в db, контейнеры — в deploy. Файлы README.md, docs/contributing.md и docs/quality.md описывают запуск, правила Git и метрики. Предыдущие отчёты сохранены в reports. Зависимости фиксируются package-lock.json и go.sum; .env исключён из Git.</w:t>
+      </w:r>
+      <w:r>
+        <w:rPr>
+          <w:sz w:val="28"/>
+          <w:szCs w:val="28"/>
+        </w:rPr>
+      </w:r>
+    </w:p>
+    <w:p>
+      <w:pPr>
         <w:keepNext w:val="true"/>
         <w:pageBreakBefore w:val="false"/>
-        <w:pBdr/>
         <w:spacing w:after="120" w:before="180" w:line="276" w:lineRule="auto"/>
         <w:ind/>
         <w:jc w:val="center"/>
@@ -3061,12 +3060,17 @@
           <w:sz w:val="28"/>
           <w:szCs w:val="28"/>
         </w:rPr>
-        <w:t xml:space="preserve">Правила фиксации изменений</w:t>
+        <w:t xml:space="preserve">Фиксация изменений</w:t>
+      </w:r>
+      <w:r>
+        <w:rPr>
+          <w:sz w:val="28"/>
+          <w:szCs w:val="28"/>
+        </w:rPr>
       </w:r>
     </w:p>
     <w:p>
       <w:pPr>
-        <w:pBdr/>
         <w:spacing w:after="120" w:line="276" w:lineRule="auto"/>
         <w:ind/>
         <w:jc w:val="both"/>
@@ -3083,20 +3087,8 @@
           <w:sz w:val="28"/>
           <w:szCs w:val="28"/>
         </w:rPr>
-        <w:t xml:space="preserve">Принят Conventional Commits: type(scope): описание. Типы feat, fix, docs, test, refactor, perf, style, build, ci, chore и revert показывают назначение изменения. Пример: feat(catalog): add SGT demo and quality pipeline. Один коммит содержит одно законченное изменение; связанные ID SGT указываются в сообщении или PR.</w:t>
+        <w:t xml:space="preserve">Принят Conventional Commits 1.0.0: type(scope): описание. Область scope не</w:t>
       </w:r>
-    </w:p>
-    <w:p>
-      <w:pPr>
-        <w:pBdr/>
-        <w:spacing w:after="120" w:line="276" w:lineRule="auto"/>
-        <w:ind/>
-        <w:jc w:val="both"/>
-        <w:rPr>
-          <w:sz w:val="28"/>
-          <w:szCs w:val="28"/>
-        </w:rPr>
-      </w:pPr>
       <w:r>
         <w:rPr>
           <w:rFonts w:ascii="Times New Roman" w:hAnsi="Times New Roman"/>
@@ -3105,14 +3097,93 @@
           <w:sz w:val="28"/>
           <w:szCs w:val="28"/>
         </w:rPr>
-        <w:t xml:space="preserve">make setup подключает hook .githooks/commit-msg с commitlint. При проверке сообщение «bad message» отклонено: отсутствуют type и subject. Корректное сообщение принято. В CI отдельно проверяется весь диапазон новых коммитов, поэтому обход локального hook не обходит серверную проверку.</w:t>
+        <w:t xml:space="preserve">обязательна. Типы: feat, fix, docs, test, refactor, perf, style, build, ci, chore, revert. Заголовок — до 100 символов; тип и начало английского описания пишутся строчными буквами, точка в конце не ставится. Один коммит содержит одно законченное изменение.</w:t>
+      </w:r>
+      <w:r>
+        <w:rPr>
+          <w:sz w:val="28"/>
+          <w:szCs w:val="28"/>
+        </w:rPr>
       </w:r>
     </w:p>
     <w:p>
       <w:pPr>
+        <w:spacing w:after="120" w:line="276" w:lineRule="auto"/>
+        <w:ind/>
+        <w:jc w:val="both"/>
+        <w:rPr>
+          <w:sz w:val="28"/>
+          <w:szCs w:val="28"/>
+        </w:rPr>
+      </w:pPr>
+      <w:r>
+        <w:rPr>
+          <w:rFonts w:ascii="Times New Roman" w:hAnsi="Times New Roman"/>
+          <w:b w:val="0"/>
+          <w:color w:val="000000"/>
+          <w:sz w:val="28"/>
+          <w:szCs w:val="28"/>
+        </w:rPr>
+        <w:t xml:space="preserve">Пример: «ci(branches): enforce task branch and PR conventions (SGT-15)». feat обозначает но</w:t>
+      </w:r>
+      <w:r>
+        <w:rPr>
+          <w:rFonts w:ascii="Times New Roman" w:hAnsi="Times New Roman"/>
+          <w:b w:val="0"/>
+          <w:color w:val="000000"/>
+          <w:sz w:val="28"/>
+          <w:szCs w:val="28"/>
+        </w:rPr>
+        <w:t xml:space="preserve">вую функцию, fix — исправление, docs — документацию, ci — изменение пайплайна. Несовместимое API отмечается ! после типа или области либо footer «BREAKING CHANGE: описание». Тело отделяется пустой строкой; строки тела и footer — до 100 символов, кроме URL.</w:t>
+      </w:r>
+      <w:r>
+        <w:rPr>
+          <w:sz w:val="28"/>
+          <w:szCs w:val="28"/>
+        </w:rPr>
+      </w:r>
+    </w:p>
+    <w:p>
+      <w:pPr>
+        <w:spacing w:after="120" w:line="276" w:lineRule="auto"/>
+        <w:ind/>
+        <w:jc w:val="both"/>
+        <w:rPr>
+          <w:sz w:val="28"/>
+          <w:szCs w:val="28"/>
+        </w:rPr>
+      </w:pPr>
+      <w:r>
+        <w:rPr>
+          <w:rFonts w:ascii="Times New Roman" w:hAnsi="Times New Roman"/>
+          <w:b w:val="0"/>
+          <w:color w:val="000000"/>
+          <w:sz w:val="28"/>
+          <w:szCs w:val="28"/>
+        </w:rPr>
+        <w:t xml:space="preserve">commitlint.config.js под</w:t>
+      </w:r>
+      <w:r>
+        <w:rPr>
+          <w:rFonts w:ascii="Times New Roman" w:hAnsi="Times New Roman"/>
+          <w:b w:val="0"/>
+          <w:color w:val="000000"/>
+          <w:sz w:val="28"/>
+          <w:szCs w:val="28"/>
+        </w:rPr>
+        <w:t xml:space="preserve">ключает config-conventional. make setup подключает commit-msg hook; CI проверяет все новые коммиты через scripts/check-commits.sh. Сообщение «bad message» отклонено, корректное сообщение принято. Протокол: docs/measurements/SGT-15/commitlint-rejection.txt.</w:t>
+      </w:r>
+      <w:r>
+        <w:rPr>
+          <w:sz w:val="28"/>
+          <w:szCs w:val="28"/>
+        </w:rPr>
+      </w:r>
+    </w:p>
+    <w:p>
+      <w:pPr>
         <w:keepNext w:val="true"/>
         <w:pageBreakBefore w:val="true"/>
-        <w:pBdr/>
         <w:spacing w:after="120" w:before="180" w:line="276" w:lineRule="auto"/>
         <w:ind/>
         <w:jc w:val="center"/>
@@ -3129,12 +3200,17 @@
           <w:sz w:val="28"/>
           <w:szCs w:val="28"/>
         </w:rPr>
-        <w:t xml:space="preserve">Ветвление и слияние</w:t>
+        <w:t xml:space="preserve">Ветвление и имена веток</w:t>
+      </w:r>
+      <w:r>
+        <w:rPr>
+          <w:sz w:val="28"/>
+          <w:szCs w:val="28"/>
+        </w:rPr>
       </w:r>
     </w:p>
     <w:p>
       <w:pPr>
-        <w:pBdr/>
         <w:spacing w:after="120" w:line="276" w:lineRule="auto"/>
         <w:ind/>
         <w:jc w:val="both"/>
@@ -3151,20 +3227,8 @@
           <w:sz w:val="28"/>
           <w:szCs w:val="28"/>
         </w:rPr>
-        <w:t xml:space="preserve">Выбран GitHub Flow: постоянная main и короткие ветки задач. Изменения ЛР5 выполнены в sgt-15-lab5. После push открыт pull request № 1 с описанием результата, проверок и ссылкой на SGT-15. Отдельная develop для одного исполнителя не создавалась.</w:t>
+        <w:t xml:space="preserve">Реализован GitHub Flow: постоянная </w:t>
       </w:r>
-    </w:p>
-    <w:p>
-      <w:pPr>
-        <w:pBdr/>
-        <w:spacing w:after="120" w:line="276" w:lineRule="auto"/>
-        <w:ind/>
-        <w:jc w:val="both"/>
-        <w:rPr>
-          <w:sz w:val="28"/>
-          <w:szCs w:val="28"/>
-        </w:rPr>
-      </w:pPr>
       <w:r>
         <w:rPr>
           <w:rFonts w:ascii="Times New Roman" w:hAnsi="Times New Roman"/>
@@ -3173,12 +3237,570 @@
           <w:sz w:val="28"/>
           <w:szCs w:val="28"/>
         </w:rPr>
-        <w:t xml:space="preserve">Защита main требует pull request и успешную актуальную проверку quality. Правило действует для администратора; force push и удаление main запрещены. Включены линейная история и требование завершить обсуждения перед слиянием. Одобрение второго участника не требуется, поскольку работу выполняет один студент. Это не заменяет независимое ревью.</w:t>
+        <w:t xml:space="preserve">main и короткие ветки задач от актуальной main. Отдельная develop не используется. Соглашение проекта: &lt;тип&gt;/SGT-&lt;номер&gt;-&lt;описание&gt;. Номер положительный, без ведущего нуля. Описание — строчные латинские буквы и цифры; слова разделяются одиночными дефисами.</w:t>
+      </w:r>
+      <w:r>
+        <w:rPr>
+          <w:sz w:val="28"/>
+          <w:szCs w:val="28"/>
+        </w:rPr>
       </w:r>
     </w:p>
+    <w:tbl>
+      <w:tblPr>
+        <w:tblW w:w="9355" w:type="dxa"/>
+        <w:tblCellMar>
+          <w:left w:w="80" w:type="dxa"/>
+          <w:top w:w="80" w:type="dxa"/>
+          <w:right w:w="80" w:type="dxa"/>
+          <w:bottom w:w="80" w:type="dxa"/>
+        </w:tblCellMar>
+        <w:tblBorders>
+          <w:top w:val="single" w:color="d9d9d9" w:sz="4" w:space="0"/>
+          <w:left w:val="single" w:color="d9d9d9" w:sz="4" w:space="0"/>
+          <w:bottom w:val="single" w:color="d9d9d9" w:sz="4" w:space="0"/>
+          <w:right w:val="single" w:color="d9d9d9" w:sz="4" w:space="0"/>
+          <w:insideH w:val="single" w:color="d9d9d9" w:sz="4" w:space="0"/>
+          <w:insideV w:val="single" w:color="d9d9d9" w:sz="4" w:space="0"/>
+        </w:tblBorders>
+        <w:tblLayout w:type="fixed"/>
+        <w:tblLook w:val="04A0" w:firstRow="1" w:lastRow="0" w:firstColumn="1" w:lastColumn="0" w:noHBand="0" w:noVBand="1"/>
+      </w:tblPr>
+      <w:tblGrid>
+        <w:gridCol w:w="1450"/>
+        <w:gridCol w:w="2500"/>
+        <w:gridCol w:w="5405"/>
+      </w:tblGrid>
+      <w:tr>
+        <w:trPr>
+          <w:cantSplit/>
+          <w:tblHeader/>
+        </w:trPr>
+        <w:tc>
+          <w:tcPr>
+            <w:shd w:val="clear" w:color="auto" w:fill="ededed"/>
+            <w:tcBorders/>
+            <w:tcW w:w="1450" w:type="dxa"/>
+            <w:vAlign w:val="center"/>
+          </w:tcPr>
+          <w:p>
+            <w:pPr>
+              <w:spacing w:after="0" w:before="0" w:line="240" w:lineRule="auto"/>
+              <w:ind/>
+              <w:jc w:val="left"/>
+              <w:rPr>
+                <w:sz w:val="28"/>
+                <w:szCs w:val="28"/>
+              </w:rPr>
+            </w:pPr>
+            <w:r>
+              <w:rPr>
+                <w:rFonts w:ascii="Times New Roman" w:hAnsi="Times New Roman"/>
+                <w:b/>
+                <w:color w:val="000000"/>
+                <w:sz w:val="28"/>
+                <w:szCs w:val="28"/>
+              </w:rPr>
+              <w:t xml:space="preserve">Префикс</w:t>
+            </w:r>
+            <w:r>
+              <w:rPr>
+                <w:sz w:val="28"/>
+                <w:szCs w:val="28"/>
+              </w:rPr>
+            </w:r>
+          </w:p>
+        </w:tc>
+        <w:tc>
+          <w:tcPr>
+            <w:shd w:val="clear" w:color="auto" w:fill="ededed"/>
+            <w:tcBorders/>
+            <w:tcW w:w="2500" w:type="dxa"/>
+            <w:vAlign w:val="center"/>
+          </w:tcPr>
+          <w:p>
+            <w:pPr>
+              <w:spacing w:after="0" w:before="0" w:line="240" w:lineRule="auto"/>
+              <w:ind/>
+              <w:jc w:val="center"/>
+              <w:rPr>
+                <w:sz w:val="28"/>
+                <w:szCs w:val="28"/>
+              </w:rPr>
+            </w:pPr>
+            <w:r>
+              <w:rPr>
+                <w:rFonts w:ascii="Times New Roman" w:hAnsi="Times New Roman"/>
+                <w:b/>
+                <w:color w:val="000000"/>
+                <w:sz w:val="28"/>
+                <w:szCs w:val="28"/>
+              </w:rPr>
+              <w:t xml:space="preserve">Назначение</w:t>
+            </w:r>
+            <w:r>
+              <w:rPr>
+                <w:sz w:val="28"/>
+                <w:szCs w:val="28"/>
+              </w:rPr>
+            </w:r>
+          </w:p>
+        </w:tc>
+        <w:tc>
+          <w:tcPr>
+            <w:shd w:val="clear" w:color="auto" w:fill="ededed"/>
+            <w:tcBorders/>
+            <w:tcW w:w="5405" w:type="dxa"/>
+            <w:vAlign w:val="center"/>
+          </w:tcPr>
+          <w:p>
+            <w:pPr>
+              <w:spacing w:after="0" w:before="0" w:line="240" w:lineRule="auto"/>
+              <w:ind/>
+              <w:jc w:val="left"/>
+              <w:rPr>
+                <w:sz w:val="28"/>
+                <w:szCs w:val="28"/>
+              </w:rPr>
+            </w:pPr>
+            <w:r>
+              <w:rPr>
+                <w:rFonts w:ascii="Times New Roman" w:hAnsi="Times New Roman"/>
+                <w:b/>
+                <w:color w:val="000000"/>
+                <w:sz w:val="28"/>
+                <w:szCs w:val="28"/>
+              </w:rPr>
+              <w:t xml:space="preserve">Созданная ветка</w:t>
+            </w:r>
+            <w:r>
+              <w:rPr>
+                <w:sz w:val="28"/>
+                <w:szCs w:val="28"/>
+              </w:rPr>
+            </w:r>
+          </w:p>
+        </w:tc>
+      </w:tr>
+      <w:tr>
+        <w:trPr>
+          <w:cantSplit/>
+        </w:trPr>
+        <w:tc>
+          <w:tcPr>
+            <w:tcBorders/>
+            <w:tcW w:w="1450" w:type="dxa"/>
+            <w:vAlign w:val="center"/>
+          </w:tcPr>
+          <w:p>
+            <w:pPr>
+              <w:spacing w:after="0" w:before="0" w:line="240" w:lineRule="auto"/>
+              <w:ind/>
+              <w:jc w:val="left"/>
+              <w:rPr>
+                <w:sz w:val="28"/>
+                <w:szCs w:val="28"/>
+              </w:rPr>
+            </w:pPr>
+            <w:r>
+              <w:rPr>
+                <w:rFonts w:ascii="Times New Roman" w:hAnsi="Times New Roman"/>
+                <w:color w:val="000000"/>
+                <w:sz w:val="28"/>
+                <w:szCs w:val="28"/>
+              </w:rPr>
+              <w:t xml:space="preserve">feature/</w:t>
+            </w:r>
+            <w:r>
+              <w:rPr>
+                <w:sz w:val="28"/>
+                <w:szCs w:val="28"/>
+              </w:rPr>
+            </w:r>
+          </w:p>
+        </w:tc>
+        <w:tc>
+          <w:tcPr>
+            <w:tcBorders/>
+            <w:tcW w:w="2500" w:type="dxa"/>
+            <w:vAlign w:val="center"/>
+          </w:tcPr>
+          <w:p>
+            <w:pPr>
+              <w:spacing w:after="0" w:before="0" w:line="240" w:lineRule="auto"/>
+              <w:ind/>
+              <w:jc w:val="center"/>
+              <w:rPr>
+                <w:sz w:val="28"/>
+                <w:szCs w:val="28"/>
+              </w:rPr>
+            </w:pPr>
+            <w:r>
+              <w:rPr>
+                <w:rFonts w:ascii="Times New Roman" w:hAnsi="Times New Roman"/>
+                <w:color w:val="000000"/>
+                <w:sz w:val="28"/>
+                <w:szCs w:val="28"/>
+              </w:rPr>
+              <w:t xml:space="preserve">Новая функция</w:t>
+            </w:r>
+            <w:r>
+              <w:rPr>
+                <w:sz w:val="28"/>
+                <w:szCs w:val="28"/>
+              </w:rPr>
+            </w:r>
+          </w:p>
+        </w:tc>
+        <w:tc>
+          <w:tcPr>
+            <w:tcBorders/>
+            <w:tcW w:w="5405" w:type="dxa"/>
+            <w:vAlign w:val="center"/>
+          </w:tcPr>
+          <w:p>
+            <w:pPr>
+              <w:spacing w:after="0" w:before="0" w:line="240" w:lineRule="auto"/>
+              <w:ind/>
+              <w:jc w:val="left"/>
+              <w:rPr>
+                <w:sz w:val="28"/>
+                <w:szCs w:val="28"/>
+              </w:rPr>
+            </w:pPr>
+            <w:r>
+              <w:rPr>
+                <w:rFonts w:ascii="Times New Roman" w:hAnsi="Times New Roman"/>
+                <w:color w:val="000000"/>
+                <w:sz w:val="28"/>
+                <w:szCs w:val="28"/>
+              </w:rPr>
+              <w:t xml:space="preserve">feature/SGT-15-lab5</w:t>
+            </w:r>
+            <w:r>
+              <w:rPr>
+                <w:sz w:val="28"/>
+                <w:szCs w:val="28"/>
+              </w:rPr>
+            </w:r>
+          </w:p>
+        </w:tc>
+      </w:tr>
+      <w:tr>
+        <w:trPr>
+          <w:cantSplit/>
+        </w:trPr>
+        <w:tc>
+          <w:tcPr>
+            <w:tcBorders/>
+            <w:tcW w:w="1450" w:type="dxa"/>
+            <w:vAlign w:val="center"/>
+          </w:tcPr>
+          <w:p>
+            <w:pPr>
+              <w:spacing w:after="0" w:before="0" w:line="240" w:lineRule="auto"/>
+              <w:ind/>
+              <w:jc w:val="left"/>
+              <w:rPr>
+                <w:sz w:val="28"/>
+                <w:szCs w:val="28"/>
+              </w:rPr>
+            </w:pPr>
+            <w:r>
+              <w:rPr>
+                <w:rFonts w:ascii="Times New Roman" w:hAnsi="Times New Roman"/>
+                <w:color w:val="000000"/>
+                <w:sz w:val="28"/>
+                <w:szCs w:val="28"/>
+              </w:rPr>
+              <w:t xml:space="preserve">bugfix/</w:t>
+            </w:r>
+            <w:r>
+              <w:rPr>
+                <w:sz w:val="28"/>
+                <w:szCs w:val="28"/>
+              </w:rPr>
+            </w:r>
+          </w:p>
+        </w:tc>
+        <w:tc>
+          <w:tcPr>
+            <w:tcBorders/>
+            <w:tcW w:w="2500" w:type="dxa"/>
+            <w:vAlign w:val="center"/>
+          </w:tcPr>
+          <w:p>
+            <w:pPr>
+              <w:spacing w:after="0" w:before="0" w:line="240" w:lineRule="auto"/>
+              <w:ind/>
+              <w:jc w:val="center"/>
+              <w:rPr>
+                <w:sz w:val="28"/>
+                <w:szCs w:val="28"/>
+              </w:rPr>
+            </w:pPr>
+            <w:r>
+              <w:rPr>
+                <w:rFonts w:ascii="Times New Roman" w:hAnsi="Times New Roman"/>
+                <w:color w:val="000000"/>
+                <w:sz w:val="28"/>
+                <w:szCs w:val="28"/>
+              </w:rPr>
+              <w:t xml:space="preserve">Исправление</w:t>
+            </w:r>
+            <w:r>
+              <w:rPr>
+                <w:sz w:val="28"/>
+                <w:szCs w:val="28"/>
+              </w:rPr>
+            </w:r>
+          </w:p>
+        </w:tc>
+        <w:tc>
+          <w:tcPr>
+            <w:tcBorders/>
+            <w:tcW w:w="5405" w:type="dxa"/>
+            <w:vAlign w:val="center"/>
+          </w:tcPr>
+          <w:p>
+            <w:pPr>
+              <w:spacing w:after="0" w:before="0" w:line="240" w:lineRule="auto"/>
+              <w:ind/>
+              <w:jc w:val="left"/>
+              <w:rPr>
+                <w:sz w:val="28"/>
+                <w:szCs w:val="28"/>
+              </w:rPr>
+            </w:pPr>
+            <w:r>
+              <w:rPr>
+                <w:rFonts w:ascii="Times New Roman" w:hAnsi="Times New Roman"/>
+                <w:color w:val="000000"/>
+                <w:sz w:val="28"/>
+                <w:szCs w:val="28"/>
+              </w:rPr>
+              <w:t xml:space="preserve">bugfix/SGT-15-fresh-tests</w:t>
+            </w:r>
+            <w:r>
+              <w:rPr>
+                <w:sz w:val="28"/>
+                <w:szCs w:val="28"/>
+              </w:rPr>
+            </w:r>
+          </w:p>
+        </w:tc>
+      </w:tr>
+      <w:tr>
+        <w:trPr>
+          <w:cantSplit/>
+        </w:trPr>
+        <w:tc>
+          <w:tcPr>
+            <w:tcBorders/>
+            <w:tcW w:w="1450" w:type="dxa"/>
+            <w:vAlign w:val="center"/>
+          </w:tcPr>
+          <w:p>
+            <w:pPr>
+              <w:spacing w:after="0" w:before="0" w:line="240" w:lineRule="auto"/>
+              <w:ind/>
+              <w:jc w:val="left"/>
+              <w:rPr>
+                <w:sz w:val="28"/>
+                <w:szCs w:val="28"/>
+              </w:rPr>
+            </w:pPr>
+            <w:r>
+              <w:rPr>
+                <w:rFonts w:ascii="Times New Roman" w:hAnsi="Times New Roman"/>
+                <w:color w:val="000000"/>
+                <w:sz w:val="28"/>
+                <w:szCs w:val="28"/>
+              </w:rPr>
+              <w:t xml:space="preserve">docs/</w:t>
+            </w:r>
+            <w:r>
+              <w:rPr>
+                <w:sz w:val="28"/>
+                <w:szCs w:val="28"/>
+              </w:rPr>
+            </w:r>
+          </w:p>
+        </w:tc>
+        <w:tc>
+          <w:tcPr>
+            <w:tcBorders/>
+            <w:tcW w:w="2500" w:type="dxa"/>
+            <w:vAlign w:val="center"/>
+          </w:tcPr>
+          <w:p>
+            <w:pPr>
+              <w:spacing w:after="0" w:before="0" w:line="240" w:lineRule="auto"/>
+              <w:ind/>
+              <w:jc w:val="center"/>
+              <w:rPr>
+                <w:sz w:val="28"/>
+                <w:szCs w:val="28"/>
+              </w:rPr>
+            </w:pPr>
+            <w:r>
+              <w:rPr>
+                <w:rFonts w:ascii="Times New Roman" w:hAnsi="Times New Roman"/>
+                <w:color w:val="000000"/>
+                <w:sz w:val="28"/>
+                <w:szCs w:val="28"/>
+              </w:rPr>
+              <w:t xml:space="preserve">Отчёт и документация</w:t>
+            </w:r>
+            <w:r>
+              <w:rPr>
+                <w:sz w:val="28"/>
+                <w:szCs w:val="28"/>
+              </w:rPr>
+            </w:r>
+          </w:p>
+        </w:tc>
+        <w:tc>
+          <w:tcPr>
+            <w:tcBorders/>
+            <w:tcW w:w="5405" w:type="dxa"/>
+            <w:vAlign w:val="center"/>
+          </w:tcPr>
+          <w:p>
+            <w:pPr>
+              <w:spacing w:after="0" w:before="0" w:line="240" w:lineRule="auto"/>
+              <w:ind/>
+              <w:jc w:val="left"/>
+              <w:rPr>
+                <w:sz w:val="28"/>
+                <w:szCs w:val="28"/>
+              </w:rPr>
+            </w:pPr>
+            <w:r>
+              <w:rPr>
+                <w:rFonts w:ascii="Times New Roman" w:hAnsi="Times New Roman"/>
+                <w:color w:val="000000"/>
+                <w:sz w:val="28"/>
+                <w:szCs w:val="28"/>
+              </w:rPr>
+              <w:t xml:space="preserve">docs/SGT-15-report</w:t>
+            </w:r>
+            <w:r>
+              <w:rPr>
+                <w:sz w:val="28"/>
+                <w:szCs w:val="28"/>
+              </w:rPr>
+            </w:r>
+          </w:p>
+        </w:tc>
+      </w:tr>
+      <w:tr>
+        <w:trPr>
+          <w:cantSplit/>
+        </w:trPr>
+        <w:tc>
+          <w:tcPr>
+            <w:tcBorders/>
+            <w:tcW w:w="1450" w:type="dxa"/>
+            <w:vAlign w:val="center"/>
+          </w:tcPr>
+          <w:p>
+            <w:pPr>
+              <w:spacing w:after="0" w:before="0" w:line="240" w:lineRule="auto"/>
+              <w:ind/>
+              <w:jc w:val="left"/>
+              <w:rPr>
+                <w:sz w:val="28"/>
+                <w:szCs w:val="28"/>
+              </w:rPr>
+            </w:pPr>
+            <w:r>
+              <w:rPr>
+                <w:rFonts w:ascii="Times New Roman" w:hAnsi="Times New Roman"/>
+                <w:color w:val="000000"/>
+                <w:sz w:val="28"/>
+                <w:szCs w:val="28"/>
+              </w:rPr>
+              <w:t xml:space="preserve">chore/</w:t>
+            </w:r>
+            <w:r>
+              <w:rPr>
+                <w:sz w:val="28"/>
+                <w:szCs w:val="28"/>
+              </w:rPr>
+            </w:r>
+          </w:p>
+        </w:tc>
+        <w:tc>
+          <w:tcPr>
+            <w:tcBorders/>
+            <w:tcW w:w="2500" w:type="dxa"/>
+            <w:vAlign w:val="center"/>
+          </w:tcPr>
+          <w:p>
+            <w:pPr>
+              <w:spacing w:after="0" w:before="0" w:line="240" w:lineRule="auto"/>
+              <w:ind/>
+              <w:jc w:val="center"/>
+              <w:rPr>
+                <w:sz w:val="28"/>
+                <w:szCs w:val="28"/>
+              </w:rPr>
+            </w:pPr>
+            <w:r>
+              <w:rPr>
+                <w:rFonts w:ascii="Times New Roman" w:hAnsi="Times New Roman"/>
+                <w:color w:val="000000"/>
+                <w:sz w:val="28"/>
+                <w:szCs w:val="28"/>
+              </w:rPr>
+              <w:t xml:space="preserve">Инфраструктура и CI</w:t>
+            </w:r>
+            <w:r>
+              <w:rPr>
+                <w:sz w:val="28"/>
+                <w:szCs w:val="28"/>
+              </w:rPr>
+            </w:r>
+          </w:p>
+        </w:tc>
+        <w:tc>
+          <w:tcPr>
+            <w:tcBorders/>
+            <w:tcW w:w="5405" w:type="dxa"/>
+            <w:vAlign w:val="center"/>
+          </w:tcPr>
+          <w:p>
+            <w:pPr>
+              <w:spacing w:after="0" w:before="0" w:line="240" w:lineRule="auto"/>
+              <w:ind/>
+              <w:jc w:val="left"/>
+              <w:rPr>
+                <w:sz w:val="28"/>
+                <w:szCs w:val="28"/>
+              </w:rPr>
+            </w:pPr>
+            <w:r>
+              <w:rPr>
+                <w:rFonts w:ascii="Times New Roman" w:hAnsi="Times New Roman"/>
+                <w:color w:val="000000"/>
+                <w:sz w:val="28"/>
+                <w:szCs w:val="28"/>
+              </w:rPr>
+              <w:t xml:space="preserve">chore/SGT-15-workflow-standards</w:t>
+            </w:r>
+            <w:r>
+              <w:rPr>
+                <w:sz w:val="28"/>
+                <w:szCs w:val="28"/>
+              </w:rPr>
+            </w:r>
+          </w:p>
+        </w:tc>
+      </w:tr>
+    </w:tbl>
     <w:p>
       <w:pPr>
-        <w:pBdr/>
         <w:spacing w:after="120" w:line="276" w:lineRule="auto"/>
         <w:ind/>
         <w:jc w:val="both"/>
@@ -3195,14 +3817,220 @@
           <w:sz w:val="28"/>
           <w:szCs w:val="28"/>
         </w:rPr>
-        <w:t xml:space="preserve">PR № 1 объединён методом squash после успешного CI. Коммит слияния: 6dc403c242c0. Сообщение squash-коммита соответствует Conventional Commits. Первый служебный коммит создал main в пустом репозитории; все последующие изменения проходят через PR.</w:t>
+      </w:r>
+      <w:r>
+        <w:rPr>
+          <w:sz w:val="28"/>
+          <w:szCs w:val="28"/>
+        </w:rPr>
       </w:r>
     </w:p>
     <w:p>
       <w:pPr>
+        <w:spacing w:after="120" w:line="276" w:lineRule="auto"/>
+        <w:ind/>
+        <w:jc w:val="both"/>
+        <w:rPr>
+          <w:sz w:val="28"/>
+          <w:szCs w:val="28"/>
+        </w:rPr>
+      </w:pPr>
+      <w:r>
+        <w:rPr>
+          <w:rFonts w:ascii="Times New Roman" w:hAnsi="Times New Roman"/>
+          <w:b w:val="0"/>
+          <w:color w:val="000000"/>
+          <w:sz w:val="28"/>
+          <w:szCs w:val="28"/>
+        </w:rPr>
+        <w:t xml:space="preserve">scripts/check-branch.sh разрешает только main и указанные форматы. Hook pre-pus</w:t>
+      </w:r>
+      <w:r>
+        <w:rPr>
+          <w:rFonts w:ascii="Times New Roman" w:hAnsi="Times New Roman"/>
+          <w:b w:val="0"/>
+          <w:color w:val="000000"/>
+          <w:sz w:val="28"/>
+          <w:szCs w:val="28"/>
+        </w:rPr>
+        <w:t xml:space="preserve">h проверяет ветку назначения, поэтому отправка HEAD под неверным именем также отклоняется. Теги и удаление веток не блокируются. В CI шаг Branch naming проверяет исходную ветку PR через github.head_ref, на push — github.ref_name; на тегах шаг пропускается.</w:t>
+      </w:r>
+      <w:r>
+        <w:rPr>
+          <w:sz w:val="28"/>
+          <w:szCs w:val="28"/>
+        </w:rPr>
+      </w:r>
+    </w:p>
+    <w:p>
+      <w:pPr>
+        <w:spacing w:after="120" w:line="276" w:lineRule="auto"/>
+        <w:ind/>
+        <w:jc w:val="both"/>
+        <w:rPr>
+          <w:sz w:val="28"/>
+          <w:szCs w:val="28"/>
+        </w:rPr>
+      </w:pPr>
+      <w:r>
+        <w:rPr>
+          <w:rFonts w:ascii="Times New Roman" w:hAnsi="Times New Roman"/>
+          <w:b w:val="0"/>
+          <w:color w:val="000000"/>
+          <w:sz w:val="28"/>
+          <w:szCs w:val="28"/>
+        </w:rPr>
+        <w:t xml:space="preserve">Приме</w:t>
+      </w:r>
+      <w:r>
+        <w:rPr>
+          <w:rFonts w:ascii="Times New Roman" w:hAnsi="Times New Roman"/>
+          <w:b w:val="0"/>
+          <w:color w:val="000000"/>
+          <w:sz w:val="28"/>
+          <w:szCs w:val="28"/>
+        </w:rPr>
+        <w:t xml:space="preserve">р проверки: feature/SGT-3-route-catalog принято с кодом 0; feature/routes без ID задачи отклонено с кодом 1. git push --dry-run в branch-policy-rejection также отклонён hook. Автотесты проверяют префиксы, ID, описания, несколько ref, теги и удаление веток.</w:t>
+      </w:r>
+      <w:r>
+        <w:rPr>
+          <w:sz w:val="28"/>
+          <w:szCs w:val="28"/>
+        </w:rPr>
+      </w:r>
+    </w:p>
+    <w:p>
+      <w:pPr>
+        <w:spacing w:after="120" w:line="276" w:lineRule="auto"/>
+        <w:ind/>
+        <w:jc w:val="both"/>
+        <w:rPr>
+          <w:sz w:val="28"/>
+          <w:szCs w:val="28"/>
+        </w:rPr>
+      </w:pPr>
+      <w:r>
+        <w:rPr>
+          <w:rFonts w:ascii="Times New Roman" w:hAnsi="Times New Roman"/>
+          <w:b w:val="0"/>
+          <w:color w:val="000000"/>
+          <w:sz w:val="28"/>
+          <w:szCs w:val="28"/>
+        </w:rPr>
+        <w:t xml:space="preserve">На GitHub временная branch-policy-reject</w:t>
+      </w:r>
+      <w:r>
+        <w:rPr>
+          <w:rFonts w:ascii="Times New Roman" w:hAnsi="Times New Roman"/>
+          <w:b w:val="0"/>
+          <w:color w:val="000000"/>
+          <w:sz w:val="28"/>
+          <w:szCs w:val="28"/>
+        </w:rPr>
+        <w:t xml:space="preserve">ion создана в обход локального hook для отрицательной проверки. Branch naming завершился ошибкой; сборка не запускалась. Ветка удалена, результат CI сохранён в branch-policy-ci.json, локальный протокол — в workflow-standards.txt в docs/measurements/SGT-15.</w:t>
+      </w:r>
+      <w:r>
+        <w:rPr>
+          <w:sz w:val="28"/>
+          <w:szCs w:val="28"/>
+        </w:rPr>
+      </w:r>
+    </w:p>
+    <w:p>
+      <w:pPr>
+        <w:spacing w:after="120" w:line="276" w:lineRule="auto"/>
+        <w:ind/>
+        <w:jc w:val="both"/>
+        <w:rPr>
+          <w:rFonts w:ascii="Times New Roman" w:hAnsi="Times New Roman"/>
+          <w:b w:val="0"/>
+          <w:bCs w:val="0"/>
+          <w:color w:val="000000"/>
+          <w:sz w:val="28"/>
+          <w:szCs w:val="28"/>
+          <w:highlight w:val="none"/>
+        </w:rPr>
+      </w:pPr>
+      <w:r>
+        <w:rPr>
+          <w:rFonts w:ascii="Times New Roman" w:hAnsi="Times New Roman"/>
+          <w:b w:val="0"/>
+          <w:color w:val="000000"/>
+          <w:sz w:val="28"/>
+          <w:szCs w:val="28"/>
+        </w:rPr>
+      </w:r>
+      <w:hyperlink r:id="rId9" w:tooltip="https://github.com/vasmaae/software-engineering/actions/runs/39689941691" w:history="1">
+        <w:r>
+          <w:rPr>
+            <w:rStyle w:val="874"/>
+            <w:rFonts w:ascii="Times New Roman" w:hAnsi="Times New Roman"/>
+            <w:b w:val="0"/>
+            <w:sz w:val="28"/>
+            <w:szCs w:val="28"/>
+          </w:rPr>
+          <w:t xml:space="preserve">https://github.com/vasmaae/software-engineering/actions/runs/39689941691</w:t>
+        </w:r>
+        <w:r>
+          <w:rPr>
+            <w:rStyle w:val="874"/>
+            <w:sz w:val="28"/>
+            <w:szCs w:val="28"/>
+          </w:rPr>
+        </w:r>
+      </w:hyperlink>
+      <w:r>
+        <w:rPr>
+          <w:sz w:val="28"/>
+          <w:szCs w:val="28"/>
+        </w:rPr>
+      </w:r>
+      <w:r>
+        <w:rPr>
+          <w:rFonts w:ascii="Times New Roman" w:hAnsi="Times New Roman"/>
+          <w:b w:val="0"/>
+          <w:color w:val="000000"/>
+          <w:sz w:val="28"/>
+          <w:szCs w:val="28"/>
+          <w:highlight w:val="none"/>
+        </w:rPr>
+      </w:r>
+      <w:r>
+        <w:rPr>
+          <w:rFonts w:ascii="Times New Roman" w:hAnsi="Times New Roman"/>
+          <w:b w:val="0"/>
+          <w:color w:val="000000"/>
+          <w:sz w:val="28"/>
+          <w:szCs w:val="28"/>
+          <w:highlight w:val="none"/>
+        </w:rPr>
+      </w:r>
+      <w:r>
+        <w:rPr>
+          <w:rFonts w:ascii="Times New Roman" w:hAnsi="Times New Roman"/>
+          <w:b w:val="0"/>
+          <w:color w:val="000000"/>
+          <w:sz w:val="28"/>
+          <w:szCs w:val="28"/>
+          <w:highlight w:val="none"/>
+        </w:rPr>
+      </w:r>
+      <w:r>
+        <w:rPr>
+          <w:rFonts w:ascii="Times New Roman" w:hAnsi="Times New Roman"/>
+          <w:b w:val="0"/>
+          <w:bCs w:val="0"/>
+          <w:color w:val="000000"/>
+          <w:sz w:val="28"/>
+          <w:szCs w:val="28"/>
+          <w:highlight w:val="none"/>
+        </w:rPr>
+      </w:r>
+    </w:p>
+    <w:p>
+      <w:pPr>
         <w:keepNext w:val="true"/>
-        <w:pageBreakBefore w:val="false"/>
-        <w:pBdr/>
+        <w:pageBreakBefore w:val="true"/>
         <w:spacing w:after="120" w:before="180" w:line="276" w:lineRule="auto"/>
         <w:ind/>
         <w:jc w:val="center"/>
@@ -3219,12 +4047,17 @@
           <w:sz w:val="28"/>
           <w:szCs w:val="28"/>
         </w:rPr>
-        <w:t xml:space="preserve">Релиз приложения</w:t>
+        <w:t xml:space="preserve">Pull request и слияние</w:t>
+      </w:r>
+      <w:r>
+        <w:rPr>
+          <w:sz w:val="28"/>
+          <w:szCs w:val="28"/>
+        </w:rPr>
       </w:r>
     </w:p>
     <w:p>
       <w:pPr>
-        <w:pBdr/>
         <w:spacing w:after="120" w:line="276" w:lineRule="auto"/>
         <w:ind/>
         <w:jc w:val="both"/>
@@ -3241,20 +4074,8 @@
           <w:sz w:val="28"/>
           <w:szCs w:val="28"/>
         </w:rPr>
-        <w:t xml:space="preserve">На проверенную версию main поставлен аннотированный тег v0.1.1. Push тега повторно запустил статический анализ, тесты, сбор метрик и сборку. Только после успешного job quality автоматически создан предварительный GitHub Release с архивом sgt-linux-amd64.tar.gz.</w:t>
+        <w:t xml:space="preserve">Один PR решает одну задачу и направляется в</w:t>
       </w:r>
-    </w:p>
-    <w:p>
-      <w:pPr>
-        <w:pBdr/>
-        <w:spacing w:after="120" w:line="276" w:lineRule="auto"/>
-        <w:ind/>
-        <w:jc w:val="both"/>
-        <w:rPr>
-          <w:sz w:val="28"/>
-          <w:szCs w:val="28"/>
-        </w:rPr>
-      </w:pPr>
       <w:r>
         <w:rPr>
           <w:rFonts w:ascii="Times New Roman" w:hAnsi="Times New Roman"/>
@@ -3263,14 +4084,130 @@
           <w:sz w:val="28"/>
           <w:szCs w:val="28"/>
         </w:rPr>
-        <w:t xml:space="preserve">Архив содержит Linux-бинарник API для amd64, собранную статику React, SQL и документацию. Исходники автоматически доступны в GitHub Release. Версия v0.1.1 демонстрирует инфраструктуру ЛР5 и не означает завершение итогового v1.0, запланированного на 08.12.2026.</w:t>
+        <w:t xml:space="preserve"> main. Заголовок соответствует Conventional Commits и будущему squash-коммиту. Пример: «ci(workflow): enforce branch and PR standards (SGT-15)». CI проверяет его commitlint; событие edited повторно запускает проверку после изменения заголовка или описания.</w:t>
+      </w:r>
+      <w:r>
+        <w:rPr>
+          <w:sz w:val="28"/>
+          <w:szCs w:val="28"/>
+        </w:rPr>
       </w:r>
     </w:p>
     <w:p>
       <w:pPr>
+        <w:spacing w:after="120" w:line="276" w:lineRule="auto"/>
+        <w:ind/>
+        <w:jc w:val="both"/>
+        <w:rPr>
+          <w:sz w:val="28"/>
+          <w:szCs w:val="28"/>
+        </w:rPr>
+      </w:pPr>
+      <w:r>
+        <w:rPr>
+          <w:rFonts w:ascii="Times New Roman" w:hAnsi="Times New Roman"/>
+          <w:b w:val="0"/>
+          <w:color w:val="000000"/>
+          <w:sz w:val="28"/>
+          <w:szCs w:val="28"/>
+        </w:rPr>
+        <w:t xml:space="preserve">Шаблон .github/pull_request_template.md задаёт разделы «Чт</w:t>
+      </w:r>
+      <w:r>
+        <w:rPr>
+          <w:rFonts w:ascii="Times New Roman" w:hAnsi="Times New Roman"/>
+          <w:b w:val="0"/>
+          <w:color w:val="000000"/>
+          <w:sz w:val="28"/>
+          <w:szCs w:val="28"/>
+        </w:rPr>
+        <w:t xml:space="preserve">о изменено», «Проверка», «Связанная задача». Указываются результат, команды и результаты проверок, ссылка на YouTrack; для интерфейса — снимок экрана. Полнота описания проверяется вручную, формат заголовка — автоматически. Пример применения правил: PR № 5.</w:t>
+      </w:r>
+      <w:r>
+        <w:rPr>
+          <w:sz w:val="28"/>
+          <w:szCs w:val="28"/>
+        </w:rPr>
+      </w:r>
+    </w:p>
+    <w:p>
+      <w:pPr>
+        <w:spacing w:after="120" w:line="276" w:lineRule="auto"/>
+        <w:ind/>
+        <w:jc w:val="both"/>
+        <w:rPr>
+          <w:sz w:val="28"/>
+          <w:szCs w:val="28"/>
+        </w:rPr>
+      </w:pPr>
+      <w:r>
+        <w:rPr>
+          <w:rFonts w:ascii="Times New Roman" w:hAnsi="Times New Roman"/>
+          <w:b w:val="0"/>
+          <w:color w:val="000000"/>
+          <w:sz w:val="28"/>
+          <w:szCs w:val="28"/>
+        </w:rPr>
+        <w:t xml:space="preserve">Защита main требует PR и актуальный успешный quality от GitHub Actions. Прави</w:t>
+      </w:r>
+      <w:r>
+        <w:rPr>
+          <w:rFonts w:ascii="Times New Roman" w:hAnsi="Times New Roman"/>
+          <w:b w:val="0"/>
+          <w:color w:val="000000"/>
+          <w:sz w:val="28"/>
+          <w:szCs w:val="28"/>
+        </w:rPr>
+        <w:t xml:space="preserve">ло действует для администратора; прямой push, force push и удаление main запрещены. Обязательны линейная история и завершение обсуждений. Одобрение другого участника не включено: проект выполняет один студент. Самопроверка не выдаётся за независимое ревью.</w:t>
+      </w:r>
+      <w:r>
+        <w:rPr>
+          <w:sz w:val="28"/>
+          <w:szCs w:val="28"/>
+        </w:rPr>
+      </w:r>
+    </w:p>
+    <w:p>
+      <w:pPr>
+        <w:spacing w:after="120" w:line="276" w:lineRule="auto"/>
+        <w:ind/>
+        <w:jc w:val="both"/>
+        <w:rPr>
+          <w:sz w:val="28"/>
+          <w:szCs w:val="28"/>
+        </w:rPr>
+      </w:pPr>
+      <w:r>
+        <w:rPr>
+          <w:rFonts w:ascii="Times New Roman" w:hAnsi="Times New Roman"/>
+          <w:b w:val="0"/>
+          <w:color w:val="000000"/>
+          <w:sz w:val="28"/>
+          <w:szCs w:val="28"/>
+        </w:rPr>
+        <w:t xml:space="preserve">Процесс: ветка от main</w:t>
+      </w:r>
+      <w:r>
+        <w:rPr>
+          <w:rFonts w:ascii="Times New Roman" w:hAnsi="Times New Roman"/>
+          <w:b w:val="0"/>
+          <w:color w:val="000000"/>
+          <w:sz w:val="28"/>
+          <w:szCs w:val="28"/>
+        </w:rPr>
+        <w:t xml:space="preserve">, атомарные коммиты, push, PR, проверка изменений и quality, squash merge. PR № 1 слит после успешного CI; коммит 6dc403c242c0. Разрешён только squash merge. Первый служебный коммит создал main в пустом репозитории; последующие изменения проходят через PR.</w:t>
+      </w:r>
+      <w:r>
+        <w:rPr>
+          <w:sz w:val="28"/>
+          <w:szCs w:val="28"/>
+        </w:rPr>
+      </w:r>
+    </w:p>
+    <w:p>
+      <w:pPr>
         <w:keepNext w:val="true"/>
         <w:pageBreakBefore w:val="false"/>
-        <w:pBdr/>
         <w:spacing w:after="120" w:before="180" w:line="276" w:lineRule="auto"/>
         <w:ind/>
         <w:jc w:val="center"/>
@@ -3287,12 +4224,17 @@
           <w:sz w:val="28"/>
           <w:szCs w:val="28"/>
         </w:rPr>
-        <w:t xml:space="preserve">Доказательства выполнения</w:t>
+        <w:t xml:space="preserve">Релиз</w:t>
+      </w:r>
+      <w:r>
+        <w:rPr>
+          <w:sz w:val="28"/>
+          <w:szCs w:val="28"/>
+        </w:rPr>
       </w:r>
     </w:p>
     <w:p>
       <w:pPr>
-        <w:pBdr/>
         <w:spacing w:after="120" w:line="276" w:lineRule="auto"/>
         <w:ind/>
         <w:jc w:val="both"/>
@@ -3309,20 +4251,8 @@
           <w:sz w:val="28"/>
           <w:szCs w:val="28"/>
         </w:rPr>
-        <w:t xml:space="preserve">Репозиторий: https://github.com/vasmaae/software-engineering</w:t>
+        <w:t xml:space="preserve">Приняты аннотированные теги vMAJOR.MINOR.PATCH по SemVer. PATCH — и</w:t>
       </w:r>
-    </w:p>
-    <w:p>
-      <w:pPr>
-        <w:pBdr/>
-        <w:spacing w:after="120" w:line="276" w:lineRule="auto"/>
-        <w:ind/>
-        <w:jc w:val="both"/>
-        <w:rPr>
-          <w:sz w:val="28"/>
-          <w:szCs w:val="28"/>
-        </w:rPr>
-      </w:pPr>
       <w:r>
         <w:rPr>
           <w:rFonts w:ascii="Times New Roman" w:hAnsi="Times New Roman"/>
@@ -3331,12 +4261,17 @@
           <w:sz w:val="28"/>
           <w:szCs w:val="28"/>
         </w:rPr>
-        <w:t xml:space="preserve">Слияние: https://github.com/vasmaae/software-engineering/pull/1</w:t>
+        <w:t xml:space="preserve">справление, MINOR — совместимая функция, MAJOR — несовместимое изменение API; серия 0.x обозначает начальную разработку. Опубликованные теги не передвигаются. Выполнен выпуск: git tag -a v0.1.1 -m "SGT lab 5 infrastructure preview"; git push origin v0.1.1.</w:t>
+      </w:r>
+      <w:r>
+        <w:rPr>
+          <w:sz w:val="28"/>
+          <w:szCs w:val="28"/>
+        </w:rPr>
       </w:r>
     </w:p>
     <w:p>
       <w:pPr>
-        <w:pBdr/>
         <w:spacing w:after="120" w:line="276" w:lineRule="auto"/>
         <w:ind/>
         <w:jc w:val="both"/>
@@ -3353,20 +4288,8 @@
           <w:sz w:val="28"/>
           <w:szCs w:val="28"/>
         </w:rPr>
-        <w:t xml:space="preserve">Релиз: https://github.com/vasmaae/software-engineering/releases/tag/v0.1.1</w:t>
+        <w:t xml:space="preserve">Push тега v0.1.1 повторил анализ, тесты,</w:t>
       </w:r>
-    </w:p>
-    <w:p>
-      <w:pPr>
-        <w:pBdr/>
-        <w:spacing w:after="120" w:line="276" w:lineRule="auto"/>
-        <w:ind/>
-        <w:jc w:val="both"/>
-        <w:rPr>
-          <w:sz w:val="28"/>
-          <w:szCs w:val="28"/>
-        </w:rPr>
-      </w:pPr>
       <w:r>
         <w:rPr>
           <w:rFonts w:ascii="Times New Roman" w:hAnsi="Times New Roman"/>
@@ -3375,14 +4298,308 @@
           <w:sz w:val="28"/>
           <w:szCs w:val="28"/>
         </w:rPr>
-        <w:t xml:space="preserve">Команды выпуска: git tag -a v0.1.1 -m "SGT lab 5 infrastructure preview"; git push origin v0.1.1. Опубликованные теги не передвигаются; следующая версия получает новый номер.</w:t>
+        <w:t xml:space="preserve"> метрики и сборку. После успешного quality создан предварительный GitHub Release с sgt-linux-amd64.tar.gz: Linux API для amd64, React-статика, SQL и документация. Ручной замер метрик релиз не публикует. Учебный v0.1.1 не означает готовность итогового v1.0.</w:t>
+      </w:r>
+      <w:r>
+        <w:rPr>
+          <w:sz w:val="28"/>
+          <w:szCs w:val="28"/>
+        </w:rPr>
       </w:r>
     </w:p>
     <w:p>
       <w:pPr>
+        <w:spacing w:after="120" w:line="276" w:lineRule="auto"/>
+        <w:ind/>
+        <w:jc w:val="both"/>
+        <w:rPr>
+          <w:rFonts w:ascii="Times New Roman" w:hAnsi="Times New Roman"/>
+          <w:b w:val="0"/>
+          <w:bCs w:val="0"/>
+          <w:color w:val="000000"/>
+          <w:sz w:val="28"/>
+          <w:szCs w:val="28"/>
+          <w:highlight w:val="none"/>
+        </w:rPr>
+      </w:pPr>
+      <w:r>
+        <w:rPr>
+          <w:rFonts w:ascii="Times New Roman" w:hAnsi="Times New Roman"/>
+          <w:b w:val="0"/>
+          <w:color w:val="000000"/>
+          <w:sz w:val="28"/>
+          <w:szCs w:val="28"/>
+        </w:rPr>
+        <w:t xml:space="preserve">Слияние: </w:t>
+      </w:r>
+      <w:hyperlink r:id="rId10" w:tooltip="https://github.com/vasmaae/software-engineering/pull/1" w:history="1">
+        <w:r>
+          <w:rPr>
+            <w:rStyle w:val="874"/>
+            <w:rFonts w:ascii="Times New Roman" w:hAnsi="Times New Roman"/>
+            <w:b w:val="0"/>
+            <w:sz w:val="28"/>
+            <w:szCs w:val="28"/>
+          </w:rPr>
+          <w:t xml:space="preserve">https://github.com/vasmaae/software-engineering/pull/1</w:t>
+        </w:r>
+        <w:r>
+          <w:rPr>
+            <w:rStyle w:val="874"/>
+            <w:sz w:val="28"/>
+            <w:szCs w:val="28"/>
+          </w:rPr>
+        </w:r>
+      </w:hyperlink>
+      <w:r>
+        <w:rPr>
+          <w:sz w:val="28"/>
+          <w:szCs w:val="28"/>
+        </w:rPr>
+      </w:r>
+      <w:r>
+        <w:rPr>
+          <w:rFonts w:ascii="Times New Roman" w:hAnsi="Times New Roman"/>
+          <w:b w:val="0"/>
+          <w:color w:val="000000"/>
+          <w:sz w:val="28"/>
+          <w:szCs w:val="28"/>
+          <w:highlight w:val="none"/>
+        </w:rPr>
+      </w:r>
+      <w:r>
+        <w:rPr>
+          <w:rFonts w:ascii="Times New Roman" w:hAnsi="Times New Roman"/>
+          <w:b w:val="0"/>
+          <w:color w:val="000000"/>
+          <w:sz w:val="28"/>
+          <w:szCs w:val="28"/>
+          <w:highlight w:val="none"/>
+        </w:rPr>
+      </w:r>
+      <w:r>
+        <w:rPr>
+          <w:rFonts w:ascii="Times New Roman" w:hAnsi="Times New Roman"/>
+          <w:b w:val="0"/>
+          <w:color w:val="000000"/>
+          <w:sz w:val="28"/>
+          <w:szCs w:val="28"/>
+          <w:highlight w:val="none"/>
+        </w:rPr>
+      </w:r>
+      <w:r>
+        <w:rPr>
+          <w:rFonts w:ascii="Times New Roman" w:hAnsi="Times New Roman"/>
+          <w:b w:val="0"/>
+          <w:bCs w:val="0"/>
+          <w:color w:val="000000"/>
+          <w:sz w:val="28"/>
+          <w:szCs w:val="28"/>
+          <w:highlight w:val="none"/>
+        </w:rPr>
+      </w:r>
+    </w:p>
+    <w:p>
+      <w:pPr>
+        <w:spacing w:after="120" w:line="276" w:lineRule="auto"/>
+        <w:ind/>
+        <w:jc w:val="both"/>
+        <w:rPr>
+          <w:rFonts w:ascii="Times New Roman" w:hAnsi="Times New Roman"/>
+          <w:b w:val="0"/>
+          <w:bCs w:val="0"/>
+          <w:color w:val="000000"/>
+          <w:sz w:val="28"/>
+          <w:szCs w:val="28"/>
+          <w:highlight w:val="none"/>
+        </w:rPr>
+      </w:pPr>
+      <w:r>
+        <w:rPr>
+          <w:rFonts w:ascii="Times New Roman" w:hAnsi="Times New Roman"/>
+          <w:b w:val="0"/>
+          <w:color w:val="000000"/>
+          <w:sz w:val="28"/>
+          <w:szCs w:val="28"/>
+        </w:rPr>
+        <w:t xml:space="preserve">Стандарты: </w:t>
+      </w:r>
+      <w:hyperlink r:id="rId11" w:tooltip="https://github.com/vasmaae/software-engineering/pull/5" w:history="1">
+        <w:r>
+          <w:rPr>
+            <w:rStyle w:val="874"/>
+            <w:rFonts w:ascii="Times New Roman" w:hAnsi="Times New Roman"/>
+            <w:b w:val="0"/>
+            <w:sz w:val="28"/>
+            <w:szCs w:val="28"/>
+          </w:rPr>
+          <w:t xml:space="preserve">https://github.com/vasmaae/software-engineering/pull/5</w:t>
+        </w:r>
+        <w:r>
+          <w:rPr>
+            <w:rStyle w:val="874"/>
+            <w:rFonts w:ascii="Times New Roman" w:hAnsi="Times New Roman"/>
+            <w:b w:val="0"/>
+            <w:bCs w:val="0"/>
+            <w:sz w:val="28"/>
+            <w:szCs w:val="28"/>
+          </w:rPr>
+        </w:r>
+      </w:hyperlink>
+      <w:r>
+        <w:rPr>
+          <w:rFonts w:ascii="Times New Roman" w:hAnsi="Times New Roman"/>
+          <w:b w:val="0"/>
+          <w:bCs w:val="0"/>
+          <w:color w:val="000000"/>
+          <w:sz w:val="28"/>
+          <w:szCs w:val="28"/>
+        </w:rPr>
+      </w:r>
+      <w:r>
+        <w:rPr>
+          <w:rFonts w:ascii="Times New Roman" w:hAnsi="Times New Roman"/>
+          <w:b w:val="0"/>
+          <w:color w:val="000000"/>
+          <w:sz w:val="28"/>
+          <w:szCs w:val="28"/>
+          <w:highlight w:val="none"/>
+        </w:rPr>
+      </w:r>
+      <w:r>
+        <w:rPr>
+          <w:rFonts w:ascii="Times New Roman" w:hAnsi="Times New Roman"/>
+          <w:b w:val="0"/>
+          <w:color w:val="000000"/>
+          <w:sz w:val="28"/>
+          <w:szCs w:val="28"/>
+          <w:highlight w:val="none"/>
+        </w:rPr>
+      </w:r>
+      <w:r>
+        <w:rPr>
+          <w:rFonts w:ascii="Times New Roman" w:hAnsi="Times New Roman"/>
+          <w:b w:val="0"/>
+          <w:color w:val="000000"/>
+          <w:sz w:val="28"/>
+          <w:szCs w:val="28"/>
+          <w:highlight w:val="none"/>
+        </w:rPr>
+      </w:r>
+      <w:r>
+        <w:rPr>
+          <w:rFonts w:ascii="Times New Roman" w:hAnsi="Times New Roman"/>
+          <w:b w:val="0"/>
+          <w:bCs w:val="0"/>
+          <w:color w:val="000000"/>
+          <w:sz w:val="28"/>
+          <w:szCs w:val="28"/>
+          <w:highlight w:val="none"/>
+        </w:rPr>
+      </w:r>
+    </w:p>
+    <w:p>
+      <w:pPr>
+        <w:spacing w:after="120" w:line="276" w:lineRule="auto"/>
+        <w:ind/>
+        <w:jc w:val="both"/>
+        <w:rPr>
+          <w:sz w:val="28"/>
+          <w:szCs w:val="28"/>
+          <w:highlight w:val="none"/>
+        </w:rPr>
+      </w:pPr>
+      <w:r>
+        <w:rPr>
+          <w:rFonts w:ascii="Times New Roman" w:hAnsi="Times New Roman"/>
+          <w:b w:val="0"/>
+          <w:color w:val="000000"/>
+          <w:sz w:val="28"/>
+          <w:szCs w:val="28"/>
+        </w:rPr>
+      </w:r>
+      <w:r>
+        <w:rPr>
+          <w:rFonts w:ascii="Times New Roman" w:hAnsi="Times New Roman"/>
+          <w:b w:val="0"/>
+          <w:color w:val="000000"/>
+          <w:sz w:val="28"/>
+          <w:szCs w:val="28"/>
+        </w:rPr>
+        <w:t xml:space="preserve">Релиз: </w:t>
+      </w:r>
+      <w:hyperlink r:id="rId12" w:tooltip="https://github.com/vasmaae/software-engineering/releases/tag/v0.1.1" w:history="1">
+        <w:r>
+          <w:rPr>
+            <w:rStyle w:val="874"/>
+            <w:rFonts w:ascii="Times New Roman" w:hAnsi="Times New Roman"/>
+            <w:b w:val="0"/>
+            <w:sz w:val="28"/>
+            <w:szCs w:val="28"/>
+          </w:rPr>
+          <w:t xml:space="preserve">https://github.com/vasmaae/software-engineering/releases/tag/v0.1.1</w:t>
+        </w:r>
+        <w:r>
+          <w:rPr>
+            <w:rStyle w:val="874"/>
+            <w:sz w:val="28"/>
+            <w:szCs w:val="28"/>
+          </w:rPr>
+        </w:r>
+      </w:hyperlink>
+      <w:r>
+        <w:rPr>
+          <w:sz w:val="28"/>
+          <w:szCs w:val="28"/>
+        </w:rPr>
+      </w:r>
+      <w:r/>
+    </w:p>
+    <w:p>
+      <w:pPr>
+        <w:spacing w:after="120" w:line="276" w:lineRule="auto"/>
+        <w:ind/>
+        <w:jc w:val="both"/>
+        <w:rPr>
+          <w:sz w:val="28"/>
+          <w:szCs w:val="28"/>
+        </w:rPr>
+      </w:pPr>
+      <w:r>
+        <w:rPr>
+          <w:rFonts w:ascii="Times New Roman" w:hAnsi="Times New Roman"/>
+          <w:b w:val="0"/>
+          <w:color w:val="000000"/>
+          <w:sz w:val="28"/>
+          <w:szCs w:val="28"/>
+          <w:highlight w:val="none"/>
+        </w:rPr>
+      </w:r>
+      <w:r>
+        <w:rPr>
+          <w:rFonts w:ascii="Times New Roman" w:hAnsi="Times New Roman"/>
+          <w:b w:val="0"/>
+          <w:color w:val="000000"/>
+          <w:sz w:val="28"/>
+          <w:szCs w:val="28"/>
+          <w:highlight w:val="none"/>
+        </w:rPr>
+      </w:r>
+      <w:r>
+        <w:rPr>
+          <w:rFonts w:ascii="Times New Roman" w:hAnsi="Times New Roman"/>
+          <w:b w:val="0"/>
+          <w:color w:val="000000"/>
+          <w:sz w:val="28"/>
+          <w:szCs w:val="28"/>
+          <w:highlight w:val="none"/>
+        </w:rPr>
+      </w:r>
+    </w:p>
+    <w:p>
+      <w:pPr>
         <w:keepNext w:val="true"/>
         <w:pageBreakBefore w:val="true"/>
-        <w:pBdr/>
         <w:spacing w:after="120" w:before="180" w:line="276" w:lineRule="auto"/>
         <w:ind/>
         <w:jc w:val="center"/>
@@ -3399,12 +4616,17 @@
           <w:sz w:val="28"/>
           <w:szCs w:val="28"/>
         </w:rPr>
-        <w:t xml:space="preserve">Пайплайн и результаты проверок</w:t>
+        <w:t xml:space="preserve">Контроль качества и пайплайн</w:t>
+      </w:r>
+      <w:r>
+        <w:rPr>
+          <w:sz w:val="28"/>
+          <w:szCs w:val="28"/>
+        </w:rPr>
       </w:r>
     </w:p>
     <w:p>
       <w:pPr>
-        <w:pBdr/>
         <w:spacing w:after="120" w:line="276" w:lineRule="auto"/>
         <w:ind/>
         <w:jc w:val="both"/>
@@ -3421,20 +4643,8 @@
           <w:sz w:val="28"/>
           <w:szCs w:val="28"/>
         </w:rPr>
-        <w:t xml:space="preserve">Workflow .github/workflows/ci.yml запускается при каждом push и pull request. Он поднимает отдельную PostgreSQL 18, устанавливает Go 1.27 и Node.js 24, проверяет коммиты и применяет начальную SQL-миграцию. Далее выполняются gofmt, go vet, ESLint и Prettier.</w:t>
+        <w:t xml:space="preserve">Для Go применяются gofmt и go vet; для JS и JSX — ESLint с eslint.config.j</w:t>
       </w:r>
-    </w:p>
-    <w:p>
-      <w:pPr>
-        <w:pBdr/>
-        <w:spacing w:after="120" w:line="276" w:lineRule="auto"/>
-        <w:ind/>
-        <w:jc w:val="both"/>
-        <w:rPr>
-          <w:sz w:val="28"/>
-          <w:szCs w:val="28"/>
-        </w:rPr>
-      </w:pPr>
       <w:r>
         <w:rPr>
           <w:rFonts w:ascii="Times New Roman" w:hAnsi="Times New Roman"/>
@@ -3443,12 +4653,17 @@
           <w:sz w:val="28"/>
           <w:szCs w:val="28"/>
         </w:rPr>
-        <w:t xml:space="preserve">Модульные тесты Go проверяют входные параметры и запрещённые HTTP-методы. Интеграционные тесты вызывают HTTP-обработчики с реальной PostgreSQL: каталог, совмещённые фильтры, пустой ответ, литерал %, строка SQL-инъекции, доступность БД и отказ подключения. Тесты React проверяют загрузку, поиск, фильтр, пустые ответы, ошибки и отмену запроса.</w:t>
+        <w:t xml:space="preserve">s и Prettier с настройками по умолчанию. make lint проверяет оформление и статический анализ без автоматического исправления файлов. Ошибки и предупреждения ESLint запрещены. Отдельная проверка текста комментариев не настроена; в задании она необязательна.</w:t>
+      </w:r>
+      <w:r>
+        <w:rPr>
+          <w:sz w:val="28"/>
+          <w:szCs w:val="28"/>
+        </w:rPr>
       </w:r>
     </w:p>
     <w:p>
       <w:pPr>
-        <w:pBdr/>
         <w:spacing w:after="120" w:line="276" w:lineRule="auto"/>
         <w:ind/>
         <w:jc w:val="both"/>
@@ -3465,14 +4680,140 @@
           <w:sz w:val="28"/>
           <w:szCs w:val="28"/>
         </w:rPr>
-        <w:t xml:space="preserve">Go-тесты запускаются с -count=1, race detector и отчётом покрытия. Кеш результатов отключён: состояние внешней PostgreSQL не входит в ключ кеша Go. В CI отсутствие TEST_DATABASE_URL считается ошибкой. Vitest формирует JSON и V8-покрытие; пороги строк и ветвлений React — 80%. После успешных проверок собираются API, React и архив; отчёты сохраняются в Actions на 90 дней.</w:t>
+        <w:t xml:space="preserve">Workflow .github/workflows/ci.yml запускается на push</w:t>
+      </w:r>
+      <w:r>
+        <w:rPr>
+          <w:rFonts w:ascii="Times New Roman" w:hAnsi="Times New Roman"/>
+          <w:b w:val="0"/>
+          <w:color w:val="000000"/>
+          <w:sz w:val="28"/>
+          <w:szCs w:val="28"/>
+        </w:rPr>
+        <w:t xml:space="preserve"> и PR, а также вручную для замера этапа. Он поднимает PostgreSQL 18, проверяет имя ветки, устанавливает Go 1.27 и Node.js 24, выполняет npm ci, проверяет коммиты и заголовок PR, применяет SQL-миграцию и запускает make lint. Далее — тесты, метрики и сборка.</w:t>
+      </w:r>
+      <w:r>
+        <w:rPr>
+          <w:sz w:val="28"/>
+          <w:szCs w:val="28"/>
+        </w:rPr>
       </w:r>
     </w:p>
     <w:p>
       <w:pPr>
+        <w:spacing w:after="120" w:line="276" w:lineRule="auto"/>
+        <w:ind/>
+        <w:jc w:val="both"/>
+        <w:rPr>
+          <w:sz w:val="28"/>
+          <w:szCs w:val="28"/>
+        </w:rPr>
+      </w:pPr>
+      <w:r>
+        <w:rPr>
+          <w:rFonts w:ascii="Times New Roman" w:hAnsi="Times New Roman"/>
+          <w:b w:val="0"/>
+          <w:color w:val="000000"/>
+          <w:sz w:val="28"/>
+          <w:szCs w:val="28"/>
+        </w:rPr>
+        <w:t xml:space="preserve">Модульные тесты Go проверяют параметры и HTTP-мето</w:t>
+      </w:r>
+      <w:r>
+        <w:rPr>
+          <w:rFonts w:ascii="Times New Roman" w:hAnsi="Times New Roman"/>
+          <w:b w:val="0"/>
+          <w:color w:val="000000"/>
+          <w:sz w:val="28"/>
+          <w:szCs w:val="28"/>
+        </w:rPr>
+        <w:t xml:space="preserve">ды. Интеграционные тесты используют настоящую PostgreSQL: каталог, совмещённые фильтры, пустой ответ, литерал %, попытка SQL-инъекции, доступность БД и отказ подключения. React-тесты проверяют загрузку, поиск, фильтр, пустой ответ, ошибку и отмену запроса.</w:t>
+      </w:r>
+      <w:r>
+        <w:rPr>
+          <w:sz w:val="28"/>
+          <w:szCs w:val="28"/>
+        </w:rPr>
+      </w:r>
+    </w:p>
+    <w:p>
+      <w:pPr>
+        <w:spacing w:after="120" w:line="276" w:lineRule="auto"/>
+        <w:ind/>
+        <w:jc w:val="both"/>
+        <w:rPr>
+          <w:sz w:val="28"/>
+          <w:szCs w:val="28"/>
+        </w:rPr>
+      </w:pPr>
+      <w:r>
+        <w:rPr>
+          <w:rFonts w:ascii="Times New Roman" w:hAnsi="Times New Roman"/>
+          <w:b w:val="0"/>
+          <w:color w:val="000000"/>
+          <w:sz w:val="28"/>
+          <w:szCs w:val="28"/>
+        </w:rPr>
+        <w:t xml:space="preserve">Go запускается с -count=1, race detector </w:t>
+      </w:r>
+      <w:r>
+        <w:rPr>
+          <w:rFonts w:ascii="Times New Roman" w:hAnsi="Times New Roman"/>
+          <w:b w:val="0"/>
+          <w:color w:val="000000"/>
+          <w:sz w:val="28"/>
+          <w:szCs w:val="28"/>
+        </w:rPr>
+        <w:t xml:space="preserve">и отчётом покрытия. В CI отсутствие TEST_DATABASE_URL считается ошибкой. Vitest формирует JSON и V8-покрытие; минимальный порог React — 80% строк и ветвлений. Отдельно проходят пять тестов скриптов: три проверки правил веток и две проверки сборщика метрик.</w:t>
+      </w:r>
+      <w:r>
+        <w:rPr>
+          <w:sz w:val="28"/>
+          <w:szCs w:val="28"/>
+        </w:rPr>
+      </w:r>
+    </w:p>
+    <w:p>
+      <w:pPr>
+        <w:spacing w:after="120" w:line="276" w:lineRule="auto"/>
+        <w:ind/>
+        <w:jc w:val="both"/>
+        <w:rPr>
+          <w:sz w:val="28"/>
+          <w:szCs w:val="28"/>
+        </w:rPr>
+      </w:pPr>
+      <w:r>
+        <w:rPr>
+          <w:rFonts w:ascii="Times New Roman" w:hAnsi="Times New Roman"/>
+          <w:b w:val="0"/>
+          <w:color w:val="000000"/>
+          <w:sz w:val="28"/>
+          <w:szCs w:val="28"/>
+        </w:rPr>
+        <w:t xml:space="preserve">При успешных проверках ma</w:t>
+      </w:r>
+      <w:r>
+        <w:rPr>
+          <w:rFonts w:ascii="Times New Roman" w:hAnsi="Times New Roman"/>
+          <w:b w:val="0"/>
+          <w:color w:val="000000"/>
+          <w:sz w:val="28"/>
+          <w:szCs w:val="28"/>
+        </w:rPr>
+        <w:t xml:space="preserve">ke build собирает Go API и React; tar формирует sgt-linux-amd64.tar.gz. В Actions загружаются сборка и исходные отчёты; отчёты и сборка хранятся один день. Неуспешный обязательный шаг блокирует сборку и слияние. Выпуск по тегу разрешён только после успешного quality.</w:t>
+      </w:r>
+      <w:r>
+        <w:rPr>
+          <w:sz w:val="28"/>
+          <w:szCs w:val="28"/>
+        </w:rPr>
+      </w:r>
+    </w:p>
+    <w:p>
+      <w:pPr>
         <w:keepNext w:val="true"/>
         <w:pageBreakBefore w:val="false"/>
-        <w:pBdr/>
         <w:spacing w:after="120" w:before="180" w:line="276" w:lineRule="auto"/>
         <w:ind/>
         <w:jc w:val="center"/>
@@ -3489,12 +4830,17 @@
           <w:sz w:val="28"/>
           <w:szCs w:val="28"/>
         </w:rPr>
-        <w:t xml:space="preserve">Проверка запуска и результат</w:t>
+        <w:t xml:space="preserve">Тестовая среда и результат</w:t>
+      </w:r>
+      <w:r>
+        <w:rPr>
+          <w:sz w:val="28"/>
+          <w:szCs w:val="28"/>
+        </w:rPr>
       </w:r>
     </w:p>
     <w:p>
       <w:pPr>
-        <w:pBdr/>
         <w:spacing w:after="120" w:line="276" w:lineRule="auto"/>
         <w:ind/>
         <w:jc w:val="both"/>
@@ -3511,20 +4857,8 @@
           <w:sz w:val="28"/>
           <w:szCs w:val="28"/>
         </w:rPr>
-        <w:t xml:space="preserve">Локально успешно выполнены линтеры, тесты, сборки Go и React и docker compose up --build -d. Через http://localhost:8080 доступны интерфейс и /api; health возвращает 204, каталог — три маршрута. Проверены совместный поиск и фильтр, а также отсутствие горизонтального переполнения при ширине 360 px. PostgreSQL не публикуется за пределы сети Compose; данные хранятся в томе.</w:t>
+        <w:t xml:space="preserve">Docker Compose запускает db, api и web. Через http://localhost:8080 доступны интерфейс и /api: health возвращает 204, каталог</w:t>
       </w:r>
-    </w:p>
-    <w:p>
-      <w:pPr>
-        <w:pBdr/>
-        <w:spacing w:after="120" w:line="276" w:lineRule="auto"/>
-        <w:ind/>
-        <w:jc w:val="both"/>
-        <w:rPr>
-          <w:sz w:val="28"/>
-          <w:szCs w:val="28"/>
-        </w:rPr>
-      </w:pPr>
       <w:r>
         <w:rPr>
           <w:rFonts w:ascii="Times New Roman" w:hAnsi="Times New Roman"/>
@@ -3533,14 +4867,46 @@
           <w:sz w:val="28"/>
           <w:szCs w:val="28"/>
         </w:rPr>
-        <w:t xml:space="preserve">Для повторного запуска требуется создать локальный .env из .env.example и задать пароль. Начальная транзакционная SQL-миграция автоматически применяется к новому тому; для существующей БД она запускается явно. Автоматический внешний деплой, являющийся опциональным пунктом задания, не включён.</w:t>
+        <w:t xml:space="preserve"> — три маршрута. Проверены совместный поиск и фильтр и ширина 360 px без горизонтального переполнения. База не публикуется наружу, данные — в томе, пароль — в локальном .env. Начальная транзакционная миграция автоматически применяется только к новому тому.</w:t>
+      </w:r>
+      <w:r>
+        <w:rPr>
+          <w:sz w:val="28"/>
+          <w:szCs w:val="28"/>
+        </w:rPr>
       </w:r>
     </w:p>
     <w:p>
       <w:pPr>
+        <w:spacing w:after="120" w:line="276" w:lineRule="auto"/>
+        <w:ind/>
+        <w:jc w:val="both"/>
+        <w:rPr>
+          <w:sz w:val="28"/>
+          <w:szCs w:val="28"/>
+        </w:rPr>
+      </w:pPr>
+      <w:r>
+        <w:rPr>
+          <w:rFonts w:ascii="Times New Roman" w:hAnsi="Times New Roman"/>
+          <w:b w:val="0"/>
+          <w:color w:val="000000"/>
+          <w:sz w:val="28"/>
+          <w:szCs w:val="28"/>
+        </w:rPr>
+        <w:t xml:space="preserve">Локально проверены также Docker-сборки. CI проверяет и собирает Go и React. Опциональный автоматический деплой при слиянии в main не настроен; Compose запускается вручную.</w:t>
+      </w:r>
+      <w:r>
+        <w:rPr>
+          <w:sz w:val="28"/>
+          <w:szCs w:val="28"/>
+        </w:rPr>
+      </w:r>
+    </w:p>
+    <w:p>
+      <w:pPr>
         <w:keepNext w:val="true"/>
         <w:pageBreakBefore w:val="true"/>
-        <w:pBdr/>
         <w:spacing w:after="120" w:before="180" w:line="276" w:lineRule="auto"/>
         <w:ind/>
         <w:jc w:val="center"/>
@@ -3559,25 +4925,32 @@
         </w:rPr>
         <w:t xml:space="preserve">Фактические метрики этапа SGT-15</w:t>
       </w:r>
+      <w:r>
+        <w:rPr>
+          <w:sz w:val="28"/>
+          <w:szCs w:val="28"/>
+        </w:rPr>
+      </w:r>
     </w:p>
     <w:tbl>
       <w:tblPr>
         <w:tblW w:w="9355" w:type="dxa"/>
+        <w:tblCellMar>
+          <w:left w:w="80" w:type="dxa"/>
+          <w:top w:w="80" w:type="dxa"/>
+          <w:right w:w="80" w:type="dxa"/>
+          <w:bottom w:w="80" w:type="dxa"/>
+        </w:tblCellMar>
+        <w:tblBorders>
+          <w:top w:val="single" w:color="d9d9d9" w:sz="4" w:space="0"/>
+          <w:left w:val="single" w:color="d9d9d9" w:sz="4" w:space="0"/>
+          <w:bottom w:val="single" w:color="d9d9d9" w:sz="4" w:space="0"/>
+          <w:right w:val="single" w:color="d9d9d9" w:sz="4" w:space="0"/>
+          <w:insideH w:val="single" w:color="d9d9d9" w:sz="4" w:space="0"/>
+          <w:insideV w:val="single" w:color="d9d9d9" w:sz="4" w:space="0"/>
+        </w:tblBorders>
         <w:tblLayout w:type="fixed"/>
-        <w:tblBorders>
-          <w:top w:val="single" w:sz="4" w:color="D9D9D9"/>
-          <w:left w:val="single" w:sz="4" w:color="D9D9D9"/>
-          <w:bottom w:val="single" w:sz="4" w:color="D9D9D9"/>
-          <w:right w:val="single" w:sz="4" w:color="D9D9D9"/>
-          <w:insideH w:val="single" w:sz="4" w:color="D9D9D9"/>
-          <w:insideV w:val="single" w:sz="4" w:color="D9D9D9"/>
-        </w:tblBorders>
-        <w:tblCellMar>
-          <w:top w:w="80" w:type="dxa"/>
-          <w:bottom w:w="80" w:type="dxa"/>
-          <w:left w:w="80" w:type="dxa"/>
-          <w:right w:w="80" w:type="dxa"/>
-        </w:tblCellMar>
+        <w:tblLook w:val="04A0" w:firstRow="1" w:lastRow="0" w:firstColumn="1" w:lastColumn="0" w:noHBand="0" w:noVBand="1"/>
       </w:tblPr>
       <w:tblGrid>
         <w:gridCol w:w="7300"/>
@@ -3590,45 +4963,71 @@
         </w:trPr>
         <w:tc>
           <w:tcPr>
+            <w:shd w:val="clear" w:color="auto" w:fill="ededed"/>
+            <w:tcBorders/>
             <w:tcW w:w="7300" w:type="dxa"/>
             <w:vAlign w:val="center"/>
-            <w:shd w:fill="EDEDED"/>
           </w:tcPr>
           <w:p>
             <w:pPr>
-              <w:spacing w:before="0" w:after="0" w:line="240" w:lineRule="auto"/>
+              <w:spacing w:after="0" w:before="0" w:line="240" w:lineRule="auto"/>
+              <w:ind/>
               <w:jc w:val="left"/>
+              <w:rPr>
+                <w:sz w:val="28"/>
+                <w:szCs w:val="28"/>
+              </w:rPr>
             </w:pPr>
             <w:r>
               <w:rPr>
                 <w:rFonts w:ascii="Times New Roman" w:hAnsi="Times New Roman"/>
-                <w:sz w:val="24"/>
+                <w:b/>
                 <w:color w:val="000000"/>
-                <w:b/>
+                <w:sz w:val="28"/>
+                <w:szCs w:val="28"/>
               </w:rPr>
-              <w:t>Показатель</w:t>
+              <w:t xml:space="preserve">Показатель</w:t>
+            </w:r>
+            <w:r>
+              <w:rPr>
+                <w:sz w:val="28"/>
+                <w:szCs w:val="28"/>
+              </w:rPr>
             </w:r>
           </w:p>
         </w:tc>
         <w:tc>
           <w:tcPr>
+            <w:shd w:val="clear" w:color="auto" w:fill="ededed"/>
+            <w:tcBorders/>
             <w:tcW w:w="2055" w:type="dxa"/>
             <w:vAlign w:val="center"/>
-            <w:shd w:fill="EDEDED"/>
           </w:tcPr>
           <w:p>
             <w:pPr>
-              <w:spacing w:before="0" w:after="0" w:line="240" w:lineRule="auto"/>
+              <w:spacing w:after="0" w:before="0" w:line="240" w:lineRule="auto"/>
+              <w:ind/>
               <w:jc w:val="center"/>
+              <w:rPr>
+                <w:sz w:val="28"/>
+                <w:szCs w:val="28"/>
+              </w:rPr>
             </w:pPr>
             <w:r>
               <w:rPr>
                 <w:rFonts w:ascii="Times New Roman" w:hAnsi="Times New Roman"/>
-                <w:sz w:val="24"/>
+                <w:b/>
                 <w:color w:val="000000"/>
-                <w:b/>
+                <w:sz w:val="28"/>
+                <w:szCs w:val="28"/>
               </w:rPr>
-              <w:t>Значение</w:t>
+              <w:t xml:space="preserve">Значение</w:t>
+            </w:r>
+            <w:r>
+              <w:rPr>
+                <w:sz w:val="28"/>
+                <w:szCs w:val="28"/>
+              </w:rPr>
             </w:r>
           </w:p>
         </w:tc>
@@ -3639,41 +5038,67 @@
         </w:trPr>
         <w:tc>
           <w:tcPr>
+            <w:tcBorders/>
             <w:tcW w:w="7300" w:type="dxa"/>
             <w:vAlign w:val="center"/>
           </w:tcPr>
           <w:p>
             <w:pPr>
-              <w:spacing w:before="0" w:after="0" w:line="240" w:lineRule="auto"/>
+              <w:spacing w:after="0" w:before="0" w:line="240" w:lineRule="auto"/>
+              <w:ind/>
               <w:jc w:val="left"/>
+              <w:rPr>
+                <w:sz w:val="28"/>
+                <w:szCs w:val="28"/>
+              </w:rPr>
             </w:pPr>
             <w:r>
               <w:rPr>
                 <w:rFonts w:ascii="Times New Roman" w:hAnsi="Times New Roman"/>
-                <w:sz w:val="24"/>
                 <w:color w:val="000000"/>
+                <w:sz w:val="28"/>
+                <w:szCs w:val="28"/>
               </w:rPr>
-              <w:t>Ошибки ESLint</w:t>
+              <w:t xml:space="preserve">Ошибки ESLint</w:t>
+            </w:r>
+            <w:r>
+              <w:rPr>
+                <w:sz w:val="28"/>
+                <w:szCs w:val="28"/>
+              </w:rPr>
             </w:r>
           </w:p>
         </w:tc>
         <w:tc>
           <w:tcPr>
+            <w:tcBorders/>
             <w:tcW w:w="2055" w:type="dxa"/>
             <w:vAlign w:val="center"/>
           </w:tcPr>
           <w:p>
             <w:pPr>
-              <w:spacing w:before="0" w:after="0" w:line="240" w:lineRule="auto"/>
+              <w:spacing w:after="0" w:before="0" w:line="240" w:lineRule="auto"/>
+              <w:ind/>
               <w:jc w:val="center"/>
+              <w:rPr>
+                <w:sz w:val="28"/>
+                <w:szCs w:val="28"/>
+              </w:rPr>
             </w:pPr>
             <w:r>
               <w:rPr>
                 <w:rFonts w:ascii="Times New Roman" w:hAnsi="Times New Roman"/>
-                <w:sz w:val="24"/>
                 <w:color w:val="000000"/>
+                <w:sz w:val="28"/>
+                <w:szCs w:val="28"/>
               </w:rPr>
-              <w:t>0</w:t>
+              <w:t xml:space="preserve">0</w:t>
+            </w:r>
+            <w:r>
+              <w:rPr>
+                <w:sz w:val="28"/>
+                <w:szCs w:val="28"/>
+              </w:rPr>
             </w:r>
           </w:p>
         </w:tc>
@@ -3684,41 +5109,67 @@
         </w:trPr>
         <w:tc>
           <w:tcPr>
+            <w:tcBorders/>
             <w:tcW w:w="7300" w:type="dxa"/>
             <w:vAlign w:val="center"/>
           </w:tcPr>
           <w:p>
             <w:pPr>
-              <w:spacing w:before="0" w:after="0" w:line="240" w:lineRule="auto"/>
+              <w:spacing w:after="0" w:before="0" w:line="240" w:lineRule="auto"/>
+              <w:ind/>
               <w:jc w:val="left"/>
+              <w:rPr>
+                <w:sz w:val="28"/>
+                <w:szCs w:val="28"/>
+              </w:rPr>
             </w:pPr>
             <w:r>
               <w:rPr>
                 <w:rFonts w:ascii="Times New Roman" w:hAnsi="Times New Roman"/>
-                <w:sz w:val="24"/>
                 <w:color w:val="000000"/>
+                <w:sz w:val="28"/>
+                <w:szCs w:val="28"/>
               </w:rPr>
-              <w:t>Предупреждения ESLint</w:t>
+              <w:t xml:space="preserve">Предупреждения ESLint</w:t>
+            </w:r>
+            <w:r>
+              <w:rPr>
+                <w:sz w:val="28"/>
+                <w:szCs w:val="28"/>
+              </w:rPr>
             </w:r>
           </w:p>
         </w:tc>
         <w:tc>
           <w:tcPr>
+            <w:tcBorders/>
             <w:tcW w:w="2055" w:type="dxa"/>
             <w:vAlign w:val="center"/>
           </w:tcPr>
           <w:p>
             <w:pPr>
-              <w:spacing w:before="0" w:after="0" w:line="240" w:lineRule="auto"/>
+              <w:spacing w:after="0" w:before="0" w:line="240" w:lineRule="auto"/>
+              <w:ind/>
               <w:jc w:val="center"/>
+              <w:rPr>
+                <w:sz w:val="28"/>
+                <w:szCs w:val="28"/>
+              </w:rPr>
             </w:pPr>
             <w:r>
               <w:rPr>
                 <w:rFonts w:ascii="Times New Roman" w:hAnsi="Times New Roman"/>
-                <w:sz w:val="24"/>
                 <w:color w:val="000000"/>
+                <w:sz w:val="28"/>
+                <w:szCs w:val="28"/>
               </w:rPr>
-              <w:t>0</w:t>
+              <w:t xml:space="preserve">0</w:t>
+            </w:r>
+            <w:r>
+              <w:rPr>
+                <w:sz w:val="28"/>
+                <w:szCs w:val="28"/>
+              </w:rPr>
             </w:r>
           </w:p>
         </w:tc>
@@ -3729,41 +5180,67 @@
         </w:trPr>
         <w:tc>
           <w:tcPr>
+            <w:tcBorders/>
             <w:tcW w:w="7300" w:type="dxa"/>
             <w:vAlign w:val="center"/>
           </w:tcPr>
           <w:p>
             <w:pPr>
-              <w:spacing w:before="0" w:after="0" w:line="240" w:lineRule="auto"/>
+              <w:spacing w:after="0" w:before="0" w:line="240" w:lineRule="auto"/>
+              <w:ind/>
               <w:jc w:val="left"/>
+              <w:rPr>
+                <w:sz w:val="28"/>
+                <w:szCs w:val="28"/>
+              </w:rPr>
             </w:pPr>
             <w:r>
               <w:rPr>
                 <w:rFonts w:ascii="Times New Roman" w:hAnsi="Times New Roman"/>
-                <w:sz w:val="24"/>
                 <w:color w:val="000000"/>
+                <w:sz w:val="28"/>
+                <w:szCs w:val="28"/>
               </w:rPr>
-              <w:t>Покрытие операторов Go</w:t>
+              <w:t xml:space="preserve">Покрытие операторов Go</w:t>
+            </w:r>
+            <w:r>
+              <w:rPr>
+                <w:sz w:val="28"/>
+                <w:szCs w:val="28"/>
+              </w:rPr>
             </w:r>
           </w:p>
         </w:tc>
         <w:tc>
           <w:tcPr>
+            <w:tcBorders/>
             <w:tcW w:w="2055" w:type="dxa"/>
             <w:vAlign w:val="center"/>
           </w:tcPr>
           <w:p>
             <w:pPr>
-              <w:spacing w:before="0" w:after="0" w:line="240" w:lineRule="auto"/>
+              <w:spacing w:after="0" w:before="0" w:line="240" w:lineRule="auto"/>
+              <w:ind/>
               <w:jc w:val="center"/>
+              <w:rPr>
+                <w:sz w:val="28"/>
+                <w:szCs w:val="28"/>
+              </w:rPr>
             </w:pPr>
             <w:r>
               <w:rPr>
                 <w:rFonts w:ascii="Times New Roman" w:hAnsi="Times New Roman"/>
-                <w:sz w:val="24"/>
                 <w:color w:val="000000"/>
+                <w:sz w:val="28"/>
+                <w:szCs w:val="28"/>
               </w:rPr>
-              <w:t>85.7 %</w:t>
+              <w:t xml:space="preserve">85.7 %</w:t>
+            </w:r>
+            <w:r>
+              <w:rPr>
+                <w:sz w:val="28"/>
+                <w:szCs w:val="28"/>
+              </w:rPr>
             </w:r>
           </w:p>
         </w:tc>
@@ -3774,41 +5251,67 @@
         </w:trPr>
         <w:tc>
           <w:tcPr>
+            <w:tcBorders/>
             <w:tcW w:w="7300" w:type="dxa"/>
             <w:vAlign w:val="center"/>
           </w:tcPr>
           <w:p>
             <w:pPr>
-              <w:spacing w:before="0" w:after="0" w:line="240" w:lineRule="auto"/>
+              <w:spacing w:after="0" w:before="0" w:line="240" w:lineRule="auto"/>
+              <w:ind/>
               <w:jc w:val="left"/>
+              <w:rPr>
+                <w:sz w:val="28"/>
+                <w:szCs w:val="28"/>
+              </w:rPr>
             </w:pPr>
             <w:r>
               <w:rPr>
                 <w:rFonts w:ascii="Times New Roman" w:hAnsi="Times New Roman"/>
-                <w:sz w:val="24"/>
                 <w:color w:val="000000"/>
+                <w:sz w:val="28"/>
+                <w:szCs w:val="28"/>
               </w:rPr>
-              <w:t>Покрытие строк React</w:t>
+              <w:t xml:space="preserve">Покрытие строк React</w:t>
+            </w:r>
+            <w:r>
+              <w:rPr>
+                <w:sz w:val="28"/>
+                <w:szCs w:val="28"/>
+              </w:rPr>
             </w:r>
           </w:p>
         </w:tc>
         <w:tc>
           <w:tcPr>
+            <w:tcBorders/>
             <w:tcW w:w="2055" w:type="dxa"/>
             <w:vAlign w:val="center"/>
           </w:tcPr>
           <w:p>
             <w:pPr>
-              <w:spacing w:before="0" w:after="0" w:line="240" w:lineRule="auto"/>
+              <w:spacing w:after="0" w:before="0" w:line="240" w:lineRule="auto"/>
+              <w:ind/>
               <w:jc w:val="center"/>
+              <w:rPr>
+                <w:sz w:val="28"/>
+                <w:szCs w:val="28"/>
+              </w:rPr>
             </w:pPr>
             <w:r>
               <w:rPr>
                 <w:rFonts w:ascii="Times New Roman" w:hAnsi="Times New Roman"/>
-                <w:sz w:val="24"/>
                 <w:color w:val="000000"/>
+                <w:sz w:val="28"/>
+                <w:szCs w:val="28"/>
               </w:rPr>
-              <w:t>100 %</w:t>
+              <w:t xml:space="preserve">100 %</w:t>
+            </w:r>
+            <w:r>
+              <w:rPr>
+                <w:sz w:val="28"/>
+                <w:szCs w:val="28"/>
+              </w:rPr>
             </w:r>
           </w:p>
         </w:tc>
@@ -3819,41 +5322,67 @@
         </w:trPr>
         <w:tc>
           <w:tcPr>
+            <w:tcBorders/>
             <w:tcW w:w="7300" w:type="dxa"/>
             <w:vAlign w:val="center"/>
           </w:tcPr>
           <w:p>
             <w:pPr>
-              <w:spacing w:before="0" w:after="0" w:line="240" w:lineRule="auto"/>
+              <w:spacing w:after="0" w:before="0" w:line="240" w:lineRule="auto"/>
+              <w:ind/>
               <w:jc w:val="left"/>
+              <w:rPr>
+                <w:sz w:val="28"/>
+                <w:szCs w:val="28"/>
+              </w:rPr>
             </w:pPr>
             <w:r>
               <w:rPr>
                 <w:rFonts w:ascii="Times New Roman" w:hAnsi="Times New Roman"/>
-                <w:sz w:val="24"/>
                 <w:color w:val="000000"/>
+                <w:sz w:val="28"/>
+                <w:szCs w:val="28"/>
               </w:rPr>
-              <w:t>Покрытие ветвлений React</w:t>
+              <w:t xml:space="preserve">Покрытие ветвлений React</w:t>
+            </w:r>
+            <w:r>
+              <w:rPr>
+                <w:sz w:val="28"/>
+                <w:szCs w:val="28"/>
+              </w:rPr>
             </w:r>
           </w:p>
         </w:tc>
         <w:tc>
           <w:tcPr>
+            <w:tcBorders/>
             <w:tcW w:w="2055" w:type="dxa"/>
             <w:vAlign w:val="center"/>
           </w:tcPr>
           <w:p>
             <w:pPr>
-              <w:spacing w:before="0" w:after="0" w:line="240" w:lineRule="auto"/>
+              <w:spacing w:after="0" w:before="0" w:line="240" w:lineRule="auto"/>
+              <w:ind/>
               <w:jc w:val="center"/>
+              <w:rPr>
+                <w:sz w:val="28"/>
+                <w:szCs w:val="28"/>
+              </w:rPr>
             </w:pPr>
             <w:r>
               <w:rPr>
                 <w:rFonts w:ascii="Times New Roman" w:hAnsi="Times New Roman"/>
-                <w:sz w:val="24"/>
                 <w:color w:val="000000"/>
+                <w:sz w:val="28"/>
+                <w:szCs w:val="28"/>
               </w:rPr>
-              <w:t>100 %</w:t>
+              <w:t xml:space="preserve">100 %</w:t>
+            </w:r>
+            <w:r>
+              <w:rPr>
+                <w:sz w:val="28"/>
+                <w:szCs w:val="28"/>
+              </w:rPr>
             </w:r>
           </w:p>
         </w:tc>
@@ -3864,41 +5393,67 @@
         </w:trPr>
         <w:tc>
           <w:tcPr>
+            <w:tcBorders/>
             <w:tcW w:w="7300" w:type="dxa"/>
             <w:vAlign w:val="center"/>
           </w:tcPr>
           <w:p>
             <w:pPr>
-              <w:spacing w:before="0" w:after="0" w:line="240" w:lineRule="auto"/>
+              <w:spacing w:after="0" w:before="0" w:line="240" w:lineRule="auto"/>
+              <w:ind/>
               <w:jc w:val="left"/>
+              <w:rPr>
+                <w:sz w:val="28"/>
+                <w:szCs w:val="28"/>
+              </w:rPr>
             </w:pPr>
             <w:r>
               <w:rPr>
                 <w:rFonts w:ascii="Times New Roman" w:hAnsi="Times New Roman"/>
-                <w:sz w:val="24"/>
                 <w:color w:val="000000"/>
+                <w:sz w:val="28"/>
+                <w:szCs w:val="28"/>
               </w:rPr>
-              <w:t>Успешные тесты приложения</w:t>
+              <w:t xml:space="preserve">Успешные тесты приложения</w:t>
+            </w:r>
+            <w:r>
+              <w:rPr>
+                <w:sz w:val="28"/>
+                <w:szCs w:val="28"/>
+              </w:rPr>
             </w:r>
           </w:p>
         </w:tc>
         <w:tc>
           <w:tcPr>
+            <w:tcBorders/>
             <w:tcW w:w="2055" w:type="dxa"/>
             <w:vAlign w:val="center"/>
           </w:tcPr>
           <w:p>
             <w:pPr>
-              <w:spacing w:before="0" w:after="0" w:line="240" w:lineRule="auto"/>
+              <w:spacing w:after="0" w:before="0" w:line="240" w:lineRule="auto"/>
+              <w:ind/>
               <w:jc w:val="center"/>
+              <w:rPr>
+                <w:sz w:val="28"/>
+                <w:szCs w:val="28"/>
+              </w:rPr>
             </w:pPr>
             <w:r>
               <w:rPr>
                 <w:rFonts w:ascii="Times New Roman" w:hAnsi="Times New Roman"/>
-                <w:sz w:val="24"/>
                 <w:color w:val="000000"/>
+                <w:sz w:val="28"/>
+                <w:szCs w:val="28"/>
               </w:rPr>
-              <w:t>17</w:t>
+              <w:t xml:space="preserve">17</w:t>
+            </w:r>
+            <w:r>
+              <w:rPr>
+                <w:sz w:val="28"/>
+                <w:szCs w:val="28"/>
+              </w:rPr>
             </w:r>
           </w:p>
         </w:tc>
@@ -3909,41 +5464,67 @@
         </w:trPr>
         <w:tc>
           <w:tcPr>
+            <w:tcBorders/>
             <w:tcW w:w="7300" w:type="dxa"/>
             <w:vAlign w:val="center"/>
           </w:tcPr>
           <w:p>
             <w:pPr>
-              <w:spacing w:before="0" w:after="0" w:line="240" w:lineRule="auto"/>
+              <w:spacing w:after="0" w:before="0" w:line="240" w:lineRule="auto"/>
+              <w:ind/>
               <w:jc w:val="left"/>
+              <w:rPr>
+                <w:sz w:val="28"/>
+                <w:szCs w:val="28"/>
+              </w:rPr>
             </w:pPr>
             <w:r>
               <w:rPr>
                 <w:rFonts w:ascii="Times New Roman" w:hAnsi="Times New Roman"/>
-                <w:sz w:val="24"/>
                 <w:color w:val="000000"/>
+                <w:sz w:val="28"/>
+                <w:szCs w:val="28"/>
               </w:rPr>
-              <w:t>Упавшие тесты приложения</w:t>
+              <w:t xml:space="preserve">Упавшие тесты приложения</w:t>
+            </w:r>
+            <w:r>
+              <w:rPr>
+                <w:sz w:val="28"/>
+                <w:szCs w:val="28"/>
+              </w:rPr>
             </w:r>
           </w:p>
         </w:tc>
         <w:tc>
           <w:tcPr>
+            <w:tcBorders/>
             <w:tcW w:w="2055" w:type="dxa"/>
             <w:vAlign w:val="center"/>
           </w:tcPr>
           <w:p>
             <w:pPr>
-              <w:spacing w:before="0" w:after="0" w:line="240" w:lineRule="auto"/>
+              <w:spacing w:after="0" w:before="0" w:line="240" w:lineRule="auto"/>
+              <w:ind/>
               <w:jc w:val="center"/>
+              <w:rPr>
+                <w:sz w:val="28"/>
+                <w:szCs w:val="28"/>
+              </w:rPr>
             </w:pPr>
             <w:r>
               <w:rPr>
                 <w:rFonts w:ascii="Times New Roman" w:hAnsi="Times New Roman"/>
-                <w:sz w:val="24"/>
                 <w:color w:val="000000"/>
+                <w:sz w:val="28"/>
+                <w:szCs w:val="28"/>
               </w:rPr>
-              <w:t>0</w:t>
+              <w:t xml:space="preserve">0</w:t>
+            </w:r>
+            <w:r>
+              <w:rPr>
+                <w:sz w:val="28"/>
+                <w:szCs w:val="28"/>
+              </w:rPr>
             </w:r>
           </w:p>
         </w:tc>
@@ -3954,41 +5535,67 @@
         </w:trPr>
         <w:tc>
           <w:tcPr>
+            <w:tcBorders/>
             <w:tcW w:w="7300" w:type="dxa"/>
             <w:vAlign w:val="center"/>
           </w:tcPr>
           <w:p>
             <w:pPr>
-              <w:spacing w:before="0" w:after="0" w:line="240" w:lineRule="auto"/>
+              <w:spacing w:after="0" w:before="0" w:line="240" w:lineRule="auto"/>
+              <w:ind/>
               <w:jc w:val="left"/>
+              <w:rPr>
+                <w:sz w:val="28"/>
+                <w:szCs w:val="28"/>
+              </w:rPr>
             </w:pPr>
             <w:r>
               <w:rPr>
                 <w:rFonts w:ascii="Times New Roman" w:hAnsi="Times New Roman"/>
-                <w:sz w:val="24"/>
                 <w:color w:val="000000"/>
+                <w:sz w:val="28"/>
+                <w:szCs w:val="28"/>
               </w:rPr>
-              <w:t>Время выполнения тестов</w:t>
+              <w:t xml:space="preserve">Время выполнения тестов</w:t>
+            </w:r>
+            <w:r>
+              <w:rPr>
+                <w:sz w:val="28"/>
+                <w:szCs w:val="28"/>
+              </w:rPr>
             </w:r>
           </w:p>
         </w:tc>
         <w:tc>
           <w:tcPr>
+            <w:tcBorders/>
             <w:tcW w:w="2055" w:type="dxa"/>
             <w:vAlign w:val="center"/>
           </w:tcPr>
           <w:p>
             <w:pPr>
-              <w:spacing w:before="0" w:after="0" w:line="240" w:lineRule="auto"/>
+              <w:spacing w:after="0" w:before="0" w:line="240" w:lineRule="auto"/>
+              <w:ind/>
               <w:jc w:val="center"/>
+              <w:rPr>
+                <w:sz w:val="28"/>
+                <w:szCs w:val="28"/>
+              </w:rPr>
             </w:pPr>
             <w:r>
               <w:rPr>
                 <w:rFonts w:ascii="Times New Roman" w:hAnsi="Times New Roman"/>
-                <w:sz w:val="24"/>
                 <w:color w:val="000000"/>
+                <w:sz w:val="28"/>
+                <w:szCs w:val="28"/>
               </w:rPr>
-              <w:t>1.179 с</w:t>
+              <w:t xml:space="preserve">1.179 с</w:t>
+            </w:r>
+            <w:r>
+              <w:rPr>
+                <w:sz w:val="28"/>
+                <w:szCs w:val="28"/>
+              </w:rPr>
             </w:r>
           </w:p>
         </w:tc>
@@ -3996,7 +5603,6 @@
     </w:tbl>
     <w:p>
       <w:pPr>
-        <w:pBdr/>
         <w:spacing w:after="120" w:line="276" w:lineRule="auto"/>
         <w:ind/>
         <w:jc w:val="both"/>
@@ -4013,12 +5619,16 @@
           <w:sz w:val="28"/>
           <w:szCs w:val="28"/>
         </w:rPr>
-        <w:t xml:space="preserve"/>
+      </w:r>
+      <w:r>
+        <w:rPr>
+          <w:sz w:val="28"/>
+          <w:szCs w:val="28"/>
+        </w:rPr>
       </w:r>
     </w:p>
     <w:p>
       <w:pPr>
-        <w:pBdr/>
         <w:spacing w:after="120" w:line="276" w:lineRule="auto"/>
         <w:ind/>
         <w:jc w:val="both"/>
@@ -4035,12 +5645,27 @@
           <w:sz w:val="28"/>
           <w:szCs w:val="28"/>
         </w:rPr>
-        <w:t xml:space="preserve">Восемь числовых полей покрывают пять видов показателей из задания: замечания линтера, покрытие кода, покрытие ветвлений, результаты тестов и время тестов. Go-покрытие относится к internal, React-покрытие — к App.jsx. Родительские Go-тесты не считаются повторно. Две отдельные проверки сборщика метрик в числа приложения не включены.</w:t>
+        <w:t xml:space="preserve">Восемь числовых полей покрывают пять видов показателей из задания: замечания</w:t>
+      </w:r>
+      <w:r>
+        <w:rPr>
+          <w:rFonts w:ascii="Times New Roman" w:hAnsi="Times New Roman"/>
+          <w:b w:val="0"/>
+          <w:color w:val="000000"/>
+          <w:sz w:val="28"/>
+          <w:szCs w:val="28"/>
+        </w:rPr>
+        <w:t xml:space="preserve"> линтера, покрытие кода, покрытие ветвлений, результаты тестов и время тестов. Go-покрытие относится к internal, React-покрытие — к App.jsx. Родительские Go-тесты не считаются повторно. Две отдельные проверки сборщика метрик в числа приложения не включены.</w:t>
+      </w:r>
+      <w:r>
+        <w:rPr>
+          <w:sz w:val="28"/>
+          <w:szCs w:val="28"/>
+        </w:rPr>
       </w:r>
     </w:p>
     <w:p>
       <w:pPr>
-        <w:pBdr/>
         <w:spacing w:after="120" w:line="276" w:lineRule="auto"/>
         <w:ind/>
         <w:jc w:val="both"/>
@@ -4059,10 +5684,15 @@
         </w:rPr>
         <w:t xml:space="preserve">Время — сумма длительностей Go-пакетов и тестовых файлов React, без установки зависимостей и сборки. Отсутствующий отчёт вызывает ошибку сбора вместо подстановки нуля.</w:t>
       </w:r>
+      <w:r>
+        <w:rPr>
+          <w:sz w:val="28"/>
+          <w:szCs w:val="28"/>
+        </w:rPr>
+      </w:r>
     </w:p>
     <w:p>
       <w:pPr>
-        <w:pBdr/>
         <w:spacing w:after="120" w:line="276" w:lineRule="auto"/>
         <w:ind/>
         <w:jc w:val="both"/>
@@ -4079,12 +5709,27 @@
           <w:sz w:val="28"/>
           <w:szCs w:val="28"/>
         </w:rPr>
-        <w:t xml:space="preserve">Замер, приведённый в таблице, выполнен 22.10.2026. Плановая дата инфраструктуры 03.10.2026 сохранена; задним числом измерения не создавались. Для SGT-14 и будущих этапов вымышленные значения не записывались. При их фактической сдаче используется тот же workflow.</w:t>
+        <w:t xml:space="preserve">Замер,</w:t>
+      </w:r>
+      <w:r>
+        <w:rPr>
+          <w:rFonts w:ascii="Times New Roman" w:hAnsi="Times New Roman"/>
+          <w:b w:val="0"/>
+          <w:color w:val="000000"/>
+          <w:sz w:val="28"/>
+          <w:szCs w:val="28"/>
+        </w:rPr>
+        <w:t xml:space="preserve"> приведённый в таблице, выполнен 22.10.2026. Плановая дата инфраструктуры 03.10.2026 сохранена; задним числом измерения не создавались. Для SGT-14 и будущих этапов вымышленные значения не записывались. При их фактической сдаче используется тот же workflow.</w:t>
+      </w:r>
+      <w:r>
+        <w:rPr>
+          <w:sz w:val="28"/>
+          <w:szCs w:val="28"/>
+        </w:rPr>
       </w:r>
     </w:p>
     <w:p>
       <w:pPr>
-        <w:pBdr/>
         <w:spacing w:after="120" w:line="276" w:lineRule="auto"/>
         <w:ind/>
         <w:jc w:val="both"/>
@@ -4103,16 +5748,26 @@
         </w:rPr>
         <w:t xml:space="preserve">Измеренная версия: 8c75137c623f; тег v0.1.1.</w:t>
       </w:r>
-    </w:p>
-    <w:p>
-      <w:pPr>
-        <w:pBdr/>
-        <w:spacing w:after="120" w:line="276" w:lineRule="auto"/>
-        <w:ind/>
-        <w:jc w:val="both"/>
+      <w:r>
         <w:rPr>
           <w:sz w:val="28"/>
           <w:szCs w:val="28"/>
+        </w:rPr>
+      </w:r>
+    </w:p>
+    <w:p>
+      <w:pPr>
+        <w:spacing w:after="120" w:line="276" w:lineRule="auto"/>
+        <w:ind/>
+        <w:jc w:val="both"/>
+        <w:rPr>
+          <w:rFonts w:ascii="Times New Roman" w:hAnsi="Times New Roman"/>
+          <w:b w:val="0"/>
+          <w:bCs w:val="0"/>
+          <w:color w:val="000000"/>
+          <w:sz w:val="28"/>
+          <w:szCs w:val="28"/>
+          <w:highlight w:val="none"/>
         </w:rPr>
       </w:pPr>
       <w:r>
@@ -4123,14 +5778,78 @@
           <w:sz w:val="28"/>
           <w:szCs w:val="28"/>
         </w:rPr>
-        <w:t xml:space="preserve">https://github.com/vasmaae/software-engineering/actions/runs/39684392913</w:t>
+      </w:r>
+      <w:hyperlink r:id="rId13" w:tooltip="https://github.com/vasmaae/software-engineering/actions/runs/39684392913" w:history="1">
+        <w:r>
+          <w:rPr>
+            <w:rStyle w:val="874"/>
+            <w:rFonts w:ascii="Times New Roman" w:hAnsi="Times New Roman"/>
+            <w:b w:val="0"/>
+            <w:sz w:val="28"/>
+            <w:szCs w:val="28"/>
+          </w:rPr>
+          <w:t xml:space="preserve">https://github.com/vasmaae/software-engineering/actions/runs/39684392913</w:t>
+        </w:r>
+        <w:r>
+          <w:rPr>
+            <w:rStyle w:val="874"/>
+            <w:sz w:val="28"/>
+            <w:szCs w:val="28"/>
+          </w:rPr>
+        </w:r>
+      </w:hyperlink>
+      <w:r>
+        <w:rPr>
+          <w:sz w:val="28"/>
+          <w:szCs w:val="28"/>
+        </w:rPr>
+      </w:r>
+      <w:r>
+        <w:rPr>
+          <w:rFonts w:ascii="Times New Roman" w:hAnsi="Times New Roman"/>
+          <w:b w:val="0"/>
+          <w:color w:val="000000"/>
+          <w:sz w:val="28"/>
+          <w:szCs w:val="28"/>
+          <w:highlight w:val="none"/>
+        </w:rPr>
+      </w:r>
+      <w:r>
+        <w:rPr>
+          <w:rFonts w:ascii="Times New Roman" w:hAnsi="Times New Roman"/>
+          <w:b w:val="0"/>
+          <w:color w:val="000000"/>
+          <w:sz w:val="28"/>
+          <w:szCs w:val="28"/>
+          <w:highlight w:val="none"/>
+        </w:rPr>
+      </w:r>
+      <w:r>
+        <w:rPr>
+          <w:rFonts w:ascii="Times New Roman" w:hAnsi="Times New Roman"/>
+          <w:b w:val="0"/>
+          <w:color w:val="000000"/>
+          <w:sz w:val="28"/>
+          <w:szCs w:val="28"/>
+          <w:highlight w:val="none"/>
+        </w:rPr>
+      </w:r>
+      <w:r>
+        <w:rPr>
+          <w:rFonts w:ascii="Times New Roman" w:hAnsi="Times New Roman"/>
+          <w:b w:val="0"/>
+          <w:bCs w:val="0"/>
+          <w:color w:val="000000"/>
+          <w:sz w:val="28"/>
+          <w:szCs w:val="28"/>
+          <w:highlight w:val="none"/>
+        </w:rPr>
       </w:r>
     </w:p>
     <w:p>
       <w:pPr>
         <w:keepNext w:val="true"/>
         <w:pageBreakBefore w:val="true"/>
-        <w:pBdr/>
         <w:spacing w:after="120" w:before="180" w:line="276" w:lineRule="auto"/>
         <w:ind/>
         <w:jc w:val="center"/>
@@ -4149,10 +5868,15 @@
         </w:rPr>
         <w:t xml:space="preserve">Измерения по этапам и связь с YouTrack</w:t>
       </w:r>
+      <w:r>
+        <w:rPr>
+          <w:sz w:val="28"/>
+          <w:szCs w:val="28"/>
+        </w:rPr>
+      </w:r>
     </w:p>
     <w:p>
       <w:pPr>
-        <w:pBdr/>
         <w:spacing w:after="120" w:line="276" w:lineRule="auto"/>
         <w:ind/>
         <w:jc w:val="both"/>
@@ -4171,25 +5895,32 @@
         </w:rPr>
         <w:t xml:space="preserve">Используется существующий проект SGT. Инфраструктура относится к SGT-15; демонстрационный каталог связан с SGT-3 и SGT-4. Завершение ЛР5 не закрывает отсутствующие функции справочника. Оценки, плановые даты и фактическое время других задач не изменялись.</w:t>
       </w:r>
+      <w:r>
+        <w:rPr>
+          <w:sz w:val="28"/>
+          <w:szCs w:val="28"/>
+        </w:rPr>
+      </w:r>
     </w:p>
     <w:tbl>
       <w:tblPr>
         <w:tblW w:w="9355" w:type="dxa"/>
+        <w:tblCellMar>
+          <w:left w:w="80" w:type="dxa"/>
+          <w:top w:w="80" w:type="dxa"/>
+          <w:right w:w="80" w:type="dxa"/>
+          <w:bottom w:w="80" w:type="dxa"/>
+        </w:tblCellMar>
+        <w:tblBorders>
+          <w:top w:val="single" w:color="d9d9d9" w:sz="4" w:space="0"/>
+          <w:left w:val="single" w:color="d9d9d9" w:sz="4" w:space="0"/>
+          <w:bottom w:val="single" w:color="d9d9d9" w:sz="4" w:space="0"/>
+          <w:right w:val="single" w:color="d9d9d9" w:sz="4" w:space="0"/>
+          <w:insideH w:val="single" w:color="d9d9d9" w:sz="4" w:space="0"/>
+          <w:insideV w:val="single" w:color="d9d9d9" w:sz="4" w:space="0"/>
+        </w:tblBorders>
         <w:tblLayout w:type="fixed"/>
-        <w:tblBorders>
-          <w:top w:val="single" w:sz="4" w:color="D9D9D9"/>
-          <w:left w:val="single" w:sz="4" w:color="D9D9D9"/>
-          <w:bottom w:val="single" w:sz="4" w:color="D9D9D9"/>
-          <w:right w:val="single" w:sz="4" w:color="D9D9D9"/>
-          <w:insideH w:val="single" w:sz="4" w:color="D9D9D9"/>
-          <w:insideV w:val="single" w:sz="4" w:color="D9D9D9"/>
-        </w:tblBorders>
-        <w:tblCellMar>
-          <w:top w:w="80" w:type="dxa"/>
-          <w:bottom w:w="80" w:type="dxa"/>
-          <w:left w:w="80" w:type="dxa"/>
-          <w:right w:w="80" w:type="dxa"/>
-        </w:tblCellMar>
+        <w:tblLook w:val="04A0" w:firstRow="1" w:lastRow="0" w:firstColumn="1" w:lastColumn="0" w:noHBand="0" w:noVBand="1"/>
       </w:tblPr>
       <w:tblGrid>
         <w:gridCol w:w="1500"/>
@@ -4203,67 +5934,106 @@
         </w:trPr>
         <w:tc>
           <w:tcPr>
+            <w:shd w:val="clear" w:color="auto" w:fill="ededed"/>
+            <w:tcBorders/>
             <w:tcW w:w="1500" w:type="dxa"/>
             <w:vAlign w:val="center"/>
-            <w:shd w:fill="EDEDED"/>
           </w:tcPr>
           <w:p>
             <w:pPr>
-              <w:spacing w:before="0" w:after="0" w:line="240" w:lineRule="auto"/>
+              <w:spacing w:after="0" w:before="0" w:line="240" w:lineRule="auto"/>
+              <w:ind/>
               <w:jc w:val="left"/>
+              <w:rPr>
+                <w:sz w:val="28"/>
+                <w:szCs w:val="28"/>
+              </w:rPr>
             </w:pPr>
             <w:r>
               <w:rPr>
                 <w:rFonts w:ascii="Times New Roman" w:hAnsi="Times New Roman"/>
-                <w:sz w:val="24"/>
+                <w:b/>
                 <w:color w:val="000000"/>
-                <w:b/>
+                <w:sz w:val="28"/>
+                <w:szCs w:val="28"/>
               </w:rPr>
-              <w:t>Этап</w:t>
+              <w:t xml:space="preserve">Этап</w:t>
+            </w:r>
+            <w:r>
+              <w:rPr>
+                <w:sz w:val="28"/>
+                <w:szCs w:val="28"/>
+              </w:rPr>
             </w:r>
           </w:p>
         </w:tc>
         <w:tc>
           <w:tcPr>
+            <w:shd w:val="clear" w:color="auto" w:fill="ededed"/>
+            <w:tcBorders/>
             <w:tcW w:w="2350" w:type="dxa"/>
             <w:vAlign w:val="center"/>
-            <w:shd w:fill="EDEDED"/>
           </w:tcPr>
           <w:p>
             <w:pPr>
-              <w:spacing w:before="0" w:after="0" w:line="240" w:lineRule="auto"/>
+              <w:spacing w:after="0" w:before="0" w:line="240" w:lineRule="auto"/>
+              <w:ind/>
               <w:jc w:val="center"/>
+              <w:rPr>
+                <w:sz w:val="28"/>
+                <w:szCs w:val="28"/>
+              </w:rPr>
             </w:pPr>
             <w:r>
               <w:rPr>
                 <w:rFonts w:ascii="Times New Roman" w:hAnsi="Times New Roman"/>
-                <w:sz w:val="24"/>
+                <w:b/>
                 <w:color w:val="000000"/>
-                <w:b/>
+                <w:sz w:val="28"/>
+                <w:szCs w:val="28"/>
               </w:rPr>
-              <w:t>Плановая сдача</w:t>
+              <w:t xml:space="preserve">Плановая сдача</w:t>
+            </w:r>
+            <w:r>
+              <w:rPr>
+                <w:sz w:val="28"/>
+                <w:szCs w:val="28"/>
+              </w:rPr>
             </w:r>
           </w:p>
         </w:tc>
         <w:tc>
           <w:tcPr>
+            <w:shd w:val="clear" w:color="auto" w:fill="ededed"/>
+            <w:tcBorders/>
             <w:tcW w:w="5505" w:type="dxa"/>
             <w:vAlign w:val="center"/>
-            <w:shd w:fill="EDEDED"/>
           </w:tcPr>
           <w:p>
             <w:pPr>
-              <w:spacing w:before="0" w:after="0" w:line="240" w:lineRule="auto"/>
+              <w:spacing w:after="0" w:before="0" w:line="240" w:lineRule="auto"/>
+              <w:ind/>
               <w:jc w:val="left"/>
+              <w:rPr>
+                <w:sz w:val="28"/>
+                <w:szCs w:val="28"/>
+              </w:rPr>
             </w:pPr>
             <w:r>
               <w:rPr>
                 <w:rFonts w:ascii="Times New Roman" w:hAnsi="Times New Roman"/>
-                <w:sz w:val="24"/>
+                <w:b/>
                 <w:color w:val="000000"/>
-                <w:b/>
+                <w:sz w:val="28"/>
+                <w:szCs w:val="28"/>
               </w:rPr>
-              <w:t>Результат</w:t>
+              <w:t xml:space="preserve">Результат</w:t>
+            </w:r>
+            <w:r>
+              <w:rPr>
+                <w:sz w:val="28"/>
+                <w:szCs w:val="28"/>
+              </w:rPr>
             </w:r>
           </w:p>
         </w:tc>
@@ -4274,61 +6044,100 @@
         </w:trPr>
         <w:tc>
           <w:tcPr>
+            <w:tcBorders/>
             <w:tcW w:w="1500" w:type="dxa"/>
             <w:vAlign w:val="center"/>
           </w:tcPr>
           <w:p>
             <w:pPr>
-              <w:spacing w:before="0" w:after="0" w:line="240" w:lineRule="auto"/>
+              <w:spacing w:after="0" w:before="0" w:line="240" w:lineRule="auto"/>
+              <w:ind/>
               <w:jc w:val="left"/>
+              <w:rPr>
+                <w:sz w:val="28"/>
+                <w:szCs w:val="28"/>
+              </w:rPr>
             </w:pPr>
             <w:r>
               <w:rPr>
                 <w:rFonts w:ascii="Times New Roman" w:hAnsi="Times New Roman"/>
-                <w:sz w:val="24"/>
                 <w:color w:val="000000"/>
+                <w:sz w:val="28"/>
+                <w:szCs w:val="28"/>
               </w:rPr>
-              <w:t>SGT-14</w:t>
+              <w:t xml:space="preserve">SGT-14</w:t>
+            </w:r>
+            <w:r>
+              <w:rPr>
+                <w:sz w:val="28"/>
+                <w:szCs w:val="28"/>
+              </w:rPr>
             </w:r>
           </w:p>
         </w:tc>
         <w:tc>
           <w:tcPr>
+            <w:tcBorders/>
             <w:tcW w:w="2350" w:type="dxa"/>
             <w:vAlign w:val="center"/>
           </w:tcPr>
           <w:p>
             <w:pPr>
-              <w:spacing w:before="0" w:after="0" w:line="240" w:lineRule="auto"/>
+              <w:spacing w:after="0" w:before="0" w:line="240" w:lineRule="auto"/>
+              <w:ind/>
               <w:jc w:val="center"/>
+              <w:rPr>
+                <w:sz w:val="28"/>
+                <w:szCs w:val="28"/>
+              </w:rPr>
             </w:pPr>
             <w:r>
               <w:rPr>
                 <w:rFonts w:ascii="Times New Roman" w:hAnsi="Times New Roman"/>
-                <w:sz w:val="24"/>
                 <w:color w:val="000000"/>
+                <w:sz w:val="28"/>
+                <w:szCs w:val="28"/>
               </w:rPr>
-              <w:t>26.09.2026</w:t>
+              <w:t xml:space="preserve">26.09.2026</w:t>
+            </w:r>
+            <w:r>
+              <w:rPr>
+                <w:sz w:val="28"/>
+                <w:szCs w:val="28"/>
+              </w:rPr>
             </w:r>
           </w:p>
         </w:tc>
         <w:tc>
           <w:tcPr>
+            <w:tcBorders/>
             <w:tcW w:w="5505" w:type="dxa"/>
             <w:vAlign w:val="center"/>
           </w:tcPr>
           <w:p>
             <w:pPr>
-              <w:spacing w:before="0" w:after="0" w:line="240" w:lineRule="auto"/>
+              <w:spacing w:after="0" w:before="0" w:line="240" w:lineRule="auto"/>
+              <w:ind/>
               <w:jc w:val="left"/>
+              <w:rPr>
+                <w:sz w:val="28"/>
+                <w:szCs w:val="28"/>
+              </w:rPr>
             </w:pPr>
             <w:r>
               <w:rPr>
                 <w:rFonts w:ascii="Times New Roman" w:hAnsi="Times New Roman"/>
-                <w:sz w:val="24"/>
                 <w:color w:val="000000"/>
+                <w:sz w:val="28"/>
+                <w:szCs w:val="28"/>
               </w:rPr>
-              <w:t>Прототип интерфейса</w:t>
+              <w:t xml:space="preserve">Прототип интерфейса</w:t>
+            </w:r>
+            <w:r>
+              <w:rPr>
+                <w:sz w:val="28"/>
+                <w:szCs w:val="28"/>
+              </w:rPr>
             </w:r>
           </w:p>
         </w:tc>
@@ -4339,61 +6148,100 @@
         </w:trPr>
         <w:tc>
           <w:tcPr>
+            <w:tcBorders/>
             <w:tcW w:w="1500" w:type="dxa"/>
             <w:vAlign w:val="center"/>
           </w:tcPr>
           <w:p>
             <w:pPr>
-              <w:spacing w:before="0" w:after="0" w:line="240" w:lineRule="auto"/>
+              <w:spacing w:after="0" w:before="0" w:line="240" w:lineRule="auto"/>
+              <w:ind/>
               <w:jc w:val="left"/>
+              <w:rPr>
+                <w:sz w:val="28"/>
+                <w:szCs w:val="28"/>
+              </w:rPr>
             </w:pPr>
             <w:r>
               <w:rPr>
                 <w:rFonts w:ascii="Times New Roman" w:hAnsi="Times New Roman"/>
-                <w:sz w:val="24"/>
                 <w:color w:val="000000"/>
+                <w:sz w:val="28"/>
+                <w:szCs w:val="28"/>
               </w:rPr>
-              <w:t>SGT-15</w:t>
+              <w:t xml:space="preserve">SGT-15</w:t>
+            </w:r>
+            <w:r>
+              <w:rPr>
+                <w:sz w:val="28"/>
+                <w:szCs w:val="28"/>
+              </w:rPr>
             </w:r>
           </w:p>
         </w:tc>
         <w:tc>
           <w:tcPr>
+            <w:tcBorders/>
             <w:tcW w:w="2350" w:type="dxa"/>
             <w:vAlign w:val="center"/>
           </w:tcPr>
           <w:p>
             <w:pPr>
-              <w:spacing w:before="0" w:after="0" w:line="240" w:lineRule="auto"/>
+              <w:spacing w:after="0" w:before="0" w:line="240" w:lineRule="auto"/>
+              <w:ind/>
               <w:jc w:val="center"/>
+              <w:rPr>
+                <w:sz w:val="28"/>
+                <w:szCs w:val="28"/>
+              </w:rPr>
             </w:pPr>
             <w:r>
               <w:rPr>
                 <w:rFonts w:ascii="Times New Roman" w:hAnsi="Times New Roman"/>
-                <w:sz w:val="24"/>
                 <w:color w:val="000000"/>
+                <w:sz w:val="28"/>
+                <w:szCs w:val="28"/>
               </w:rPr>
-              <w:t>03.10.2026</w:t>
+              <w:t xml:space="preserve">03.10.2026</w:t>
+            </w:r>
+            <w:r>
+              <w:rPr>
+                <w:sz w:val="28"/>
+                <w:szCs w:val="28"/>
+              </w:rPr>
             </w:r>
           </w:p>
         </w:tc>
         <w:tc>
           <w:tcPr>
+            <w:tcBorders/>
             <w:tcW w:w="5505" w:type="dxa"/>
             <w:vAlign w:val="center"/>
           </w:tcPr>
           <w:p>
             <w:pPr>
-              <w:spacing w:before="0" w:after="0" w:line="240" w:lineRule="auto"/>
+              <w:spacing w:after="0" w:before="0" w:line="240" w:lineRule="auto"/>
+              <w:ind/>
               <w:jc w:val="left"/>
+              <w:rPr>
+                <w:sz w:val="28"/>
+                <w:szCs w:val="28"/>
+              </w:rPr>
             </w:pPr>
             <w:r>
               <w:rPr>
                 <w:rFonts w:ascii="Times New Roman" w:hAnsi="Times New Roman"/>
-                <w:sz w:val="24"/>
                 <w:color w:val="000000"/>
+                <w:sz w:val="28"/>
+                <w:szCs w:val="28"/>
               </w:rPr>
-              <w:t>Инфраструктура</w:t>
+              <w:t xml:space="preserve">Инфраструктура</w:t>
+            </w:r>
+            <w:r>
+              <w:rPr>
+                <w:sz w:val="28"/>
+                <w:szCs w:val="28"/>
+              </w:rPr>
             </w:r>
           </w:p>
         </w:tc>
@@ -4404,61 +6252,100 @@
         </w:trPr>
         <w:tc>
           <w:tcPr>
+            <w:tcBorders/>
             <w:tcW w:w="1500" w:type="dxa"/>
             <w:vAlign w:val="center"/>
           </w:tcPr>
           <w:p>
             <w:pPr>
-              <w:spacing w:before="0" w:after="0" w:line="240" w:lineRule="auto"/>
+              <w:spacing w:after="0" w:before="0" w:line="240" w:lineRule="auto"/>
+              <w:ind/>
               <w:jc w:val="left"/>
+              <w:rPr>
+                <w:sz w:val="28"/>
+                <w:szCs w:val="28"/>
+              </w:rPr>
             </w:pPr>
             <w:r>
               <w:rPr>
                 <w:rFonts w:ascii="Times New Roman" w:hAnsi="Times New Roman"/>
-                <w:sz w:val="24"/>
                 <w:color w:val="000000"/>
+                <w:sz w:val="28"/>
+                <w:szCs w:val="28"/>
               </w:rPr>
-              <w:t>SGT-16</w:t>
+              <w:t xml:space="preserve">SGT-16</w:t>
+            </w:r>
+            <w:r>
+              <w:rPr>
+                <w:sz w:val="28"/>
+                <w:szCs w:val="28"/>
+              </w:rPr>
             </w:r>
           </w:p>
         </w:tc>
         <w:tc>
           <w:tcPr>
+            <w:tcBorders/>
             <w:tcW w:w="2350" w:type="dxa"/>
             <w:vAlign w:val="center"/>
           </w:tcPr>
           <w:p>
             <w:pPr>
-              <w:spacing w:before="0" w:after="0" w:line="240" w:lineRule="auto"/>
+              <w:spacing w:after="0" w:before="0" w:line="240" w:lineRule="auto"/>
+              <w:ind/>
               <w:jc w:val="center"/>
+              <w:rPr>
+                <w:sz w:val="28"/>
+                <w:szCs w:val="28"/>
+              </w:rPr>
             </w:pPr>
             <w:r>
               <w:rPr>
                 <w:rFonts w:ascii="Times New Roman" w:hAnsi="Times New Roman"/>
-                <w:sz w:val="24"/>
                 <w:color w:val="000000"/>
+                <w:sz w:val="28"/>
+                <w:szCs w:val="28"/>
               </w:rPr>
-              <w:t>24.10.2026</w:t>
+              <w:t xml:space="preserve">24.10.2026</w:t>
+            </w:r>
+            <w:r>
+              <w:rPr>
+                <w:sz w:val="28"/>
+                <w:szCs w:val="28"/>
+              </w:rPr>
             </w:r>
           </w:p>
         </w:tc>
         <w:tc>
           <w:tcPr>
+            <w:tcBorders/>
             <w:tcW w:w="5505" w:type="dxa"/>
             <w:vAlign w:val="center"/>
           </w:tcPr>
           <w:p>
             <w:pPr>
-              <w:spacing w:before="0" w:after="0" w:line="240" w:lineRule="auto"/>
+              <w:spacing w:after="0" w:before="0" w:line="240" w:lineRule="auto"/>
+              <w:ind/>
               <w:jc w:val="left"/>
+              <w:rPr>
+                <w:sz w:val="28"/>
+                <w:szCs w:val="28"/>
+              </w:rPr>
             </w:pPr>
             <w:r>
               <w:rPr>
                 <w:rFonts w:ascii="Times New Roman" w:hAnsi="Times New Roman"/>
-                <w:sz w:val="24"/>
                 <w:color w:val="000000"/>
+                <w:sz w:val="28"/>
+                <w:szCs w:val="28"/>
               </w:rPr>
-              <w:t>Данные и администрирование</w:t>
+              <w:t xml:space="preserve">Данные и администрирование</w:t>
+            </w:r>
+            <w:r>
+              <w:rPr>
+                <w:sz w:val="28"/>
+                <w:szCs w:val="28"/>
+              </w:rPr>
             </w:r>
           </w:p>
         </w:tc>
@@ -4469,61 +6356,100 @@
         </w:trPr>
         <w:tc>
           <w:tcPr>
+            <w:tcBorders/>
             <w:tcW w:w="1500" w:type="dxa"/>
             <w:vAlign w:val="center"/>
           </w:tcPr>
           <w:p>
             <w:pPr>
-              <w:spacing w:before="0" w:after="0" w:line="240" w:lineRule="auto"/>
+              <w:spacing w:after="0" w:before="0" w:line="240" w:lineRule="auto"/>
+              <w:ind/>
               <w:jc w:val="left"/>
+              <w:rPr>
+                <w:sz w:val="28"/>
+                <w:szCs w:val="28"/>
+              </w:rPr>
             </w:pPr>
             <w:r>
               <w:rPr>
                 <w:rFonts w:ascii="Times New Roman" w:hAnsi="Times New Roman"/>
-                <w:sz w:val="24"/>
                 <w:color w:val="000000"/>
+                <w:sz w:val="28"/>
+                <w:szCs w:val="28"/>
               </w:rPr>
-              <w:t>SGT-17</w:t>
+              <w:t xml:space="preserve">SGT-17</w:t>
+            </w:r>
+            <w:r>
+              <w:rPr>
+                <w:sz w:val="28"/>
+                <w:szCs w:val="28"/>
+              </w:rPr>
             </w:r>
           </w:p>
         </w:tc>
         <w:tc>
           <w:tcPr>
+            <w:tcBorders/>
             <w:tcW w:w="2350" w:type="dxa"/>
             <w:vAlign w:val="center"/>
           </w:tcPr>
           <w:p>
             <w:pPr>
-              <w:spacing w:before="0" w:after="0" w:line="240" w:lineRule="auto"/>
+              <w:spacing w:after="0" w:before="0" w:line="240" w:lineRule="auto"/>
+              <w:ind/>
               <w:jc w:val="center"/>
+              <w:rPr>
+                <w:sz w:val="28"/>
+                <w:szCs w:val="28"/>
+              </w:rPr>
             </w:pPr>
             <w:r>
               <w:rPr>
                 <w:rFonts w:ascii="Times New Roman" w:hAnsi="Times New Roman"/>
-                <w:sz w:val="24"/>
                 <w:color w:val="000000"/>
+                <w:sz w:val="28"/>
+                <w:szCs w:val="28"/>
               </w:rPr>
-              <w:t>14.11.2026</w:t>
+              <w:t xml:space="preserve">14.11.2026</w:t>
+            </w:r>
+            <w:r>
+              <w:rPr>
+                <w:sz w:val="28"/>
+                <w:szCs w:val="28"/>
+              </w:rPr>
             </w:r>
           </w:p>
         </w:tc>
         <w:tc>
           <w:tcPr>
+            <w:tcBorders/>
             <w:tcW w:w="5505" w:type="dxa"/>
             <w:vAlign w:val="center"/>
           </w:tcPr>
           <w:p>
             <w:pPr>
-              <w:spacing w:before="0" w:after="0" w:line="240" w:lineRule="auto"/>
+              <w:spacing w:after="0" w:before="0" w:line="240" w:lineRule="auto"/>
+              <w:ind/>
               <w:jc w:val="left"/>
+              <w:rPr>
+                <w:sz w:val="28"/>
+                <w:szCs w:val="28"/>
+              </w:rPr>
             </w:pPr>
             <w:r>
               <w:rPr>
                 <w:rFonts w:ascii="Times New Roman" w:hAnsi="Times New Roman"/>
-                <w:sz w:val="24"/>
                 <w:color w:val="000000"/>
+                <w:sz w:val="28"/>
+                <w:szCs w:val="28"/>
               </w:rPr>
-              <w:t>Публичный справочник</w:t>
+              <w:t xml:space="preserve">Публичный справочник</w:t>
+            </w:r>
+            <w:r>
+              <w:rPr>
+                <w:sz w:val="28"/>
+                <w:szCs w:val="28"/>
+              </w:rPr>
             </w:r>
           </w:p>
         </w:tc>
@@ -4534,61 +6460,100 @@
         </w:trPr>
         <w:tc>
           <w:tcPr>
+            <w:tcBorders/>
             <w:tcW w:w="1500" w:type="dxa"/>
             <w:vAlign w:val="center"/>
           </w:tcPr>
           <w:p>
             <w:pPr>
-              <w:spacing w:before="0" w:after="0" w:line="240" w:lineRule="auto"/>
+              <w:spacing w:after="0" w:before="0" w:line="240" w:lineRule="auto"/>
+              <w:ind/>
               <w:jc w:val="left"/>
+              <w:rPr>
+                <w:sz w:val="28"/>
+                <w:szCs w:val="28"/>
+              </w:rPr>
             </w:pPr>
             <w:r>
               <w:rPr>
                 <w:rFonts w:ascii="Times New Roman" w:hAnsi="Times New Roman"/>
-                <w:sz w:val="24"/>
                 <w:color w:val="000000"/>
+                <w:sz w:val="28"/>
+                <w:szCs w:val="28"/>
               </w:rPr>
-              <w:t>SGT-18</w:t>
+              <w:t xml:space="preserve">SGT-18</w:t>
+            </w:r>
+            <w:r>
+              <w:rPr>
+                <w:sz w:val="28"/>
+                <w:szCs w:val="28"/>
+              </w:rPr>
             </w:r>
           </w:p>
         </w:tc>
         <w:tc>
           <w:tcPr>
+            <w:tcBorders/>
             <w:tcW w:w="2350" w:type="dxa"/>
             <w:vAlign w:val="center"/>
           </w:tcPr>
           <w:p>
             <w:pPr>
-              <w:spacing w:before="0" w:after="0" w:line="240" w:lineRule="auto"/>
+              <w:spacing w:after="0" w:before="0" w:line="240" w:lineRule="auto"/>
+              <w:ind/>
               <w:jc w:val="center"/>
+              <w:rPr>
+                <w:sz w:val="28"/>
+                <w:szCs w:val="28"/>
+              </w:rPr>
             </w:pPr>
             <w:r>
               <w:rPr>
                 <w:rFonts w:ascii="Times New Roman" w:hAnsi="Times New Roman"/>
-                <w:sz w:val="24"/>
                 <w:color w:val="000000"/>
+                <w:sz w:val="28"/>
+                <w:szCs w:val="28"/>
               </w:rPr>
-              <w:t>28.11.2026</w:t>
+              <w:t xml:space="preserve">28.11.2026</w:t>
+            </w:r>
+            <w:r>
+              <w:rPr>
+                <w:sz w:val="28"/>
+                <w:szCs w:val="28"/>
+              </w:rPr>
             </w:r>
           </w:p>
         </w:tc>
         <w:tc>
           <w:tcPr>
+            <w:tcBorders/>
             <w:tcW w:w="5505" w:type="dxa"/>
             <w:vAlign w:val="center"/>
           </w:tcPr>
           <w:p>
             <w:pPr>
-              <w:spacing w:before="0" w:after="0" w:line="240" w:lineRule="auto"/>
+              <w:spacing w:after="0" w:before="0" w:line="240" w:lineRule="auto"/>
+              <w:ind/>
               <w:jc w:val="left"/>
+              <w:rPr>
+                <w:sz w:val="28"/>
+                <w:szCs w:val="28"/>
+              </w:rPr>
             </w:pPr>
             <w:r>
               <w:rPr>
                 <w:rFonts w:ascii="Times New Roman" w:hAnsi="Times New Roman"/>
-                <w:sz w:val="24"/>
                 <w:color w:val="000000"/>
+                <w:sz w:val="28"/>
+                <w:szCs w:val="28"/>
               </w:rPr>
-              <w:t>Расписания и адаптация</w:t>
+              <w:t xml:space="preserve">Расписания и адаптация</w:t>
+            </w:r>
+            <w:r>
+              <w:rPr>
+                <w:sz w:val="28"/>
+                <w:szCs w:val="28"/>
+              </w:rPr>
             </w:r>
           </w:p>
         </w:tc>
@@ -4599,61 +6564,100 @@
         </w:trPr>
         <w:tc>
           <w:tcPr>
+            <w:tcBorders/>
             <w:tcW w:w="1500" w:type="dxa"/>
             <w:vAlign w:val="center"/>
           </w:tcPr>
           <w:p>
             <w:pPr>
-              <w:spacing w:before="0" w:after="0" w:line="240" w:lineRule="auto"/>
+              <w:spacing w:after="0" w:before="0" w:line="240" w:lineRule="auto"/>
+              <w:ind/>
               <w:jc w:val="left"/>
+              <w:rPr>
+                <w:sz w:val="28"/>
+                <w:szCs w:val="28"/>
+              </w:rPr>
             </w:pPr>
             <w:r>
               <w:rPr>
                 <w:rFonts w:ascii="Times New Roman" w:hAnsi="Times New Roman"/>
-                <w:sz w:val="24"/>
                 <w:color w:val="000000"/>
+                <w:sz w:val="28"/>
+                <w:szCs w:val="28"/>
               </w:rPr>
-              <w:t>SGT-19</w:t>
+              <w:t xml:space="preserve">SGT-19</w:t>
+            </w:r>
+            <w:r>
+              <w:rPr>
+                <w:sz w:val="28"/>
+                <w:szCs w:val="28"/>
+              </w:rPr>
             </w:r>
           </w:p>
         </w:tc>
         <w:tc>
           <w:tcPr>
+            <w:tcBorders/>
             <w:tcW w:w="2350" w:type="dxa"/>
             <w:vAlign w:val="center"/>
           </w:tcPr>
           <w:p>
             <w:pPr>
-              <w:spacing w:before="0" w:after="0" w:line="240" w:lineRule="auto"/>
+              <w:spacing w:after="0" w:before="0" w:line="240" w:lineRule="auto"/>
+              <w:ind/>
               <w:jc w:val="center"/>
+              <w:rPr>
+                <w:sz w:val="28"/>
+                <w:szCs w:val="28"/>
+              </w:rPr>
             </w:pPr>
             <w:r>
               <w:rPr>
                 <w:rFonts w:ascii="Times New Roman" w:hAnsi="Times New Roman"/>
-                <w:sz w:val="24"/>
                 <w:color w:val="000000"/>
+                <w:sz w:val="28"/>
+                <w:szCs w:val="28"/>
               </w:rPr>
-              <w:t>05.12.2026</w:t>
+              <w:t xml:space="preserve">05.12.2026</w:t>
+            </w:r>
+            <w:r>
+              <w:rPr>
+                <w:sz w:val="28"/>
+                <w:szCs w:val="28"/>
+              </w:rPr>
             </w:r>
           </w:p>
         </w:tc>
         <w:tc>
           <w:tcPr>
+            <w:tcBorders/>
             <w:tcW w:w="5505" w:type="dxa"/>
             <w:vAlign w:val="center"/>
           </w:tcPr>
           <w:p>
             <w:pPr>
-              <w:spacing w:before="0" w:after="0" w:line="240" w:lineRule="auto"/>
+              <w:spacing w:after="0" w:before="0" w:line="240" w:lineRule="auto"/>
+              <w:ind/>
               <w:jc w:val="left"/>
+              <w:rPr>
+                <w:sz w:val="28"/>
+                <w:szCs w:val="28"/>
+              </w:rPr>
             </w:pPr>
             <w:r>
               <w:rPr>
                 <w:rFonts w:ascii="Times New Roman" w:hAnsi="Times New Roman"/>
-                <w:sz w:val="24"/>
                 <w:color w:val="000000"/>
+                <w:sz w:val="28"/>
+                <w:szCs w:val="28"/>
               </w:rPr>
-              <w:t>Итоговое тестирование</w:t>
+              <w:t xml:space="preserve">Итоговое тестирование</w:t>
+            </w:r>
+            <w:r>
+              <w:rPr>
+                <w:sz w:val="28"/>
+                <w:szCs w:val="28"/>
+              </w:rPr>
             </w:r>
           </w:p>
         </w:tc>
@@ -4664,61 +6668,100 @@
         </w:trPr>
         <w:tc>
           <w:tcPr>
+            <w:tcBorders/>
             <w:tcW w:w="1500" w:type="dxa"/>
             <w:vAlign w:val="center"/>
           </w:tcPr>
           <w:p>
             <w:pPr>
-              <w:spacing w:before="0" w:after="0" w:line="240" w:lineRule="auto"/>
+              <w:spacing w:after="0" w:before="0" w:line="240" w:lineRule="auto"/>
+              <w:ind/>
               <w:jc w:val="left"/>
+              <w:rPr>
+                <w:sz w:val="28"/>
+                <w:szCs w:val="28"/>
+              </w:rPr>
             </w:pPr>
             <w:r>
               <w:rPr>
                 <w:rFonts w:ascii="Times New Roman" w:hAnsi="Times New Roman"/>
-                <w:sz w:val="24"/>
                 <w:color w:val="000000"/>
+                <w:sz w:val="28"/>
+                <w:szCs w:val="28"/>
               </w:rPr>
-              <w:t>SGT-20</w:t>
+              <w:t xml:space="preserve">SGT-20</w:t>
+            </w:r>
+            <w:r>
+              <w:rPr>
+                <w:sz w:val="28"/>
+                <w:szCs w:val="28"/>
+              </w:rPr>
             </w:r>
           </w:p>
         </w:tc>
         <w:tc>
           <w:tcPr>
+            <w:tcBorders/>
             <w:tcW w:w="2350" w:type="dxa"/>
             <w:vAlign w:val="center"/>
           </w:tcPr>
           <w:p>
             <w:pPr>
-              <w:spacing w:before="0" w:after="0" w:line="240" w:lineRule="auto"/>
+              <w:spacing w:after="0" w:before="0" w:line="240" w:lineRule="auto"/>
+              <w:ind/>
               <w:jc w:val="center"/>
+              <w:rPr>
+                <w:sz w:val="28"/>
+                <w:szCs w:val="28"/>
+              </w:rPr>
             </w:pPr>
             <w:r>
               <w:rPr>
                 <w:rFonts w:ascii="Times New Roman" w:hAnsi="Times New Roman"/>
-                <w:sz w:val="24"/>
                 <w:color w:val="000000"/>
+                <w:sz w:val="28"/>
+                <w:szCs w:val="28"/>
               </w:rPr>
-              <w:t>08.12.2026</w:t>
+              <w:t xml:space="preserve">08.12.2026</w:t>
+            </w:r>
+            <w:r>
+              <w:rPr>
+                <w:sz w:val="28"/>
+                <w:szCs w:val="28"/>
+              </w:rPr>
             </w:r>
           </w:p>
         </w:tc>
         <w:tc>
           <w:tcPr>
+            <w:tcBorders/>
             <w:tcW w:w="5505" w:type="dxa"/>
             <w:vAlign w:val="center"/>
           </w:tcPr>
           <w:p>
             <w:pPr>
-              <w:spacing w:before="0" w:after="0" w:line="240" w:lineRule="auto"/>
+              <w:spacing w:after="0" w:before="0" w:line="240" w:lineRule="auto"/>
+              <w:ind/>
               <w:jc w:val="left"/>
+              <w:rPr>
+                <w:sz w:val="28"/>
+                <w:szCs w:val="28"/>
+              </w:rPr>
             </w:pPr>
             <w:r>
               <w:rPr>
                 <w:rFonts w:ascii="Times New Roman" w:hAnsi="Times New Roman"/>
-                <w:sz w:val="24"/>
                 <w:color w:val="000000"/>
+                <w:sz w:val="28"/>
+                <w:szCs w:val="28"/>
               </w:rPr>
-              <w:t>Релиз и итоговая сдача</w:t>
+              <w:t xml:space="preserve">Релиз и итоговая сдача</w:t>
+            </w:r>
+            <w:r>
+              <w:rPr>
+                <w:sz w:val="28"/>
+                <w:szCs w:val="28"/>
+              </w:rPr>
             </w:r>
           </w:p>
         </w:tc>
@@ -4726,7 +6769,6 @@
     </w:tbl>
     <w:p>
       <w:pPr>
-        <w:pBdr/>
         <w:spacing w:after="120" w:line="276" w:lineRule="auto"/>
         <w:ind/>
         <w:jc w:val="both"/>
@@ -4743,12 +6785,16 @@
           <w:sz w:val="28"/>
           <w:szCs w:val="28"/>
         </w:rPr>
-        <w:t xml:space="preserve"/>
+      </w:r>
+      <w:r>
+        <w:rPr>
+          <w:sz w:val="28"/>
+          <w:szCs w:val="28"/>
+        </w:rPr>
       </w:r>
     </w:p>
     <w:p>
       <w:pPr>
-        <w:pBdr/>
         <w:spacing w:after="120" w:line="276" w:lineRule="auto"/>
         <w:ind/>
         <w:jc w:val="both"/>
@@ -4765,20 +6811,8 @@
           <w:sz w:val="28"/>
           <w:szCs w:val="28"/>
         </w:rPr>
-        <w:t xml:space="preserve">CI измеряет качество при каждом изменении. Для фиксации завершённого этапа отправляется тег stage/SGT-15 либо запускается CI вручную с полем stage. JSON содержит ID этапа, фактическое время, SHA и ссылку на запуск. Тег сохраняет точную версию кода; снимок и исходные отчёты сохраняются в docs/measurements/SGT-15 через PR.</w:t>
+        <w:t xml:space="preserve">CI измеряет качество при каждом изменении. Для фиксации завершённо</w:t>
       </w:r>
-    </w:p>
-    <w:p>
-      <w:pPr>
-        <w:pBdr/>
-        <w:spacing w:after="120" w:line="276" w:lineRule="auto"/>
-        <w:ind/>
-        <w:jc w:val="both"/>
-        <w:rPr>
-          <w:sz w:val="28"/>
-          <w:szCs w:val="28"/>
-        </w:rPr>
-      </w:pPr>
       <w:r>
         <w:rPr>
           <w:rFonts w:ascii="Times New Roman" w:hAnsi="Times New Roman"/>
@@ -4787,7 +6821,50 @@
           <w:sz w:val="28"/>
           <w:szCs w:val="28"/>
         </w:rPr>
-        <w:t xml:space="preserve">Настроен воспроизводимый процесс от коммита и PR до проверенной сборки и предварительного релиза. Метрики собираются автоматически и привязываются к этапам существующего плана YouTrack. Оставшиеся функциональные задачи и сроки их фактической сдачи продолжают отслеживаться в YouTrack.</w:t>
+        <w:t xml:space="preserve">го этапа отправляется тег stage/SGT-15 либо запускается CI вручную с полем stage. JSON содержит ID этапа, фактическое время, SHA и ссылку на запуск. Тег сохраняет точную версию кода; снимок и исходные отчёты сохраняются в docs/measurements/SGT-15 через PR.</w:t>
+      </w:r>
+      <w:r>
+        <w:rPr>
+          <w:sz w:val="28"/>
+          <w:szCs w:val="28"/>
+        </w:rPr>
+      </w:r>
+    </w:p>
+    <w:p>
+      <w:pPr>
+        <w:spacing w:after="120" w:line="276" w:lineRule="auto"/>
+        <w:ind/>
+        <w:jc w:val="both"/>
+        <w:rPr>
+          <w:sz w:val="28"/>
+          <w:szCs w:val="28"/>
+        </w:rPr>
+      </w:pPr>
+      <w:r>
+        <w:rPr>
+          <w:rFonts w:ascii="Times New Roman" w:hAnsi="Times New Roman"/>
+          <w:b w:val="0"/>
+          <w:color w:val="000000"/>
+          <w:sz w:val="28"/>
+          <w:szCs w:val="28"/>
+        </w:rPr>
+        <w:t xml:space="preserve">Настроен воспроизводимый про</w:t>
+      </w:r>
+      <w:r>
+        <w:rPr>
+          <w:rFonts w:ascii="Times New Roman" w:hAnsi="Times New Roman"/>
+          <w:b w:val="0"/>
+          <w:color w:val="000000"/>
+          <w:sz w:val="28"/>
+          <w:szCs w:val="28"/>
+        </w:rPr>
+        <w:t xml:space="preserve">цесс от коммита и PR до проверенной сборки и предварительного релиза. Метрики собираются автоматически и привязываются к этапам существующего плана YouTrack. Оставшиеся функциональные задачи и сроки их фактической сдачи продолжают отслеживаться в YouTrack.</w:t>
+      </w:r>
+      <w:r>
+        <w:rPr>
+          <w:sz w:val="28"/>
+          <w:szCs w:val="28"/>
+        </w:rPr>
       </w:r>
     </w:p>
     <w:sectPr>
@@ -4807,7 +6884,6 @@
   <w:endnote w:type="separator" w:id="-1">
     <w:p>
       <w:pPr>
-        <w:pBdr/>
         <w:spacing w:after="0" w:line="240" w:lineRule="auto"/>
         <w:ind/>
         <w:rPr/>
@@ -4821,7 +6897,6 @@
   <w:endnote w:type="continuationSeparator" w:id="0">
     <w:p>
       <w:pPr>
-        <w:pBdr/>
         <w:spacing w:after="0" w:line="240" w:lineRule="auto"/>
         <w:ind/>
         <w:rPr/>
@@ -4840,7 +6915,6 @@
   <w:footnote w:type="separator" w:id="-1">
     <w:p>
       <w:pPr>
-        <w:pBdr/>
         <w:spacing w:after="0" w:line="240" w:lineRule="auto"/>
         <w:ind/>
         <w:rPr/>
@@ -4854,7 +6928,6 @@
   <w:footnote w:type="continuationSeparator" w:id="0">
     <w:p>
       <w:pPr>
-        <w:pBdr/>
         <w:spacing w:after="0" w:line="240" w:lineRule="auto"/>
         <w:ind/>
         <w:rPr/>

</xml_diff>

<commit_message>
ci(lab5): publish approved report and keep artifacts for one day (SGT-15) (#6)
</commit_message>
<xml_diff>
--- a/reports/Отчёт_по_лабораторной_работе_№_5.docx
+++ b/reports/Отчёт_по_лабораторной_работе_№_5.docx
@@ -4,7 +4,6 @@
   <w:body>
     <w:p>
       <w:pPr>
-        <w:pBdr/>
         <w:spacing w:after="0" w:line="240" w:lineRule="auto"/>
         <w:ind/>
         <w:jc w:val="center"/>
@@ -43,7 +42,6 @@
     </w:p>
     <w:p>
       <w:pPr>
-        <w:pBdr/>
         <w:spacing w:after="0" w:line="240" w:lineRule="auto"/>
         <w:ind/>
         <w:jc w:val="center"/>
@@ -92,7 +90,6 @@
     </w:p>
     <w:p>
       <w:pPr>
-        <w:pBdr/>
         <w:spacing w:after="0" w:line="240" w:lineRule="auto"/>
         <w:ind/>
         <w:jc w:val="center"/>
@@ -131,7 +128,6 @@
     </w:p>
     <w:p>
       <w:pPr>
-        <w:pBdr/>
         <w:spacing w:after="0" w:line="240" w:lineRule="auto"/>
         <w:ind/>
         <w:jc w:val="center"/>
@@ -187,7 +183,6 @@
           </w:tcPr>
           <w:p>
             <w:pPr>
-              <w:pBdr/>
               <w:spacing w:after="0" w:line="240" w:lineRule="auto"/>
               <w:ind/>
               <w:jc w:val="both"/>
@@ -228,7 +223,6 @@
           </w:tcPr>
           <w:p>
             <w:pPr>
-              <w:pBdr/>
               <w:spacing w:after="0" w:line="240" w:lineRule="auto"/>
               <w:ind/>
               <w:jc w:val="center"/>
@@ -270,7 +264,6 @@
           </w:tcPr>
           <w:p>
             <w:pPr>
-              <w:pBdr/>
               <w:spacing w:after="0" w:line="240" w:lineRule="auto"/>
               <w:ind/>
               <w:jc w:val="both"/>
@@ -312,7 +305,6 @@
           </w:tcPr>
           <w:p>
             <w:pPr>
-              <w:pBdr/>
               <w:spacing w:after="0" w:line="240" w:lineRule="auto"/>
               <w:ind/>
               <w:jc w:val="center"/>
@@ -355,7 +347,6 @@
           </w:tcPr>
           <w:p>
             <w:pPr>
-              <w:pBdr/>
               <w:spacing w:after="0" w:line="240" w:lineRule="auto"/>
               <w:ind/>
               <w:jc w:val="both"/>
@@ -397,7 +388,6 @@
           </w:tcPr>
           <w:p>
             <w:pPr>
-              <w:pBdr/>
               <w:spacing w:after="0" w:line="240" w:lineRule="auto"/>
               <w:ind/>
               <w:jc w:val="center"/>
@@ -454,7 +444,6 @@
     </w:tbl>
     <w:p>
       <w:pPr>
-        <w:pBdr/>
         <w:spacing/>
         <w:ind/>
         <w:rPr>
@@ -491,7 +480,6 @@
     </w:p>
     <w:p>
       <w:pPr>
-        <w:pBdr/>
         <w:spacing w:after="0" w:line="240" w:lineRule="auto"/>
         <w:ind/>
         <w:jc w:val="center"/>
@@ -538,7 +526,6 @@
     </w:p>
     <w:p>
       <w:pPr>
-        <w:pBdr/>
         <w:spacing w:after="0" w:line="240" w:lineRule="auto"/>
         <w:ind/>
         <w:jc w:val="center"/>
@@ -596,7 +583,6 @@
     </w:p>
     <w:p>
       <w:pPr>
-        <w:pBdr/>
         <w:spacing w:after="0" w:line="240" w:lineRule="auto"/>
         <w:ind/>
         <w:jc w:val="center"/>
@@ -653,7 +639,6 @@
     </w:p>
     <w:p>
       <w:pPr>
-        <w:pBdr/>
         <w:spacing w:after="0" w:line="240" w:lineRule="auto"/>
         <w:ind/>
         <w:jc w:val="center"/>
@@ -717,7 +702,6 @@
           </w:tcPr>
           <w:p>
             <w:pPr>
-              <w:pBdr/>
               <w:spacing w:after="0" w:line="240" w:lineRule="auto"/>
               <w:ind/>
               <w:jc w:val="both"/>
@@ -764,7 +748,6 @@
           </w:tcPr>
           <w:p>
             <w:pPr>
-              <w:pBdr/>
               <w:spacing w:after="0" w:line="240" w:lineRule="auto"/>
               <w:ind/>
               <w:jc w:val="center"/>
@@ -806,7 +789,6 @@
     </w:tbl>
     <w:p>
       <w:pPr>
-        <w:pBdr/>
         <w:spacing w:after="0" w:line="240" w:lineRule="auto"/>
         <w:ind/>
         <w:jc w:val="center"/>
@@ -871,7 +853,6 @@
           </w:tcPr>
           <w:p>
             <w:pPr>
-              <w:pBdr/>
               <w:spacing w:after="0" w:line="240" w:lineRule="auto"/>
               <w:ind/>
               <w:jc w:val="both"/>
@@ -918,7 +899,6 @@
           </w:tcPr>
           <w:p>
             <w:pPr>
-              <w:pBdr/>
               <w:spacing w:after="0" w:line="240" w:lineRule="auto"/>
               <w:ind/>
               <w:jc w:val="both"/>
@@ -964,7 +944,6 @@
           </w:tcPr>
           <w:p>
             <w:pPr>
-              <w:pBdr/>
               <w:spacing w:after="0" w:line="240" w:lineRule="auto"/>
               <w:ind/>
               <w:jc w:val="center"/>
@@ -1012,7 +991,6 @@
           </w:tcPr>
           <w:p>
             <w:pPr>
-              <w:pBdr/>
               <w:spacing w:after="0" w:line="240" w:lineRule="auto"/>
               <w:ind/>
               <w:jc w:val="both"/>
@@ -1059,7 +1037,6 @@
           </w:tcPr>
           <w:p>
             <w:pPr>
-              <w:pBdr/>
               <w:spacing w:after="0" w:line="240" w:lineRule="auto"/>
               <w:ind/>
               <w:jc w:val="center"/>
@@ -1111,7 +1088,6 @@
           </w:tcPr>
           <w:p>
             <w:pPr>
-              <w:pBdr/>
               <w:spacing w:after="0" w:line="240" w:lineRule="auto"/>
               <w:ind/>
               <w:jc w:val="center"/>
@@ -1157,7 +1133,6 @@
     </w:tbl>
     <w:p>
       <w:pPr>
-        <w:pBdr/>
         <w:spacing w:after="0" w:line="240" w:lineRule="auto"/>
         <w:ind/>
         <w:jc w:val="both"/>
@@ -1217,7 +1192,6 @@
           </w:tcPr>
           <w:p>
             <w:pPr>
-              <w:pBdr/>
               <w:spacing w:after="0" w:line="240" w:lineRule="auto"/>
               <w:ind/>
               <w:rPr>
@@ -1264,7 +1238,6 @@
           </w:tcPr>
           <w:p>
             <w:pPr>
-              <w:pBdr/>
               <w:spacing w:after="0" w:line="240" w:lineRule="auto"/>
               <w:ind/>
               <w:jc w:val="center"/>
@@ -1310,7 +1283,6 @@
           </w:tcPr>
           <w:p>
             <w:pPr>
-              <w:pBdr/>
               <w:spacing w:after="0" w:line="240" w:lineRule="auto"/>
               <w:ind/>
               <w:jc w:val="both"/>
@@ -1357,7 +1329,6 @@
           </w:tcPr>
           <w:p>
             <w:pPr>
-              <w:pBdr/>
               <w:spacing w:after="0" w:line="240" w:lineRule="auto"/>
               <w:ind/>
               <w:jc w:val="center"/>
@@ -1406,7 +1377,6 @@
           </w:tcPr>
           <w:p>
             <w:pPr>
-              <w:pBdr/>
               <w:spacing w:after="0" w:line="240" w:lineRule="auto"/>
               <w:ind/>
               <w:rPr>
@@ -1454,7 +1424,6 @@
           </w:tcPr>
           <w:p>
             <w:pPr>
-              <w:pBdr/>
               <w:spacing w:after="0" w:line="240" w:lineRule="auto"/>
               <w:ind/>
               <w:jc w:val="center"/>
@@ -1503,7 +1472,6 @@
           </w:tcPr>
           <w:p>
             <w:pPr>
-              <w:pBdr/>
               <w:spacing w:after="0" w:line="240" w:lineRule="auto"/>
               <w:ind/>
               <w:rPr>
@@ -1551,7 +1519,6 @@
           <w:p>
             <w:pPr>
               <w:pStyle w:val="829"/>
-              <w:pBdr/>
               <w:spacing w:after="0" w:before="0" w:line="240" w:lineRule="auto"/>
               <w:ind/>
               <w:jc w:val="center"/>
@@ -1600,7 +1567,6 @@
           </w:tcPr>
           <w:p>
             <w:pPr>
-              <w:pBdr/>
               <w:spacing w:after="0" w:line="240" w:lineRule="auto"/>
               <w:ind/>
               <w:jc w:val="both"/>
@@ -1647,7 +1613,6 @@
           </w:tcPr>
           <w:p>
             <w:pPr>
-              <w:pBdr/>
               <w:spacing w:after="0" w:line="240" w:lineRule="auto"/>
               <w:ind/>
               <w:jc w:val="center"/>
@@ -1693,7 +1658,6 @@
     </w:tbl>
     <w:p>
       <w:pPr>
-        <w:pBdr/>
         <w:spacing w:after="0" w:line="240" w:lineRule="auto"/>
         <w:ind/>
         <w:rPr>
@@ -1730,7 +1694,6 @@
     </w:p>
     <w:p>
       <w:pPr>
-        <w:pBdr/>
         <w:spacing w:after="0" w:line="240" w:lineRule="auto"/>
         <w:ind/>
         <w:rPr>
@@ -1822,7 +1785,6 @@
     </w:p>
     <w:p>
       <w:pPr>
-        <w:pBdr/>
         <w:spacing w:after="0" w:line="240" w:lineRule="auto"/>
         <w:ind/>
         <w:rPr>
@@ -1859,7 +1821,6 @@
     </w:p>
     <w:p>
       <w:pPr>
-        <w:pBdr/>
         <w:spacing w:after="0" w:line="240" w:lineRule="auto"/>
         <w:ind/>
         <w:rPr>
@@ -1896,7 +1857,6 @@
     </w:p>
     <w:p>
       <w:pPr>
-        <w:pBdr/>
         <w:spacing w:after="0" w:line="240" w:lineRule="auto"/>
         <w:ind/>
         <w:rPr>
@@ -1933,7 +1893,6 @@
     </w:p>
     <w:p>
       <w:pPr>
-        <w:pBdr/>
         <w:spacing w:after="0" w:line="240" w:lineRule="auto"/>
         <w:ind w:firstLine="708" w:left="4248"/>
         <w:rPr>
@@ -1971,7 +1930,6 @@
     </w:p>
     <w:p>
       <w:pPr>
-        <w:pBdr/>
         <w:spacing w:after="0" w:line="240" w:lineRule="auto"/>
         <w:ind/>
         <w:rPr>
@@ -2064,7 +2022,6 @@
     </w:p>
     <w:p>
       <w:pPr>
-        <w:pBdr/>
         <w:spacing w:after="0" w:line="240" w:lineRule="auto"/>
         <w:ind w:left="5669"/>
         <w:rPr>
@@ -2101,7 +2058,6 @@
     </w:p>
     <w:p>
       <w:pPr>
-        <w:pBdr/>
         <w:spacing w:after="0" w:line="240" w:lineRule="auto"/>
         <w:ind/>
         <w:rPr>
@@ -2194,7 +2150,6 @@
     </w:p>
     <w:p>
       <w:pPr>
-        <w:pBdr/>
         <w:spacing w:after="0" w:line="240" w:lineRule="auto"/>
         <w:ind/>
         <w:rPr>
@@ -2287,7 +2242,6 @@
     </w:p>
     <w:p>
       <w:pPr>
-        <w:pBdr/>
         <w:spacing w:after="0" w:line="240" w:lineRule="auto"/>
         <w:ind w:left="5669"/>
         <w:rPr>
@@ -2324,7 +2278,6 @@
     </w:p>
     <w:p>
       <w:pPr>
-        <w:pBdr/>
         <w:spacing w:after="0" w:line="240" w:lineRule="auto"/>
         <w:ind/>
         <w:rPr>
@@ -2417,7 +2370,6 @@
     </w:p>
     <w:p>
       <w:pPr>
-        <w:pBdr/>
         <w:spacing w:after="0" w:line="240" w:lineRule="auto"/>
         <w:ind/>
         <w:rPr>
@@ -2510,7 +2462,6 @@
     </w:p>
     <w:p>
       <w:pPr>
-        <w:pBdr/>
         <w:spacing w:after="0" w:line="240" w:lineRule="auto"/>
         <w:ind/>
         <w:rPr>
@@ -2547,7 +2498,6 @@
     </w:p>
     <w:p>
       <w:pPr>
-        <w:pBdr/>
         <w:spacing w:after="0" w:line="240" w:lineRule="auto"/>
         <w:ind/>
         <w:rPr>
@@ -2584,7 +2534,6 @@
     </w:p>
     <w:p>
       <w:pPr>
-        <w:pBdr/>
         <w:spacing w:after="0" w:line="240" w:lineRule="auto"/>
         <w:ind/>
         <w:rPr>
@@ -2621,7 +2570,6 @@
     </w:p>
     <w:p>
       <w:pPr>
-        <w:pBdr/>
         <w:spacing w:after="0" w:line="240" w:lineRule="auto"/>
         <w:ind/>
         <w:rPr>
@@ -2658,7 +2606,6 @@
     </w:p>
     <w:p>
       <w:pPr>
-        <w:pBdr/>
         <w:spacing w:after="0" w:line="240" w:lineRule="auto"/>
         <w:ind/>
         <w:rPr>
@@ -2695,7 +2642,6 @@
     </w:p>
     <w:p>
       <w:pPr>
-        <w:pBdr/>
         <w:spacing w:after="0" w:line="240" w:lineRule="auto"/>
         <w:ind/>
         <w:rPr>
@@ -2732,7 +2678,6 @@
     </w:p>
     <w:p>
       <w:pPr>
-        <w:pBdr/>
         <w:spacing w:after="0" w:line="240" w:lineRule="auto"/>
         <w:ind/>
         <w:rPr>
@@ -2769,7 +2714,6 @@
     </w:p>
     <w:p>
       <w:pPr>
-        <w:pBdr/>
         <w:spacing w:after="0" w:line="240" w:lineRule="auto"/>
         <w:ind/>
         <w:rPr>
@@ -2806,7 +2750,6 @@
     </w:p>
     <w:p>
       <w:pPr>
-        <w:pBdr/>
         <w:spacing w:after="0" w:line="240" w:lineRule="auto"/>
         <w:ind/>
         <w:jc w:val="center"/>
@@ -2845,7 +2788,6 @@
     </w:p>
     <w:p>
       <w:pPr>
-        <w:pBdr/>
         <w:spacing w:after="0" w:line="240" w:lineRule="auto"/>
         <w:ind/>
         <w:jc w:val="center"/>
@@ -2884,7 +2826,6 @@
     </w:p>
     <w:p>
       <w:pPr>
-        <w:pBdr/>
         <w:spacing/>
         <w:ind/>
         <w:rPr/>
@@ -2894,7 +2835,6 @@
     </w:p>
     <w:p>
       <w:pPr>
-        <w:pBdr/>
         <w:spacing/>
         <w:ind/>
         <w:rPr/>
@@ -2906,7 +2846,6 @@
     </w:p>
     <w:p>
       <w:pPr>
-        <w:pBdr/>
         <w:spacing w:after="120" w:line="276" w:lineRule="auto"/>
         <w:ind/>
         <w:jc w:val="center"/>
@@ -2925,12 +2864,17 @@
         </w:rPr>
         <w:t xml:space="preserve">Лабораторная работа № 5</w:t>
       </w:r>
+      <w:r>
+        <w:rPr>
+          <w:sz w:val="28"/>
+          <w:szCs w:val="28"/>
+        </w:rPr>
+      </w:r>
     </w:p>
     <w:p>
       <w:pPr>
         <w:pStyle w:val="848"/>
         <w:keepNext w:val="true"/>
-        <w:pBdr/>
         <w:spacing w:after="160" w:before="0"/>
         <w:ind/>
         <w:jc w:val="center"/>
@@ -2949,10 +2893,15 @@
         </w:rPr>
         <w:t xml:space="preserve">Управление исходным кодом и отслеживание метрик</w:t>
       </w:r>
+      <w:r>
+        <w:rPr>
+          <w:sz w:val="28"/>
+          <w:szCs w:val="28"/>
+        </w:rPr>
+      </w:r>
     </w:p>
     <w:p>
       <w:pPr>
-        <w:pBdr/>
         <w:spacing w:after="120" w:line="276" w:lineRule="auto"/>
         <w:ind/>
         <w:jc w:val="both"/>
@@ -2969,14 +2918,29 @@
           <w:sz w:val="28"/>
           <w:szCs w:val="28"/>
         </w:rPr>
-        <w:t xml:space="preserve">Цель работы — настроить управление исходным кодом, автоматические проверки, сборку и сбор метрик качества для проекта справочника городского транспорта. Подготовлен работающий учебный срез на Go, PostgreSQL и React; результаты проверены локально и в GitHub Actions.</w:t>
+        <w:t xml:space="preserve">Цель рабо</w:t>
+      </w:r>
+      <w:r>
+        <w:rPr>
+          <w:rFonts w:ascii="Times New Roman" w:hAnsi="Times New Roman"/>
+          <w:b w:val="0"/>
+          <w:color w:val="000000"/>
+          <w:sz w:val="28"/>
+          <w:szCs w:val="28"/>
+        </w:rPr>
+        <w:t xml:space="preserve">ты — настроить управление исходным кодом, автоматические проверки, сборку и сбор метрик качества для проекта справочника городского транспорта. Подготовлен работающий учебный срез на Go, PostgreSQL и React; результаты проверены локально и в GitHub Actions.</w:t>
+      </w:r>
+      <w:r>
+        <w:rPr>
+          <w:sz w:val="28"/>
+          <w:szCs w:val="28"/>
+        </w:rPr>
       </w:r>
     </w:p>
     <w:p>
       <w:pPr>
         <w:keepNext w:val="true"/>
         <w:pageBreakBefore w:val="false"/>
-        <w:pBdr/>
         <w:spacing w:after="120" w:before="180" w:line="276" w:lineRule="auto"/>
         <w:ind/>
         <w:jc w:val="center"/>
@@ -2995,10 +2959,15 @@
         </w:rPr>
         <w:t xml:space="preserve">Репозиторий и границы реализации</w:t>
       </w:r>
+      <w:r>
+        <w:rPr>
+          <w:sz w:val="28"/>
+          <w:szCs w:val="28"/>
+        </w:rPr>
+      </w:r>
     </w:p>
     <w:p>
       <w:pPr>
-        <w:pBdr/>
         <w:spacing w:after="120" w:line="276" w:lineRule="auto"/>
         <w:ind/>
         <w:jc w:val="both"/>
@@ -3015,20 +2984,8 @@
           <w:sz w:val="28"/>
           <w:szCs w:val="28"/>
         </w:rPr>
-        <w:t xml:space="preserve">Использован публичный репозиторий GitHub vasmaae/software-engineering. Go API читает три демонстрационных маршрута из PostgreSQL; React отображает каталог, поиск по номеру и фильтр транспорта. Данные вымышленные. Администрирование, связанные остановки и расписания остаются задачами последующих итераций.</w:t>
+        <w:t xml:space="preserve">Использован публичный репозиторий GitHub vasmaae</w:t>
       </w:r>
-    </w:p>
-    <w:p>
-      <w:pPr>
-        <w:pBdr/>
-        <w:spacing w:after="120" w:line="276" w:lineRule="auto"/>
-        <w:ind/>
-        <w:jc w:val="both"/>
-        <w:rPr>
-          <w:sz w:val="28"/>
-          <w:szCs w:val="28"/>
-        </w:rPr>
-      </w:pPr>
       <w:r>
         <w:rPr>
           <w:rFonts w:ascii="Times New Roman" w:hAnsi="Times New Roman"/>
@@ -3037,14 +2994,56 @@
           <w:sz w:val="28"/>
           <w:szCs w:val="28"/>
         </w:rPr>
-        <w:t xml:space="preserve">Исходники API размещены в cmd/api и internal/catalog, интерфейс — в web, SQL — в db, контейнеры — в deploy. Файлы README.md, docs/contributing.md и docs/quality.md описывают запуск, правила Git и метрики. Предыдущие отчёты сохранены в reports. Зависимости фиксируются package-lock.json и go.sum; .env исключён из Git.</w:t>
+        <w:t xml:space="preserve">/software-engineering. Go API читает три демонстрационных маршрута из PostgreSQL; React отображает каталог, поиск по номеру и фильтр транспорта. Данные вымышленные. Администрирование, связанные остановки и расписания остаются задачами последующих итераций.</w:t>
+      </w:r>
+      <w:r>
+        <w:rPr>
+          <w:sz w:val="28"/>
+          <w:szCs w:val="28"/>
+        </w:rPr>
       </w:r>
     </w:p>
     <w:p>
       <w:pPr>
+        <w:spacing w:after="120" w:line="276" w:lineRule="auto"/>
+        <w:ind/>
+        <w:jc w:val="both"/>
+        <w:rPr>
+          <w:sz w:val="28"/>
+          <w:szCs w:val="28"/>
+        </w:rPr>
+      </w:pPr>
+      <w:r>
+        <w:rPr>
+          <w:rFonts w:ascii="Times New Roman" w:hAnsi="Times New Roman"/>
+          <w:b w:val="0"/>
+          <w:color w:val="000000"/>
+          <w:sz w:val="28"/>
+          <w:szCs w:val="28"/>
+        </w:rPr>
+        <w:t xml:space="preserve">Исходники API размещены в cmd/api и internal/catalog, интерфе</w:t>
+      </w:r>
+      <w:r>
+        <w:rPr>
+          <w:rFonts w:ascii="Times New Roman" w:hAnsi="Times New Roman"/>
+          <w:b w:val="0"/>
+          <w:color w:val="000000"/>
+          <w:sz w:val="28"/>
+          <w:szCs w:val="28"/>
+        </w:rPr>
+        <w:t xml:space="preserve">йс — в web, SQL — в db, контейнеры — в deploy. Файлы README.md, docs/contributing.md и docs/quality.md описывают запуск, правила Git и метрики. Предыдущие отчёты сохранены в reports. Зависимости фиксируются package-lock.json и go.sum; .env исключён из Git.</w:t>
+      </w:r>
+      <w:r>
+        <w:rPr>
+          <w:sz w:val="28"/>
+          <w:szCs w:val="28"/>
+        </w:rPr>
+      </w:r>
+    </w:p>
+    <w:p>
+      <w:pPr>
         <w:keepNext w:val="true"/>
         <w:pageBreakBefore w:val="false"/>
-        <w:pBdr/>
         <w:spacing w:after="120" w:before="180" w:line="276" w:lineRule="auto"/>
         <w:ind/>
         <w:jc w:val="center"/>
@@ -3061,12 +3060,17 @@
           <w:sz w:val="28"/>
           <w:szCs w:val="28"/>
         </w:rPr>
-        <w:t xml:space="preserve">Правила фиксации изменений</w:t>
+        <w:t xml:space="preserve">Фиксация изменений</w:t>
+      </w:r>
+      <w:r>
+        <w:rPr>
+          <w:sz w:val="28"/>
+          <w:szCs w:val="28"/>
+        </w:rPr>
       </w:r>
     </w:p>
     <w:p>
       <w:pPr>
-        <w:pBdr/>
         <w:spacing w:after="120" w:line="276" w:lineRule="auto"/>
         <w:ind/>
         <w:jc w:val="both"/>
@@ -3083,20 +3087,8 @@
           <w:sz w:val="28"/>
           <w:szCs w:val="28"/>
         </w:rPr>
-        <w:t xml:space="preserve">Принят Conventional Commits: type(scope): описание. Типы feat, fix, docs, test, refactor, perf, style, build, ci, chore и revert показывают назначение изменения. Пример: feat(catalog): add SGT demo and quality pipeline. Один коммит содержит одно законченное изменение; связанные ID SGT указываются в сообщении или PR.</w:t>
+        <w:t xml:space="preserve">Принят Conventional Commits 1.0.0: type(scope): описание. Область scope не</w:t>
       </w:r>
-    </w:p>
-    <w:p>
-      <w:pPr>
-        <w:pBdr/>
-        <w:spacing w:after="120" w:line="276" w:lineRule="auto"/>
-        <w:ind/>
-        <w:jc w:val="both"/>
-        <w:rPr>
-          <w:sz w:val="28"/>
-          <w:szCs w:val="28"/>
-        </w:rPr>
-      </w:pPr>
       <w:r>
         <w:rPr>
           <w:rFonts w:ascii="Times New Roman" w:hAnsi="Times New Roman"/>
@@ -3105,14 +3097,93 @@
           <w:sz w:val="28"/>
           <w:szCs w:val="28"/>
         </w:rPr>
-        <w:t xml:space="preserve">make setup подключает hook .githooks/commit-msg с commitlint. При проверке сообщение «bad message» отклонено: отсутствуют type и subject. Корректное сообщение принято. В CI отдельно проверяется весь диапазон новых коммитов, поэтому обход локального hook не обходит серверную проверку.</w:t>
+        <w:t xml:space="preserve">обязательна. Типы: feat, fix, docs, test, refactor, perf, style, build, ci, chore, revert. Заголовок — до 100 символов; тип и начало английского описания пишутся строчными буквами, точка в конце не ставится. Один коммит содержит одно законченное изменение.</w:t>
+      </w:r>
+      <w:r>
+        <w:rPr>
+          <w:sz w:val="28"/>
+          <w:szCs w:val="28"/>
+        </w:rPr>
       </w:r>
     </w:p>
     <w:p>
       <w:pPr>
+        <w:spacing w:after="120" w:line="276" w:lineRule="auto"/>
+        <w:ind/>
+        <w:jc w:val="both"/>
+        <w:rPr>
+          <w:sz w:val="28"/>
+          <w:szCs w:val="28"/>
+        </w:rPr>
+      </w:pPr>
+      <w:r>
+        <w:rPr>
+          <w:rFonts w:ascii="Times New Roman" w:hAnsi="Times New Roman"/>
+          <w:b w:val="0"/>
+          <w:color w:val="000000"/>
+          <w:sz w:val="28"/>
+          <w:szCs w:val="28"/>
+        </w:rPr>
+        <w:t xml:space="preserve">Пример: «ci(branches): enforce task branch and PR conventions (SGT-15)». feat обозначает но</w:t>
+      </w:r>
+      <w:r>
+        <w:rPr>
+          <w:rFonts w:ascii="Times New Roman" w:hAnsi="Times New Roman"/>
+          <w:b w:val="0"/>
+          <w:color w:val="000000"/>
+          <w:sz w:val="28"/>
+          <w:szCs w:val="28"/>
+        </w:rPr>
+        <w:t xml:space="preserve">вую функцию, fix — исправление, docs — документацию, ci — изменение пайплайна. Несовместимое API отмечается ! после типа или области либо footer «BREAKING CHANGE: описание». Тело отделяется пустой строкой; строки тела и footer — до 100 символов, кроме URL.</w:t>
+      </w:r>
+      <w:r>
+        <w:rPr>
+          <w:sz w:val="28"/>
+          <w:szCs w:val="28"/>
+        </w:rPr>
+      </w:r>
+    </w:p>
+    <w:p>
+      <w:pPr>
+        <w:spacing w:after="120" w:line="276" w:lineRule="auto"/>
+        <w:ind/>
+        <w:jc w:val="both"/>
+        <w:rPr>
+          <w:sz w:val="28"/>
+          <w:szCs w:val="28"/>
+        </w:rPr>
+      </w:pPr>
+      <w:r>
+        <w:rPr>
+          <w:rFonts w:ascii="Times New Roman" w:hAnsi="Times New Roman"/>
+          <w:b w:val="0"/>
+          <w:color w:val="000000"/>
+          <w:sz w:val="28"/>
+          <w:szCs w:val="28"/>
+        </w:rPr>
+        <w:t xml:space="preserve">commitlint.config.js под</w:t>
+      </w:r>
+      <w:r>
+        <w:rPr>
+          <w:rFonts w:ascii="Times New Roman" w:hAnsi="Times New Roman"/>
+          <w:b w:val="0"/>
+          <w:color w:val="000000"/>
+          <w:sz w:val="28"/>
+          <w:szCs w:val="28"/>
+        </w:rPr>
+        <w:t xml:space="preserve">ключает config-conventional. make setup подключает commit-msg hook; CI проверяет все новые коммиты через scripts/check-commits.sh. Сообщение «bad message» отклонено, корректное сообщение принято. Протокол: docs/measurements/SGT-15/commitlint-rejection.txt.</w:t>
+      </w:r>
+      <w:r>
+        <w:rPr>
+          <w:sz w:val="28"/>
+          <w:szCs w:val="28"/>
+        </w:rPr>
+      </w:r>
+    </w:p>
+    <w:p>
+      <w:pPr>
         <w:keepNext w:val="true"/>
         <w:pageBreakBefore w:val="true"/>
-        <w:pBdr/>
         <w:spacing w:after="120" w:before="180" w:line="276" w:lineRule="auto"/>
         <w:ind/>
         <w:jc w:val="center"/>
@@ -3129,12 +3200,17 @@
           <w:sz w:val="28"/>
           <w:szCs w:val="28"/>
         </w:rPr>
-        <w:t xml:space="preserve">Ветвление и слияние</w:t>
+        <w:t xml:space="preserve">Ветвление и имена веток</w:t>
+      </w:r>
+      <w:r>
+        <w:rPr>
+          <w:sz w:val="28"/>
+          <w:szCs w:val="28"/>
+        </w:rPr>
       </w:r>
     </w:p>
     <w:p>
       <w:pPr>
-        <w:pBdr/>
         <w:spacing w:after="120" w:line="276" w:lineRule="auto"/>
         <w:ind/>
         <w:jc w:val="both"/>
@@ -3151,20 +3227,8 @@
           <w:sz w:val="28"/>
           <w:szCs w:val="28"/>
         </w:rPr>
-        <w:t xml:space="preserve">Выбран GitHub Flow: постоянная main и короткие ветки задач. Изменения ЛР5 выполнены в sgt-15-lab5. После push открыт pull request № 1 с описанием результата, проверок и ссылкой на SGT-15. Отдельная develop для одного исполнителя не создавалась.</w:t>
+        <w:t xml:space="preserve">Реализован GitHub Flow: постоянная </w:t>
       </w:r>
-    </w:p>
-    <w:p>
-      <w:pPr>
-        <w:pBdr/>
-        <w:spacing w:after="120" w:line="276" w:lineRule="auto"/>
-        <w:ind/>
-        <w:jc w:val="both"/>
-        <w:rPr>
-          <w:sz w:val="28"/>
-          <w:szCs w:val="28"/>
-        </w:rPr>
-      </w:pPr>
       <w:r>
         <w:rPr>
           <w:rFonts w:ascii="Times New Roman" w:hAnsi="Times New Roman"/>
@@ -3173,12 +3237,570 @@
           <w:sz w:val="28"/>
           <w:szCs w:val="28"/>
         </w:rPr>
-        <w:t xml:space="preserve">Защита main требует pull request и успешную актуальную проверку quality. Правило действует для администратора; force push и удаление main запрещены. Включены линейная история и требование завершить обсуждения перед слиянием. Одобрение второго участника не требуется, поскольку работу выполняет один студент. Это не заменяет независимое ревью.</w:t>
+        <w:t xml:space="preserve">main и короткие ветки задач от актуальной main. Отдельная develop не используется. Соглашение проекта: &lt;тип&gt;/SGT-&lt;номер&gt;-&lt;описание&gt;. Номер положительный, без ведущего нуля. Описание — строчные латинские буквы и цифры; слова разделяются одиночными дефисами.</w:t>
+      </w:r>
+      <w:r>
+        <w:rPr>
+          <w:sz w:val="28"/>
+          <w:szCs w:val="28"/>
+        </w:rPr>
       </w:r>
     </w:p>
+    <w:tbl>
+      <w:tblPr>
+        <w:tblW w:w="9355" w:type="dxa"/>
+        <w:tblCellMar>
+          <w:left w:w="80" w:type="dxa"/>
+          <w:top w:w="80" w:type="dxa"/>
+          <w:right w:w="80" w:type="dxa"/>
+          <w:bottom w:w="80" w:type="dxa"/>
+        </w:tblCellMar>
+        <w:tblBorders>
+          <w:top w:val="single" w:color="d9d9d9" w:sz="4" w:space="0"/>
+          <w:left w:val="single" w:color="d9d9d9" w:sz="4" w:space="0"/>
+          <w:bottom w:val="single" w:color="d9d9d9" w:sz="4" w:space="0"/>
+          <w:right w:val="single" w:color="d9d9d9" w:sz="4" w:space="0"/>
+          <w:insideH w:val="single" w:color="d9d9d9" w:sz="4" w:space="0"/>
+          <w:insideV w:val="single" w:color="d9d9d9" w:sz="4" w:space="0"/>
+        </w:tblBorders>
+        <w:tblLayout w:type="fixed"/>
+        <w:tblLook w:val="04A0" w:firstRow="1" w:lastRow="0" w:firstColumn="1" w:lastColumn="0" w:noHBand="0" w:noVBand="1"/>
+      </w:tblPr>
+      <w:tblGrid>
+        <w:gridCol w:w="1450"/>
+        <w:gridCol w:w="2500"/>
+        <w:gridCol w:w="5405"/>
+      </w:tblGrid>
+      <w:tr>
+        <w:trPr>
+          <w:cantSplit/>
+          <w:tblHeader/>
+        </w:trPr>
+        <w:tc>
+          <w:tcPr>
+            <w:shd w:val="clear" w:color="auto" w:fill="ededed"/>
+            <w:tcBorders/>
+            <w:tcW w:w="1450" w:type="dxa"/>
+            <w:vAlign w:val="center"/>
+          </w:tcPr>
+          <w:p>
+            <w:pPr>
+              <w:spacing w:after="0" w:before="0" w:line="240" w:lineRule="auto"/>
+              <w:ind/>
+              <w:jc w:val="left"/>
+              <w:rPr>
+                <w:sz w:val="28"/>
+                <w:szCs w:val="28"/>
+              </w:rPr>
+            </w:pPr>
+            <w:r>
+              <w:rPr>
+                <w:rFonts w:ascii="Times New Roman" w:hAnsi="Times New Roman"/>
+                <w:b/>
+                <w:color w:val="000000"/>
+                <w:sz w:val="28"/>
+                <w:szCs w:val="28"/>
+              </w:rPr>
+              <w:t xml:space="preserve">Префикс</w:t>
+            </w:r>
+            <w:r>
+              <w:rPr>
+                <w:sz w:val="28"/>
+                <w:szCs w:val="28"/>
+              </w:rPr>
+            </w:r>
+          </w:p>
+        </w:tc>
+        <w:tc>
+          <w:tcPr>
+            <w:shd w:val="clear" w:color="auto" w:fill="ededed"/>
+            <w:tcBorders/>
+            <w:tcW w:w="2500" w:type="dxa"/>
+            <w:vAlign w:val="center"/>
+          </w:tcPr>
+          <w:p>
+            <w:pPr>
+              <w:spacing w:after="0" w:before="0" w:line="240" w:lineRule="auto"/>
+              <w:ind/>
+              <w:jc w:val="center"/>
+              <w:rPr>
+                <w:sz w:val="28"/>
+                <w:szCs w:val="28"/>
+              </w:rPr>
+            </w:pPr>
+            <w:r>
+              <w:rPr>
+                <w:rFonts w:ascii="Times New Roman" w:hAnsi="Times New Roman"/>
+                <w:b/>
+                <w:color w:val="000000"/>
+                <w:sz w:val="28"/>
+                <w:szCs w:val="28"/>
+              </w:rPr>
+              <w:t xml:space="preserve">Назначение</w:t>
+            </w:r>
+            <w:r>
+              <w:rPr>
+                <w:sz w:val="28"/>
+                <w:szCs w:val="28"/>
+              </w:rPr>
+            </w:r>
+          </w:p>
+        </w:tc>
+        <w:tc>
+          <w:tcPr>
+            <w:shd w:val="clear" w:color="auto" w:fill="ededed"/>
+            <w:tcBorders/>
+            <w:tcW w:w="5405" w:type="dxa"/>
+            <w:vAlign w:val="center"/>
+          </w:tcPr>
+          <w:p>
+            <w:pPr>
+              <w:spacing w:after="0" w:before="0" w:line="240" w:lineRule="auto"/>
+              <w:ind/>
+              <w:jc w:val="left"/>
+              <w:rPr>
+                <w:sz w:val="28"/>
+                <w:szCs w:val="28"/>
+              </w:rPr>
+            </w:pPr>
+            <w:r>
+              <w:rPr>
+                <w:rFonts w:ascii="Times New Roman" w:hAnsi="Times New Roman"/>
+                <w:b/>
+                <w:color w:val="000000"/>
+                <w:sz w:val="28"/>
+                <w:szCs w:val="28"/>
+              </w:rPr>
+              <w:t xml:space="preserve">Созданная ветка</w:t>
+            </w:r>
+            <w:r>
+              <w:rPr>
+                <w:sz w:val="28"/>
+                <w:szCs w:val="28"/>
+              </w:rPr>
+            </w:r>
+          </w:p>
+        </w:tc>
+      </w:tr>
+      <w:tr>
+        <w:trPr>
+          <w:cantSplit/>
+        </w:trPr>
+        <w:tc>
+          <w:tcPr>
+            <w:tcBorders/>
+            <w:tcW w:w="1450" w:type="dxa"/>
+            <w:vAlign w:val="center"/>
+          </w:tcPr>
+          <w:p>
+            <w:pPr>
+              <w:spacing w:after="0" w:before="0" w:line="240" w:lineRule="auto"/>
+              <w:ind/>
+              <w:jc w:val="left"/>
+              <w:rPr>
+                <w:sz w:val="28"/>
+                <w:szCs w:val="28"/>
+              </w:rPr>
+            </w:pPr>
+            <w:r>
+              <w:rPr>
+                <w:rFonts w:ascii="Times New Roman" w:hAnsi="Times New Roman"/>
+                <w:color w:val="000000"/>
+                <w:sz w:val="28"/>
+                <w:szCs w:val="28"/>
+              </w:rPr>
+              <w:t xml:space="preserve">feature/</w:t>
+            </w:r>
+            <w:r>
+              <w:rPr>
+                <w:sz w:val="28"/>
+                <w:szCs w:val="28"/>
+              </w:rPr>
+            </w:r>
+          </w:p>
+        </w:tc>
+        <w:tc>
+          <w:tcPr>
+            <w:tcBorders/>
+            <w:tcW w:w="2500" w:type="dxa"/>
+            <w:vAlign w:val="center"/>
+          </w:tcPr>
+          <w:p>
+            <w:pPr>
+              <w:spacing w:after="0" w:before="0" w:line="240" w:lineRule="auto"/>
+              <w:ind/>
+              <w:jc w:val="center"/>
+              <w:rPr>
+                <w:sz w:val="28"/>
+                <w:szCs w:val="28"/>
+              </w:rPr>
+            </w:pPr>
+            <w:r>
+              <w:rPr>
+                <w:rFonts w:ascii="Times New Roman" w:hAnsi="Times New Roman"/>
+                <w:color w:val="000000"/>
+                <w:sz w:val="28"/>
+                <w:szCs w:val="28"/>
+              </w:rPr>
+              <w:t xml:space="preserve">Новая функция</w:t>
+            </w:r>
+            <w:r>
+              <w:rPr>
+                <w:sz w:val="28"/>
+                <w:szCs w:val="28"/>
+              </w:rPr>
+            </w:r>
+          </w:p>
+        </w:tc>
+        <w:tc>
+          <w:tcPr>
+            <w:tcBorders/>
+            <w:tcW w:w="5405" w:type="dxa"/>
+            <w:vAlign w:val="center"/>
+          </w:tcPr>
+          <w:p>
+            <w:pPr>
+              <w:spacing w:after="0" w:before="0" w:line="240" w:lineRule="auto"/>
+              <w:ind/>
+              <w:jc w:val="left"/>
+              <w:rPr>
+                <w:sz w:val="28"/>
+                <w:szCs w:val="28"/>
+              </w:rPr>
+            </w:pPr>
+            <w:r>
+              <w:rPr>
+                <w:rFonts w:ascii="Times New Roman" w:hAnsi="Times New Roman"/>
+                <w:color w:val="000000"/>
+                <w:sz w:val="28"/>
+                <w:szCs w:val="28"/>
+              </w:rPr>
+              <w:t xml:space="preserve">feature/SGT-15-lab5</w:t>
+            </w:r>
+            <w:r>
+              <w:rPr>
+                <w:sz w:val="28"/>
+                <w:szCs w:val="28"/>
+              </w:rPr>
+            </w:r>
+          </w:p>
+        </w:tc>
+      </w:tr>
+      <w:tr>
+        <w:trPr>
+          <w:cantSplit/>
+        </w:trPr>
+        <w:tc>
+          <w:tcPr>
+            <w:tcBorders/>
+            <w:tcW w:w="1450" w:type="dxa"/>
+            <w:vAlign w:val="center"/>
+          </w:tcPr>
+          <w:p>
+            <w:pPr>
+              <w:spacing w:after="0" w:before="0" w:line="240" w:lineRule="auto"/>
+              <w:ind/>
+              <w:jc w:val="left"/>
+              <w:rPr>
+                <w:sz w:val="28"/>
+                <w:szCs w:val="28"/>
+              </w:rPr>
+            </w:pPr>
+            <w:r>
+              <w:rPr>
+                <w:rFonts w:ascii="Times New Roman" w:hAnsi="Times New Roman"/>
+                <w:color w:val="000000"/>
+                <w:sz w:val="28"/>
+                <w:szCs w:val="28"/>
+              </w:rPr>
+              <w:t xml:space="preserve">bugfix/</w:t>
+            </w:r>
+            <w:r>
+              <w:rPr>
+                <w:sz w:val="28"/>
+                <w:szCs w:val="28"/>
+              </w:rPr>
+            </w:r>
+          </w:p>
+        </w:tc>
+        <w:tc>
+          <w:tcPr>
+            <w:tcBorders/>
+            <w:tcW w:w="2500" w:type="dxa"/>
+            <w:vAlign w:val="center"/>
+          </w:tcPr>
+          <w:p>
+            <w:pPr>
+              <w:spacing w:after="0" w:before="0" w:line="240" w:lineRule="auto"/>
+              <w:ind/>
+              <w:jc w:val="center"/>
+              <w:rPr>
+                <w:sz w:val="28"/>
+                <w:szCs w:val="28"/>
+              </w:rPr>
+            </w:pPr>
+            <w:r>
+              <w:rPr>
+                <w:rFonts w:ascii="Times New Roman" w:hAnsi="Times New Roman"/>
+                <w:color w:val="000000"/>
+                <w:sz w:val="28"/>
+                <w:szCs w:val="28"/>
+              </w:rPr>
+              <w:t xml:space="preserve">Исправление</w:t>
+            </w:r>
+            <w:r>
+              <w:rPr>
+                <w:sz w:val="28"/>
+                <w:szCs w:val="28"/>
+              </w:rPr>
+            </w:r>
+          </w:p>
+        </w:tc>
+        <w:tc>
+          <w:tcPr>
+            <w:tcBorders/>
+            <w:tcW w:w="5405" w:type="dxa"/>
+            <w:vAlign w:val="center"/>
+          </w:tcPr>
+          <w:p>
+            <w:pPr>
+              <w:spacing w:after="0" w:before="0" w:line="240" w:lineRule="auto"/>
+              <w:ind/>
+              <w:jc w:val="left"/>
+              <w:rPr>
+                <w:sz w:val="28"/>
+                <w:szCs w:val="28"/>
+              </w:rPr>
+            </w:pPr>
+            <w:r>
+              <w:rPr>
+                <w:rFonts w:ascii="Times New Roman" w:hAnsi="Times New Roman"/>
+                <w:color w:val="000000"/>
+                <w:sz w:val="28"/>
+                <w:szCs w:val="28"/>
+              </w:rPr>
+              <w:t xml:space="preserve">bugfix/SGT-15-fresh-tests</w:t>
+            </w:r>
+            <w:r>
+              <w:rPr>
+                <w:sz w:val="28"/>
+                <w:szCs w:val="28"/>
+              </w:rPr>
+            </w:r>
+          </w:p>
+        </w:tc>
+      </w:tr>
+      <w:tr>
+        <w:trPr>
+          <w:cantSplit/>
+        </w:trPr>
+        <w:tc>
+          <w:tcPr>
+            <w:tcBorders/>
+            <w:tcW w:w="1450" w:type="dxa"/>
+            <w:vAlign w:val="center"/>
+          </w:tcPr>
+          <w:p>
+            <w:pPr>
+              <w:spacing w:after="0" w:before="0" w:line="240" w:lineRule="auto"/>
+              <w:ind/>
+              <w:jc w:val="left"/>
+              <w:rPr>
+                <w:sz w:val="28"/>
+                <w:szCs w:val="28"/>
+              </w:rPr>
+            </w:pPr>
+            <w:r>
+              <w:rPr>
+                <w:rFonts w:ascii="Times New Roman" w:hAnsi="Times New Roman"/>
+                <w:color w:val="000000"/>
+                <w:sz w:val="28"/>
+                <w:szCs w:val="28"/>
+              </w:rPr>
+              <w:t xml:space="preserve">docs/</w:t>
+            </w:r>
+            <w:r>
+              <w:rPr>
+                <w:sz w:val="28"/>
+                <w:szCs w:val="28"/>
+              </w:rPr>
+            </w:r>
+          </w:p>
+        </w:tc>
+        <w:tc>
+          <w:tcPr>
+            <w:tcBorders/>
+            <w:tcW w:w="2500" w:type="dxa"/>
+            <w:vAlign w:val="center"/>
+          </w:tcPr>
+          <w:p>
+            <w:pPr>
+              <w:spacing w:after="0" w:before="0" w:line="240" w:lineRule="auto"/>
+              <w:ind/>
+              <w:jc w:val="center"/>
+              <w:rPr>
+                <w:sz w:val="28"/>
+                <w:szCs w:val="28"/>
+              </w:rPr>
+            </w:pPr>
+            <w:r>
+              <w:rPr>
+                <w:rFonts w:ascii="Times New Roman" w:hAnsi="Times New Roman"/>
+                <w:color w:val="000000"/>
+                <w:sz w:val="28"/>
+                <w:szCs w:val="28"/>
+              </w:rPr>
+              <w:t xml:space="preserve">Отчёт и документация</w:t>
+            </w:r>
+            <w:r>
+              <w:rPr>
+                <w:sz w:val="28"/>
+                <w:szCs w:val="28"/>
+              </w:rPr>
+            </w:r>
+          </w:p>
+        </w:tc>
+        <w:tc>
+          <w:tcPr>
+            <w:tcBorders/>
+            <w:tcW w:w="5405" w:type="dxa"/>
+            <w:vAlign w:val="center"/>
+          </w:tcPr>
+          <w:p>
+            <w:pPr>
+              <w:spacing w:after="0" w:before="0" w:line="240" w:lineRule="auto"/>
+              <w:ind/>
+              <w:jc w:val="left"/>
+              <w:rPr>
+                <w:sz w:val="28"/>
+                <w:szCs w:val="28"/>
+              </w:rPr>
+            </w:pPr>
+            <w:r>
+              <w:rPr>
+                <w:rFonts w:ascii="Times New Roman" w:hAnsi="Times New Roman"/>
+                <w:color w:val="000000"/>
+                <w:sz w:val="28"/>
+                <w:szCs w:val="28"/>
+              </w:rPr>
+              <w:t xml:space="preserve">docs/SGT-15-report</w:t>
+            </w:r>
+            <w:r>
+              <w:rPr>
+                <w:sz w:val="28"/>
+                <w:szCs w:val="28"/>
+              </w:rPr>
+            </w:r>
+          </w:p>
+        </w:tc>
+      </w:tr>
+      <w:tr>
+        <w:trPr>
+          <w:cantSplit/>
+        </w:trPr>
+        <w:tc>
+          <w:tcPr>
+            <w:tcBorders/>
+            <w:tcW w:w="1450" w:type="dxa"/>
+            <w:vAlign w:val="center"/>
+          </w:tcPr>
+          <w:p>
+            <w:pPr>
+              <w:spacing w:after="0" w:before="0" w:line="240" w:lineRule="auto"/>
+              <w:ind/>
+              <w:jc w:val="left"/>
+              <w:rPr>
+                <w:sz w:val="28"/>
+                <w:szCs w:val="28"/>
+              </w:rPr>
+            </w:pPr>
+            <w:r>
+              <w:rPr>
+                <w:rFonts w:ascii="Times New Roman" w:hAnsi="Times New Roman"/>
+                <w:color w:val="000000"/>
+                <w:sz w:val="28"/>
+                <w:szCs w:val="28"/>
+              </w:rPr>
+              <w:t xml:space="preserve">chore/</w:t>
+            </w:r>
+            <w:r>
+              <w:rPr>
+                <w:sz w:val="28"/>
+                <w:szCs w:val="28"/>
+              </w:rPr>
+            </w:r>
+          </w:p>
+        </w:tc>
+        <w:tc>
+          <w:tcPr>
+            <w:tcBorders/>
+            <w:tcW w:w="2500" w:type="dxa"/>
+            <w:vAlign w:val="center"/>
+          </w:tcPr>
+          <w:p>
+            <w:pPr>
+              <w:spacing w:after="0" w:before="0" w:line="240" w:lineRule="auto"/>
+              <w:ind/>
+              <w:jc w:val="center"/>
+              <w:rPr>
+                <w:sz w:val="28"/>
+                <w:szCs w:val="28"/>
+              </w:rPr>
+            </w:pPr>
+            <w:r>
+              <w:rPr>
+                <w:rFonts w:ascii="Times New Roman" w:hAnsi="Times New Roman"/>
+                <w:color w:val="000000"/>
+                <w:sz w:val="28"/>
+                <w:szCs w:val="28"/>
+              </w:rPr>
+              <w:t xml:space="preserve">Инфраструктура и CI</w:t>
+            </w:r>
+            <w:r>
+              <w:rPr>
+                <w:sz w:val="28"/>
+                <w:szCs w:val="28"/>
+              </w:rPr>
+            </w:r>
+          </w:p>
+        </w:tc>
+        <w:tc>
+          <w:tcPr>
+            <w:tcBorders/>
+            <w:tcW w:w="5405" w:type="dxa"/>
+            <w:vAlign w:val="center"/>
+          </w:tcPr>
+          <w:p>
+            <w:pPr>
+              <w:spacing w:after="0" w:before="0" w:line="240" w:lineRule="auto"/>
+              <w:ind/>
+              <w:jc w:val="left"/>
+              <w:rPr>
+                <w:sz w:val="28"/>
+                <w:szCs w:val="28"/>
+              </w:rPr>
+            </w:pPr>
+            <w:r>
+              <w:rPr>
+                <w:rFonts w:ascii="Times New Roman" w:hAnsi="Times New Roman"/>
+                <w:color w:val="000000"/>
+                <w:sz w:val="28"/>
+                <w:szCs w:val="28"/>
+              </w:rPr>
+              <w:t xml:space="preserve">chore/SGT-15-workflow-standards</w:t>
+            </w:r>
+            <w:r>
+              <w:rPr>
+                <w:sz w:val="28"/>
+                <w:szCs w:val="28"/>
+              </w:rPr>
+            </w:r>
+          </w:p>
+        </w:tc>
+      </w:tr>
+    </w:tbl>
     <w:p>
       <w:pPr>
-        <w:pBdr/>
         <w:spacing w:after="120" w:line="276" w:lineRule="auto"/>
         <w:ind/>
         <w:jc w:val="both"/>
@@ -3195,14 +3817,220 @@
           <w:sz w:val="28"/>
           <w:szCs w:val="28"/>
         </w:rPr>
-        <w:t xml:space="preserve">PR № 1 объединён методом squash после успешного CI. Коммит слияния: 6dc403c242c0. Сообщение squash-коммита соответствует Conventional Commits. Первый служебный коммит создал main в пустом репозитории; все последующие изменения проходят через PR.</w:t>
+      </w:r>
+      <w:r>
+        <w:rPr>
+          <w:sz w:val="28"/>
+          <w:szCs w:val="28"/>
+        </w:rPr>
       </w:r>
     </w:p>
     <w:p>
       <w:pPr>
+        <w:spacing w:after="120" w:line="276" w:lineRule="auto"/>
+        <w:ind/>
+        <w:jc w:val="both"/>
+        <w:rPr>
+          <w:sz w:val="28"/>
+          <w:szCs w:val="28"/>
+        </w:rPr>
+      </w:pPr>
+      <w:r>
+        <w:rPr>
+          <w:rFonts w:ascii="Times New Roman" w:hAnsi="Times New Roman"/>
+          <w:b w:val="0"/>
+          <w:color w:val="000000"/>
+          <w:sz w:val="28"/>
+          <w:szCs w:val="28"/>
+        </w:rPr>
+        <w:t xml:space="preserve">scripts/check-branch.sh разрешает только main и указанные форматы. Hook pre-pus</w:t>
+      </w:r>
+      <w:r>
+        <w:rPr>
+          <w:rFonts w:ascii="Times New Roman" w:hAnsi="Times New Roman"/>
+          <w:b w:val="0"/>
+          <w:color w:val="000000"/>
+          <w:sz w:val="28"/>
+          <w:szCs w:val="28"/>
+        </w:rPr>
+        <w:t xml:space="preserve">h проверяет ветку назначения, поэтому отправка HEAD под неверным именем также отклоняется. Теги и удаление веток не блокируются. В CI шаг Branch naming проверяет исходную ветку PR через github.head_ref, на push — github.ref_name; на тегах шаг пропускается.</w:t>
+      </w:r>
+      <w:r>
+        <w:rPr>
+          <w:sz w:val="28"/>
+          <w:szCs w:val="28"/>
+        </w:rPr>
+      </w:r>
+    </w:p>
+    <w:p>
+      <w:pPr>
+        <w:spacing w:after="120" w:line="276" w:lineRule="auto"/>
+        <w:ind/>
+        <w:jc w:val="both"/>
+        <w:rPr>
+          <w:sz w:val="28"/>
+          <w:szCs w:val="28"/>
+        </w:rPr>
+      </w:pPr>
+      <w:r>
+        <w:rPr>
+          <w:rFonts w:ascii="Times New Roman" w:hAnsi="Times New Roman"/>
+          <w:b w:val="0"/>
+          <w:color w:val="000000"/>
+          <w:sz w:val="28"/>
+          <w:szCs w:val="28"/>
+        </w:rPr>
+        <w:t xml:space="preserve">Приме</w:t>
+      </w:r>
+      <w:r>
+        <w:rPr>
+          <w:rFonts w:ascii="Times New Roman" w:hAnsi="Times New Roman"/>
+          <w:b w:val="0"/>
+          <w:color w:val="000000"/>
+          <w:sz w:val="28"/>
+          <w:szCs w:val="28"/>
+        </w:rPr>
+        <w:t xml:space="preserve">р проверки: feature/SGT-3-route-catalog принято с кодом 0; feature/routes без ID задачи отклонено с кодом 1. git push --dry-run в branch-policy-rejection также отклонён hook. Автотесты проверяют префиксы, ID, описания, несколько ref, теги и удаление веток.</w:t>
+      </w:r>
+      <w:r>
+        <w:rPr>
+          <w:sz w:val="28"/>
+          <w:szCs w:val="28"/>
+        </w:rPr>
+      </w:r>
+    </w:p>
+    <w:p>
+      <w:pPr>
+        <w:spacing w:after="120" w:line="276" w:lineRule="auto"/>
+        <w:ind/>
+        <w:jc w:val="both"/>
+        <w:rPr>
+          <w:sz w:val="28"/>
+          <w:szCs w:val="28"/>
+        </w:rPr>
+      </w:pPr>
+      <w:r>
+        <w:rPr>
+          <w:rFonts w:ascii="Times New Roman" w:hAnsi="Times New Roman"/>
+          <w:b w:val="0"/>
+          <w:color w:val="000000"/>
+          <w:sz w:val="28"/>
+          <w:szCs w:val="28"/>
+        </w:rPr>
+        <w:t xml:space="preserve">На GitHub временная branch-policy-reject</w:t>
+      </w:r>
+      <w:r>
+        <w:rPr>
+          <w:rFonts w:ascii="Times New Roman" w:hAnsi="Times New Roman"/>
+          <w:b w:val="0"/>
+          <w:color w:val="000000"/>
+          <w:sz w:val="28"/>
+          <w:szCs w:val="28"/>
+        </w:rPr>
+        <w:t xml:space="preserve">ion создана в обход локального hook для отрицательной проверки. Branch naming завершился ошибкой; сборка не запускалась. Ветка удалена, результат CI сохранён в branch-policy-ci.json, локальный протокол — в workflow-standards.txt в docs/measurements/SGT-15.</w:t>
+      </w:r>
+      <w:r>
+        <w:rPr>
+          <w:sz w:val="28"/>
+          <w:szCs w:val="28"/>
+        </w:rPr>
+      </w:r>
+    </w:p>
+    <w:p>
+      <w:pPr>
+        <w:spacing w:after="120" w:line="276" w:lineRule="auto"/>
+        <w:ind/>
+        <w:jc w:val="both"/>
+        <w:rPr>
+          <w:rFonts w:ascii="Times New Roman" w:hAnsi="Times New Roman"/>
+          <w:b w:val="0"/>
+          <w:bCs w:val="0"/>
+          <w:color w:val="000000"/>
+          <w:sz w:val="28"/>
+          <w:szCs w:val="28"/>
+          <w:highlight w:val="none"/>
+        </w:rPr>
+      </w:pPr>
+      <w:r>
+        <w:rPr>
+          <w:rFonts w:ascii="Times New Roman" w:hAnsi="Times New Roman"/>
+          <w:b w:val="0"/>
+          <w:color w:val="000000"/>
+          <w:sz w:val="28"/>
+          <w:szCs w:val="28"/>
+        </w:rPr>
+      </w:r>
+      <w:hyperlink r:id="rId9" w:tooltip="https://github.com/vasmaae/software-engineering/actions/runs/39689941691" w:history="1">
+        <w:r>
+          <w:rPr>
+            <w:rStyle w:val="874"/>
+            <w:rFonts w:ascii="Times New Roman" w:hAnsi="Times New Roman"/>
+            <w:b w:val="0"/>
+            <w:sz w:val="28"/>
+            <w:szCs w:val="28"/>
+          </w:rPr>
+          <w:t xml:space="preserve">https://github.com/vasmaae/software-engineering/actions/runs/39689941691</w:t>
+        </w:r>
+        <w:r>
+          <w:rPr>
+            <w:rStyle w:val="874"/>
+            <w:sz w:val="28"/>
+            <w:szCs w:val="28"/>
+          </w:rPr>
+        </w:r>
+      </w:hyperlink>
+      <w:r>
+        <w:rPr>
+          <w:sz w:val="28"/>
+          <w:szCs w:val="28"/>
+        </w:rPr>
+      </w:r>
+      <w:r>
+        <w:rPr>
+          <w:rFonts w:ascii="Times New Roman" w:hAnsi="Times New Roman"/>
+          <w:b w:val="0"/>
+          <w:color w:val="000000"/>
+          <w:sz w:val="28"/>
+          <w:szCs w:val="28"/>
+          <w:highlight w:val="none"/>
+        </w:rPr>
+      </w:r>
+      <w:r>
+        <w:rPr>
+          <w:rFonts w:ascii="Times New Roman" w:hAnsi="Times New Roman"/>
+          <w:b w:val="0"/>
+          <w:color w:val="000000"/>
+          <w:sz w:val="28"/>
+          <w:szCs w:val="28"/>
+          <w:highlight w:val="none"/>
+        </w:rPr>
+      </w:r>
+      <w:r>
+        <w:rPr>
+          <w:rFonts w:ascii="Times New Roman" w:hAnsi="Times New Roman"/>
+          <w:b w:val="0"/>
+          <w:color w:val="000000"/>
+          <w:sz w:val="28"/>
+          <w:szCs w:val="28"/>
+          <w:highlight w:val="none"/>
+        </w:rPr>
+      </w:r>
+      <w:r>
+        <w:rPr>
+          <w:rFonts w:ascii="Times New Roman" w:hAnsi="Times New Roman"/>
+          <w:b w:val="0"/>
+          <w:bCs w:val="0"/>
+          <w:color w:val="000000"/>
+          <w:sz w:val="28"/>
+          <w:szCs w:val="28"/>
+          <w:highlight w:val="none"/>
+        </w:rPr>
+      </w:r>
+    </w:p>
+    <w:p>
+      <w:pPr>
         <w:keepNext w:val="true"/>
-        <w:pageBreakBefore w:val="false"/>
-        <w:pBdr/>
+        <w:pageBreakBefore w:val="true"/>
         <w:spacing w:after="120" w:before="180" w:line="276" w:lineRule="auto"/>
         <w:ind/>
         <w:jc w:val="center"/>
@@ -3219,12 +4047,17 @@
           <w:sz w:val="28"/>
           <w:szCs w:val="28"/>
         </w:rPr>
-        <w:t xml:space="preserve">Релиз приложения</w:t>
+        <w:t xml:space="preserve">Pull request и слияние</w:t>
+      </w:r>
+      <w:r>
+        <w:rPr>
+          <w:sz w:val="28"/>
+          <w:szCs w:val="28"/>
+        </w:rPr>
       </w:r>
     </w:p>
     <w:p>
       <w:pPr>
-        <w:pBdr/>
         <w:spacing w:after="120" w:line="276" w:lineRule="auto"/>
         <w:ind/>
         <w:jc w:val="both"/>
@@ -3241,20 +4074,8 @@
           <w:sz w:val="28"/>
           <w:szCs w:val="28"/>
         </w:rPr>
-        <w:t xml:space="preserve">На проверенную версию main поставлен аннотированный тег v0.1.1. Push тега повторно запустил статический анализ, тесты, сбор метрик и сборку. Только после успешного job quality автоматически создан предварительный GitHub Release с архивом sgt-linux-amd64.tar.gz.</w:t>
+        <w:t xml:space="preserve">Один PR решает одну задачу и направляется в</w:t>
       </w:r>
-    </w:p>
-    <w:p>
-      <w:pPr>
-        <w:pBdr/>
-        <w:spacing w:after="120" w:line="276" w:lineRule="auto"/>
-        <w:ind/>
-        <w:jc w:val="both"/>
-        <w:rPr>
-          <w:sz w:val="28"/>
-          <w:szCs w:val="28"/>
-        </w:rPr>
-      </w:pPr>
       <w:r>
         <w:rPr>
           <w:rFonts w:ascii="Times New Roman" w:hAnsi="Times New Roman"/>
@@ -3263,14 +4084,130 @@
           <w:sz w:val="28"/>
           <w:szCs w:val="28"/>
         </w:rPr>
-        <w:t xml:space="preserve">Архив содержит Linux-бинарник API для amd64, собранную статику React, SQL и документацию. Исходники автоматически доступны в GitHub Release. Версия v0.1.1 демонстрирует инфраструктуру ЛР5 и не означает завершение итогового v1.0, запланированного на 08.12.2026.</w:t>
+        <w:t xml:space="preserve"> main. Заголовок соответствует Conventional Commits и будущему squash-коммиту. Пример: «ci(workflow): enforce branch and PR standards (SGT-15)». CI проверяет его commitlint; событие edited повторно запускает проверку после изменения заголовка или описания.</w:t>
+      </w:r>
+      <w:r>
+        <w:rPr>
+          <w:sz w:val="28"/>
+          <w:szCs w:val="28"/>
+        </w:rPr>
       </w:r>
     </w:p>
     <w:p>
       <w:pPr>
+        <w:spacing w:after="120" w:line="276" w:lineRule="auto"/>
+        <w:ind/>
+        <w:jc w:val="both"/>
+        <w:rPr>
+          <w:sz w:val="28"/>
+          <w:szCs w:val="28"/>
+        </w:rPr>
+      </w:pPr>
+      <w:r>
+        <w:rPr>
+          <w:rFonts w:ascii="Times New Roman" w:hAnsi="Times New Roman"/>
+          <w:b w:val="0"/>
+          <w:color w:val="000000"/>
+          <w:sz w:val="28"/>
+          <w:szCs w:val="28"/>
+        </w:rPr>
+        <w:t xml:space="preserve">Шаблон .github/pull_request_template.md задаёт разделы «Чт</w:t>
+      </w:r>
+      <w:r>
+        <w:rPr>
+          <w:rFonts w:ascii="Times New Roman" w:hAnsi="Times New Roman"/>
+          <w:b w:val="0"/>
+          <w:color w:val="000000"/>
+          <w:sz w:val="28"/>
+          <w:szCs w:val="28"/>
+        </w:rPr>
+        <w:t xml:space="preserve">о изменено», «Проверка», «Связанная задача». Указываются результат, команды и результаты проверок, ссылка на YouTrack; для интерфейса — снимок экрана. Полнота описания проверяется вручную, формат заголовка — автоматически. Пример применения правил: PR № 5.</w:t>
+      </w:r>
+      <w:r>
+        <w:rPr>
+          <w:sz w:val="28"/>
+          <w:szCs w:val="28"/>
+        </w:rPr>
+      </w:r>
+    </w:p>
+    <w:p>
+      <w:pPr>
+        <w:spacing w:after="120" w:line="276" w:lineRule="auto"/>
+        <w:ind/>
+        <w:jc w:val="both"/>
+        <w:rPr>
+          <w:sz w:val="28"/>
+          <w:szCs w:val="28"/>
+        </w:rPr>
+      </w:pPr>
+      <w:r>
+        <w:rPr>
+          <w:rFonts w:ascii="Times New Roman" w:hAnsi="Times New Roman"/>
+          <w:b w:val="0"/>
+          <w:color w:val="000000"/>
+          <w:sz w:val="28"/>
+          <w:szCs w:val="28"/>
+        </w:rPr>
+        <w:t xml:space="preserve">Защита main требует PR и актуальный успешный quality от GitHub Actions. Прави</w:t>
+      </w:r>
+      <w:r>
+        <w:rPr>
+          <w:rFonts w:ascii="Times New Roman" w:hAnsi="Times New Roman"/>
+          <w:b w:val="0"/>
+          <w:color w:val="000000"/>
+          <w:sz w:val="28"/>
+          <w:szCs w:val="28"/>
+        </w:rPr>
+        <w:t xml:space="preserve">ло действует для администратора; прямой push, force push и удаление main запрещены. Обязательны линейная история и завершение обсуждений. Одобрение другого участника не включено: проект выполняет один студент. Самопроверка не выдаётся за независимое ревью.</w:t>
+      </w:r>
+      <w:r>
+        <w:rPr>
+          <w:sz w:val="28"/>
+          <w:szCs w:val="28"/>
+        </w:rPr>
+      </w:r>
+    </w:p>
+    <w:p>
+      <w:pPr>
+        <w:spacing w:after="120" w:line="276" w:lineRule="auto"/>
+        <w:ind/>
+        <w:jc w:val="both"/>
+        <w:rPr>
+          <w:sz w:val="28"/>
+          <w:szCs w:val="28"/>
+        </w:rPr>
+      </w:pPr>
+      <w:r>
+        <w:rPr>
+          <w:rFonts w:ascii="Times New Roman" w:hAnsi="Times New Roman"/>
+          <w:b w:val="0"/>
+          <w:color w:val="000000"/>
+          <w:sz w:val="28"/>
+          <w:szCs w:val="28"/>
+        </w:rPr>
+        <w:t xml:space="preserve">Процесс: ветка от main</w:t>
+      </w:r>
+      <w:r>
+        <w:rPr>
+          <w:rFonts w:ascii="Times New Roman" w:hAnsi="Times New Roman"/>
+          <w:b w:val="0"/>
+          <w:color w:val="000000"/>
+          <w:sz w:val="28"/>
+          <w:szCs w:val="28"/>
+        </w:rPr>
+        <w:t xml:space="preserve">, атомарные коммиты, push, PR, проверка изменений и quality, squash merge. PR № 1 слит после успешного CI; коммит 6dc403c242c0. Разрешён только squash merge. Первый служебный коммит создал main в пустом репозитории; последующие изменения проходят через PR.</w:t>
+      </w:r>
+      <w:r>
+        <w:rPr>
+          <w:sz w:val="28"/>
+          <w:szCs w:val="28"/>
+        </w:rPr>
+      </w:r>
+    </w:p>
+    <w:p>
+      <w:pPr>
         <w:keepNext w:val="true"/>
         <w:pageBreakBefore w:val="false"/>
-        <w:pBdr/>
         <w:spacing w:after="120" w:before="180" w:line="276" w:lineRule="auto"/>
         <w:ind/>
         <w:jc w:val="center"/>
@@ -3287,12 +4224,17 @@
           <w:sz w:val="28"/>
           <w:szCs w:val="28"/>
         </w:rPr>
-        <w:t xml:space="preserve">Доказательства выполнения</w:t>
+        <w:t xml:space="preserve">Релиз</w:t>
+      </w:r>
+      <w:r>
+        <w:rPr>
+          <w:sz w:val="28"/>
+          <w:szCs w:val="28"/>
+        </w:rPr>
       </w:r>
     </w:p>
     <w:p>
       <w:pPr>
-        <w:pBdr/>
         <w:spacing w:after="120" w:line="276" w:lineRule="auto"/>
         <w:ind/>
         <w:jc w:val="both"/>
@@ -3309,20 +4251,8 @@
           <w:sz w:val="28"/>
           <w:szCs w:val="28"/>
         </w:rPr>
-        <w:t xml:space="preserve">Репозиторий: https://github.com/vasmaae/software-engineering</w:t>
+        <w:t xml:space="preserve">Приняты аннотированные теги vMAJOR.MINOR.PATCH по SemVer. PATCH — и</w:t>
       </w:r>
-    </w:p>
-    <w:p>
-      <w:pPr>
-        <w:pBdr/>
-        <w:spacing w:after="120" w:line="276" w:lineRule="auto"/>
-        <w:ind/>
-        <w:jc w:val="both"/>
-        <w:rPr>
-          <w:sz w:val="28"/>
-          <w:szCs w:val="28"/>
-        </w:rPr>
-      </w:pPr>
       <w:r>
         <w:rPr>
           <w:rFonts w:ascii="Times New Roman" w:hAnsi="Times New Roman"/>
@@ -3331,12 +4261,17 @@
           <w:sz w:val="28"/>
           <w:szCs w:val="28"/>
         </w:rPr>
-        <w:t xml:space="preserve">Слияние: https://github.com/vasmaae/software-engineering/pull/1</w:t>
+        <w:t xml:space="preserve">справление, MINOR — совместимая функция, MAJOR — несовместимое изменение API; серия 0.x обозначает начальную разработку. Опубликованные теги не передвигаются. Выполнен выпуск: git tag -a v0.1.1 -m "SGT lab 5 infrastructure preview"; git push origin v0.1.1.</w:t>
+      </w:r>
+      <w:r>
+        <w:rPr>
+          <w:sz w:val="28"/>
+          <w:szCs w:val="28"/>
+        </w:rPr>
       </w:r>
     </w:p>
     <w:p>
       <w:pPr>
-        <w:pBdr/>
         <w:spacing w:after="120" w:line="276" w:lineRule="auto"/>
         <w:ind/>
         <w:jc w:val="both"/>
@@ -3353,20 +4288,8 @@
           <w:sz w:val="28"/>
           <w:szCs w:val="28"/>
         </w:rPr>
-        <w:t xml:space="preserve">Релиз: https://github.com/vasmaae/software-engineering/releases/tag/v0.1.1</w:t>
+        <w:t xml:space="preserve">Push тега v0.1.1 повторил анализ, тесты,</w:t>
       </w:r>
-    </w:p>
-    <w:p>
-      <w:pPr>
-        <w:pBdr/>
-        <w:spacing w:after="120" w:line="276" w:lineRule="auto"/>
-        <w:ind/>
-        <w:jc w:val="both"/>
-        <w:rPr>
-          <w:sz w:val="28"/>
-          <w:szCs w:val="28"/>
-        </w:rPr>
-      </w:pPr>
       <w:r>
         <w:rPr>
           <w:rFonts w:ascii="Times New Roman" w:hAnsi="Times New Roman"/>
@@ -3375,14 +4298,308 @@
           <w:sz w:val="28"/>
           <w:szCs w:val="28"/>
         </w:rPr>
-        <w:t xml:space="preserve">Команды выпуска: git tag -a v0.1.1 -m "SGT lab 5 infrastructure preview"; git push origin v0.1.1. Опубликованные теги не передвигаются; следующая версия получает новый номер.</w:t>
+        <w:t xml:space="preserve"> метрики и сборку. После успешного quality создан предварительный GitHub Release с sgt-linux-amd64.tar.gz: Linux API для amd64, React-статика, SQL и документация. Ручной замер метрик релиз не публикует. Учебный v0.1.1 не означает готовность итогового v1.0.</w:t>
+      </w:r>
+      <w:r>
+        <w:rPr>
+          <w:sz w:val="28"/>
+          <w:szCs w:val="28"/>
+        </w:rPr>
       </w:r>
     </w:p>
     <w:p>
       <w:pPr>
+        <w:spacing w:after="120" w:line="276" w:lineRule="auto"/>
+        <w:ind/>
+        <w:jc w:val="both"/>
+        <w:rPr>
+          <w:rFonts w:ascii="Times New Roman" w:hAnsi="Times New Roman"/>
+          <w:b w:val="0"/>
+          <w:bCs w:val="0"/>
+          <w:color w:val="000000"/>
+          <w:sz w:val="28"/>
+          <w:szCs w:val="28"/>
+          <w:highlight w:val="none"/>
+        </w:rPr>
+      </w:pPr>
+      <w:r>
+        <w:rPr>
+          <w:rFonts w:ascii="Times New Roman" w:hAnsi="Times New Roman"/>
+          <w:b w:val="0"/>
+          <w:color w:val="000000"/>
+          <w:sz w:val="28"/>
+          <w:szCs w:val="28"/>
+        </w:rPr>
+        <w:t xml:space="preserve">Слияние: </w:t>
+      </w:r>
+      <w:hyperlink r:id="rId10" w:tooltip="https://github.com/vasmaae/software-engineering/pull/1" w:history="1">
+        <w:r>
+          <w:rPr>
+            <w:rStyle w:val="874"/>
+            <w:rFonts w:ascii="Times New Roman" w:hAnsi="Times New Roman"/>
+            <w:b w:val="0"/>
+            <w:sz w:val="28"/>
+            <w:szCs w:val="28"/>
+          </w:rPr>
+          <w:t xml:space="preserve">https://github.com/vasmaae/software-engineering/pull/1</w:t>
+        </w:r>
+        <w:r>
+          <w:rPr>
+            <w:rStyle w:val="874"/>
+            <w:sz w:val="28"/>
+            <w:szCs w:val="28"/>
+          </w:rPr>
+        </w:r>
+      </w:hyperlink>
+      <w:r>
+        <w:rPr>
+          <w:sz w:val="28"/>
+          <w:szCs w:val="28"/>
+        </w:rPr>
+      </w:r>
+      <w:r>
+        <w:rPr>
+          <w:rFonts w:ascii="Times New Roman" w:hAnsi="Times New Roman"/>
+          <w:b w:val="0"/>
+          <w:color w:val="000000"/>
+          <w:sz w:val="28"/>
+          <w:szCs w:val="28"/>
+          <w:highlight w:val="none"/>
+        </w:rPr>
+      </w:r>
+      <w:r>
+        <w:rPr>
+          <w:rFonts w:ascii="Times New Roman" w:hAnsi="Times New Roman"/>
+          <w:b w:val="0"/>
+          <w:color w:val="000000"/>
+          <w:sz w:val="28"/>
+          <w:szCs w:val="28"/>
+          <w:highlight w:val="none"/>
+        </w:rPr>
+      </w:r>
+      <w:r>
+        <w:rPr>
+          <w:rFonts w:ascii="Times New Roman" w:hAnsi="Times New Roman"/>
+          <w:b w:val="0"/>
+          <w:color w:val="000000"/>
+          <w:sz w:val="28"/>
+          <w:szCs w:val="28"/>
+          <w:highlight w:val="none"/>
+        </w:rPr>
+      </w:r>
+      <w:r>
+        <w:rPr>
+          <w:rFonts w:ascii="Times New Roman" w:hAnsi="Times New Roman"/>
+          <w:b w:val="0"/>
+          <w:bCs w:val="0"/>
+          <w:color w:val="000000"/>
+          <w:sz w:val="28"/>
+          <w:szCs w:val="28"/>
+          <w:highlight w:val="none"/>
+        </w:rPr>
+      </w:r>
+    </w:p>
+    <w:p>
+      <w:pPr>
+        <w:spacing w:after="120" w:line="276" w:lineRule="auto"/>
+        <w:ind/>
+        <w:jc w:val="both"/>
+        <w:rPr>
+          <w:rFonts w:ascii="Times New Roman" w:hAnsi="Times New Roman"/>
+          <w:b w:val="0"/>
+          <w:bCs w:val="0"/>
+          <w:color w:val="000000"/>
+          <w:sz w:val="28"/>
+          <w:szCs w:val="28"/>
+          <w:highlight w:val="none"/>
+        </w:rPr>
+      </w:pPr>
+      <w:r>
+        <w:rPr>
+          <w:rFonts w:ascii="Times New Roman" w:hAnsi="Times New Roman"/>
+          <w:b w:val="0"/>
+          <w:color w:val="000000"/>
+          <w:sz w:val="28"/>
+          <w:szCs w:val="28"/>
+        </w:rPr>
+        <w:t xml:space="preserve">Стандарты: </w:t>
+      </w:r>
+      <w:hyperlink r:id="rId11" w:tooltip="https://github.com/vasmaae/software-engineering/pull/5" w:history="1">
+        <w:r>
+          <w:rPr>
+            <w:rStyle w:val="874"/>
+            <w:rFonts w:ascii="Times New Roman" w:hAnsi="Times New Roman"/>
+            <w:b w:val="0"/>
+            <w:sz w:val="28"/>
+            <w:szCs w:val="28"/>
+          </w:rPr>
+          <w:t xml:space="preserve">https://github.com/vasmaae/software-engineering/pull/5</w:t>
+        </w:r>
+        <w:r>
+          <w:rPr>
+            <w:rStyle w:val="874"/>
+            <w:rFonts w:ascii="Times New Roman" w:hAnsi="Times New Roman"/>
+            <w:b w:val="0"/>
+            <w:bCs w:val="0"/>
+            <w:sz w:val="28"/>
+            <w:szCs w:val="28"/>
+          </w:rPr>
+        </w:r>
+      </w:hyperlink>
+      <w:r>
+        <w:rPr>
+          <w:rFonts w:ascii="Times New Roman" w:hAnsi="Times New Roman"/>
+          <w:b w:val="0"/>
+          <w:bCs w:val="0"/>
+          <w:color w:val="000000"/>
+          <w:sz w:val="28"/>
+          <w:szCs w:val="28"/>
+        </w:rPr>
+      </w:r>
+      <w:r>
+        <w:rPr>
+          <w:rFonts w:ascii="Times New Roman" w:hAnsi="Times New Roman"/>
+          <w:b w:val="0"/>
+          <w:color w:val="000000"/>
+          <w:sz w:val="28"/>
+          <w:szCs w:val="28"/>
+          <w:highlight w:val="none"/>
+        </w:rPr>
+      </w:r>
+      <w:r>
+        <w:rPr>
+          <w:rFonts w:ascii="Times New Roman" w:hAnsi="Times New Roman"/>
+          <w:b w:val="0"/>
+          <w:color w:val="000000"/>
+          <w:sz w:val="28"/>
+          <w:szCs w:val="28"/>
+          <w:highlight w:val="none"/>
+        </w:rPr>
+      </w:r>
+      <w:r>
+        <w:rPr>
+          <w:rFonts w:ascii="Times New Roman" w:hAnsi="Times New Roman"/>
+          <w:b w:val="0"/>
+          <w:color w:val="000000"/>
+          <w:sz w:val="28"/>
+          <w:szCs w:val="28"/>
+          <w:highlight w:val="none"/>
+        </w:rPr>
+      </w:r>
+      <w:r>
+        <w:rPr>
+          <w:rFonts w:ascii="Times New Roman" w:hAnsi="Times New Roman"/>
+          <w:b w:val="0"/>
+          <w:bCs w:val="0"/>
+          <w:color w:val="000000"/>
+          <w:sz w:val="28"/>
+          <w:szCs w:val="28"/>
+          <w:highlight w:val="none"/>
+        </w:rPr>
+      </w:r>
+    </w:p>
+    <w:p>
+      <w:pPr>
+        <w:spacing w:after="120" w:line="276" w:lineRule="auto"/>
+        <w:ind/>
+        <w:jc w:val="both"/>
+        <w:rPr>
+          <w:sz w:val="28"/>
+          <w:szCs w:val="28"/>
+          <w:highlight w:val="none"/>
+        </w:rPr>
+      </w:pPr>
+      <w:r>
+        <w:rPr>
+          <w:rFonts w:ascii="Times New Roman" w:hAnsi="Times New Roman"/>
+          <w:b w:val="0"/>
+          <w:color w:val="000000"/>
+          <w:sz w:val="28"/>
+          <w:szCs w:val="28"/>
+        </w:rPr>
+      </w:r>
+      <w:r>
+        <w:rPr>
+          <w:rFonts w:ascii="Times New Roman" w:hAnsi="Times New Roman"/>
+          <w:b w:val="0"/>
+          <w:color w:val="000000"/>
+          <w:sz w:val="28"/>
+          <w:szCs w:val="28"/>
+        </w:rPr>
+        <w:t xml:space="preserve">Релиз: </w:t>
+      </w:r>
+      <w:hyperlink r:id="rId12" w:tooltip="https://github.com/vasmaae/software-engineering/releases/tag/v0.1.1" w:history="1">
+        <w:r>
+          <w:rPr>
+            <w:rStyle w:val="874"/>
+            <w:rFonts w:ascii="Times New Roman" w:hAnsi="Times New Roman"/>
+            <w:b w:val="0"/>
+            <w:sz w:val="28"/>
+            <w:szCs w:val="28"/>
+          </w:rPr>
+          <w:t xml:space="preserve">https://github.com/vasmaae/software-engineering/releases/tag/v0.1.1</w:t>
+        </w:r>
+        <w:r>
+          <w:rPr>
+            <w:rStyle w:val="874"/>
+            <w:sz w:val="28"/>
+            <w:szCs w:val="28"/>
+          </w:rPr>
+        </w:r>
+      </w:hyperlink>
+      <w:r>
+        <w:rPr>
+          <w:sz w:val="28"/>
+          <w:szCs w:val="28"/>
+        </w:rPr>
+      </w:r>
+      <w:r/>
+    </w:p>
+    <w:p>
+      <w:pPr>
+        <w:spacing w:after="120" w:line="276" w:lineRule="auto"/>
+        <w:ind/>
+        <w:jc w:val="both"/>
+        <w:rPr>
+          <w:sz w:val="28"/>
+          <w:szCs w:val="28"/>
+        </w:rPr>
+      </w:pPr>
+      <w:r>
+        <w:rPr>
+          <w:rFonts w:ascii="Times New Roman" w:hAnsi="Times New Roman"/>
+          <w:b w:val="0"/>
+          <w:color w:val="000000"/>
+          <w:sz w:val="28"/>
+          <w:szCs w:val="28"/>
+          <w:highlight w:val="none"/>
+        </w:rPr>
+      </w:r>
+      <w:r>
+        <w:rPr>
+          <w:rFonts w:ascii="Times New Roman" w:hAnsi="Times New Roman"/>
+          <w:b w:val="0"/>
+          <w:color w:val="000000"/>
+          <w:sz w:val="28"/>
+          <w:szCs w:val="28"/>
+          <w:highlight w:val="none"/>
+        </w:rPr>
+      </w:r>
+      <w:r>
+        <w:rPr>
+          <w:rFonts w:ascii="Times New Roman" w:hAnsi="Times New Roman"/>
+          <w:b w:val="0"/>
+          <w:color w:val="000000"/>
+          <w:sz w:val="28"/>
+          <w:szCs w:val="28"/>
+          <w:highlight w:val="none"/>
+        </w:rPr>
+      </w:r>
+    </w:p>
+    <w:p>
+      <w:pPr>
         <w:keepNext w:val="true"/>
         <w:pageBreakBefore w:val="true"/>
-        <w:pBdr/>
         <w:spacing w:after="120" w:before="180" w:line="276" w:lineRule="auto"/>
         <w:ind/>
         <w:jc w:val="center"/>
@@ -3399,12 +4616,17 @@
           <w:sz w:val="28"/>
           <w:szCs w:val="28"/>
         </w:rPr>
-        <w:t xml:space="preserve">Пайплайн и результаты проверок</w:t>
+        <w:t xml:space="preserve">Контроль качества и пайплайн</w:t>
+      </w:r>
+      <w:r>
+        <w:rPr>
+          <w:sz w:val="28"/>
+          <w:szCs w:val="28"/>
+        </w:rPr>
       </w:r>
     </w:p>
     <w:p>
       <w:pPr>
-        <w:pBdr/>
         <w:spacing w:after="120" w:line="276" w:lineRule="auto"/>
         <w:ind/>
         <w:jc w:val="both"/>
@@ -3421,20 +4643,8 @@
           <w:sz w:val="28"/>
           <w:szCs w:val="28"/>
         </w:rPr>
-        <w:t xml:space="preserve">Workflow .github/workflows/ci.yml запускается при каждом push и pull request. Он поднимает отдельную PostgreSQL 18, устанавливает Go 1.27 и Node.js 24, проверяет коммиты и применяет начальную SQL-миграцию. Далее выполняются gofmt, go vet, ESLint и Prettier.</w:t>
+        <w:t xml:space="preserve">Для Go применяются gofmt и go vet; для JS и JSX — ESLint с eslint.config.j</w:t>
       </w:r>
-    </w:p>
-    <w:p>
-      <w:pPr>
-        <w:pBdr/>
-        <w:spacing w:after="120" w:line="276" w:lineRule="auto"/>
-        <w:ind/>
-        <w:jc w:val="both"/>
-        <w:rPr>
-          <w:sz w:val="28"/>
-          <w:szCs w:val="28"/>
-        </w:rPr>
-      </w:pPr>
       <w:r>
         <w:rPr>
           <w:rFonts w:ascii="Times New Roman" w:hAnsi="Times New Roman"/>
@@ -3443,12 +4653,17 @@
           <w:sz w:val="28"/>
           <w:szCs w:val="28"/>
         </w:rPr>
-        <w:t xml:space="preserve">Модульные тесты Go проверяют входные параметры и запрещённые HTTP-методы. Интеграционные тесты вызывают HTTP-обработчики с реальной PostgreSQL: каталог, совмещённые фильтры, пустой ответ, литерал %, строка SQL-инъекции, доступность БД и отказ подключения. Тесты React проверяют загрузку, поиск, фильтр, пустые ответы, ошибки и отмену запроса.</w:t>
+        <w:t xml:space="preserve">s и Prettier с настройками по умолчанию. make lint проверяет оформление и статический анализ без автоматического исправления файлов. Ошибки и предупреждения ESLint запрещены. Отдельная проверка текста комментариев не настроена; в задании она необязательна.</w:t>
+      </w:r>
+      <w:r>
+        <w:rPr>
+          <w:sz w:val="28"/>
+          <w:szCs w:val="28"/>
+        </w:rPr>
       </w:r>
     </w:p>
     <w:p>
       <w:pPr>
-        <w:pBdr/>
         <w:spacing w:after="120" w:line="276" w:lineRule="auto"/>
         <w:ind/>
         <w:jc w:val="both"/>
@@ -3465,14 +4680,140 @@
           <w:sz w:val="28"/>
           <w:szCs w:val="28"/>
         </w:rPr>
-        <w:t xml:space="preserve">Go-тесты запускаются с -count=1, race detector и отчётом покрытия. Кеш результатов отключён: состояние внешней PostgreSQL не входит в ключ кеша Go. В CI отсутствие TEST_DATABASE_URL считается ошибкой. Vitest формирует JSON и V8-покрытие; пороги строк и ветвлений React — 80%. После успешных проверок собираются API, React и архив; отчёты сохраняются в Actions на 90 дней.</w:t>
+        <w:t xml:space="preserve">Workflow .github/workflows/ci.yml запускается на push</w:t>
+      </w:r>
+      <w:r>
+        <w:rPr>
+          <w:rFonts w:ascii="Times New Roman" w:hAnsi="Times New Roman"/>
+          <w:b w:val="0"/>
+          <w:color w:val="000000"/>
+          <w:sz w:val="28"/>
+          <w:szCs w:val="28"/>
+        </w:rPr>
+        <w:t xml:space="preserve"> и PR, а также вручную для замера этапа. Он поднимает PostgreSQL 18, проверяет имя ветки, устанавливает Go 1.27 и Node.js 24, выполняет npm ci, проверяет коммиты и заголовок PR, применяет SQL-миграцию и запускает make lint. Далее — тесты, метрики и сборка.</w:t>
+      </w:r>
+      <w:r>
+        <w:rPr>
+          <w:sz w:val="28"/>
+          <w:szCs w:val="28"/>
+        </w:rPr>
       </w:r>
     </w:p>
     <w:p>
       <w:pPr>
+        <w:spacing w:after="120" w:line="276" w:lineRule="auto"/>
+        <w:ind/>
+        <w:jc w:val="both"/>
+        <w:rPr>
+          <w:sz w:val="28"/>
+          <w:szCs w:val="28"/>
+        </w:rPr>
+      </w:pPr>
+      <w:r>
+        <w:rPr>
+          <w:rFonts w:ascii="Times New Roman" w:hAnsi="Times New Roman"/>
+          <w:b w:val="0"/>
+          <w:color w:val="000000"/>
+          <w:sz w:val="28"/>
+          <w:szCs w:val="28"/>
+        </w:rPr>
+        <w:t xml:space="preserve">Модульные тесты Go проверяют параметры и HTTP-мето</w:t>
+      </w:r>
+      <w:r>
+        <w:rPr>
+          <w:rFonts w:ascii="Times New Roman" w:hAnsi="Times New Roman"/>
+          <w:b w:val="0"/>
+          <w:color w:val="000000"/>
+          <w:sz w:val="28"/>
+          <w:szCs w:val="28"/>
+        </w:rPr>
+        <w:t xml:space="preserve">ды. Интеграционные тесты используют настоящую PostgreSQL: каталог, совмещённые фильтры, пустой ответ, литерал %, попытка SQL-инъекции, доступность БД и отказ подключения. React-тесты проверяют загрузку, поиск, фильтр, пустой ответ, ошибку и отмену запроса.</w:t>
+      </w:r>
+      <w:r>
+        <w:rPr>
+          <w:sz w:val="28"/>
+          <w:szCs w:val="28"/>
+        </w:rPr>
+      </w:r>
+    </w:p>
+    <w:p>
+      <w:pPr>
+        <w:spacing w:after="120" w:line="276" w:lineRule="auto"/>
+        <w:ind/>
+        <w:jc w:val="both"/>
+        <w:rPr>
+          <w:sz w:val="28"/>
+          <w:szCs w:val="28"/>
+        </w:rPr>
+      </w:pPr>
+      <w:r>
+        <w:rPr>
+          <w:rFonts w:ascii="Times New Roman" w:hAnsi="Times New Roman"/>
+          <w:b w:val="0"/>
+          <w:color w:val="000000"/>
+          <w:sz w:val="28"/>
+          <w:szCs w:val="28"/>
+        </w:rPr>
+        <w:t xml:space="preserve">Go запускается с -count=1, race detector </w:t>
+      </w:r>
+      <w:r>
+        <w:rPr>
+          <w:rFonts w:ascii="Times New Roman" w:hAnsi="Times New Roman"/>
+          <w:b w:val="0"/>
+          <w:color w:val="000000"/>
+          <w:sz w:val="28"/>
+          <w:szCs w:val="28"/>
+        </w:rPr>
+        <w:t xml:space="preserve">и отчётом покрытия. В CI отсутствие TEST_DATABASE_URL считается ошибкой. Vitest формирует JSON и V8-покрытие; минимальный порог React — 80% строк и ветвлений. Отдельно проходят пять тестов скриптов: три проверки правил веток и две проверки сборщика метрик.</w:t>
+      </w:r>
+      <w:r>
+        <w:rPr>
+          <w:sz w:val="28"/>
+          <w:szCs w:val="28"/>
+        </w:rPr>
+      </w:r>
+    </w:p>
+    <w:p>
+      <w:pPr>
+        <w:spacing w:after="120" w:line="276" w:lineRule="auto"/>
+        <w:ind/>
+        <w:jc w:val="both"/>
+        <w:rPr>
+          <w:sz w:val="28"/>
+          <w:szCs w:val="28"/>
+        </w:rPr>
+      </w:pPr>
+      <w:r>
+        <w:rPr>
+          <w:rFonts w:ascii="Times New Roman" w:hAnsi="Times New Roman"/>
+          <w:b w:val="0"/>
+          <w:color w:val="000000"/>
+          <w:sz w:val="28"/>
+          <w:szCs w:val="28"/>
+        </w:rPr>
+        <w:t xml:space="preserve">При успешных проверках ma</w:t>
+      </w:r>
+      <w:r>
+        <w:rPr>
+          <w:rFonts w:ascii="Times New Roman" w:hAnsi="Times New Roman"/>
+          <w:b w:val="0"/>
+          <w:color w:val="000000"/>
+          <w:sz w:val="28"/>
+          <w:szCs w:val="28"/>
+        </w:rPr>
+        <w:t xml:space="preserve">ke build собирает Go API и React; tar формирует sgt-linux-amd64.tar.gz. В Actions загружаются сборка и исходные отчёты; отчёты и сборка хранятся один день. Неуспешный обязательный шаг блокирует сборку и слияние. Выпуск по тегу разрешён только после успешного quality.</w:t>
+      </w:r>
+      <w:r>
+        <w:rPr>
+          <w:sz w:val="28"/>
+          <w:szCs w:val="28"/>
+        </w:rPr>
+      </w:r>
+    </w:p>
+    <w:p>
+      <w:pPr>
         <w:keepNext w:val="true"/>
         <w:pageBreakBefore w:val="false"/>
-        <w:pBdr/>
         <w:spacing w:after="120" w:before="180" w:line="276" w:lineRule="auto"/>
         <w:ind/>
         <w:jc w:val="center"/>
@@ -3489,12 +4830,17 @@
           <w:sz w:val="28"/>
           <w:szCs w:val="28"/>
         </w:rPr>
-        <w:t xml:space="preserve">Проверка запуска и результат</w:t>
+        <w:t xml:space="preserve">Тестовая среда и результат</w:t>
+      </w:r>
+      <w:r>
+        <w:rPr>
+          <w:sz w:val="28"/>
+          <w:szCs w:val="28"/>
+        </w:rPr>
       </w:r>
     </w:p>
     <w:p>
       <w:pPr>
-        <w:pBdr/>
         <w:spacing w:after="120" w:line="276" w:lineRule="auto"/>
         <w:ind/>
         <w:jc w:val="both"/>
@@ -3511,20 +4857,8 @@
           <w:sz w:val="28"/>
           <w:szCs w:val="28"/>
         </w:rPr>
-        <w:t xml:space="preserve">Локально успешно выполнены линтеры, тесты, сборки Go и React и docker compose up --build -d. Через http://localhost:8080 доступны интерфейс и /api; health возвращает 204, каталог — три маршрута. Проверены совместный поиск и фильтр, а также отсутствие горизонтального переполнения при ширине 360 px. PostgreSQL не публикуется за пределы сети Compose; данные хранятся в томе.</w:t>
+        <w:t xml:space="preserve">Docker Compose запускает db, api и web. Через http://localhost:8080 доступны интерфейс и /api: health возвращает 204, каталог</w:t>
       </w:r>
-    </w:p>
-    <w:p>
-      <w:pPr>
-        <w:pBdr/>
-        <w:spacing w:after="120" w:line="276" w:lineRule="auto"/>
-        <w:ind/>
-        <w:jc w:val="both"/>
-        <w:rPr>
-          <w:sz w:val="28"/>
-          <w:szCs w:val="28"/>
-        </w:rPr>
-      </w:pPr>
       <w:r>
         <w:rPr>
           <w:rFonts w:ascii="Times New Roman" w:hAnsi="Times New Roman"/>
@@ -3533,14 +4867,46 @@
           <w:sz w:val="28"/>
           <w:szCs w:val="28"/>
         </w:rPr>
-        <w:t xml:space="preserve">Для повторного запуска требуется создать локальный .env из .env.example и задать пароль. Начальная транзакционная SQL-миграция автоматически применяется к новому тому; для существующей БД она запускается явно. Автоматический внешний деплой, являющийся опциональным пунктом задания, не включён.</w:t>
+        <w:t xml:space="preserve"> — три маршрута. Проверены совместный поиск и фильтр и ширина 360 px без горизонтального переполнения. База не публикуется наружу, данные — в томе, пароль — в локальном .env. Начальная транзакционная миграция автоматически применяется только к новому тому.</w:t>
+      </w:r>
+      <w:r>
+        <w:rPr>
+          <w:sz w:val="28"/>
+          <w:szCs w:val="28"/>
+        </w:rPr>
       </w:r>
     </w:p>
     <w:p>
       <w:pPr>
+        <w:spacing w:after="120" w:line="276" w:lineRule="auto"/>
+        <w:ind/>
+        <w:jc w:val="both"/>
+        <w:rPr>
+          <w:sz w:val="28"/>
+          <w:szCs w:val="28"/>
+        </w:rPr>
+      </w:pPr>
+      <w:r>
+        <w:rPr>
+          <w:rFonts w:ascii="Times New Roman" w:hAnsi="Times New Roman"/>
+          <w:b w:val="0"/>
+          <w:color w:val="000000"/>
+          <w:sz w:val="28"/>
+          <w:szCs w:val="28"/>
+        </w:rPr>
+        <w:t xml:space="preserve">Локально проверены также Docker-сборки. CI проверяет и собирает Go и React. Опциональный автоматический деплой при слиянии в main не настроен; Compose запускается вручную.</w:t>
+      </w:r>
+      <w:r>
+        <w:rPr>
+          <w:sz w:val="28"/>
+          <w:szCs w:val="28"/>
+        </w:rPr>
+      </w:r>
+    </w:p>
+    <w:p>
+      <w:pPr>
         <w:keepNext w:val="true"/>
         <w:pageBreakBefore w:val="true"/>
-        <w:pBdr/>
         <w:spacing w:after="120" w:before="180" w:line="276" w:lineRule="auto"/>
         <w:ind/>
         <w:jc w:val="center"/>
@@ -3559,25 +4925,32 @@
         </w:rPr>
         <w:t xml:space="preserve">Фактические метрики этапа SGT-15</w:t>
       </w:r>
+      <w:r>
+        <w:rPr>
+          <w:sz w:val="28"/>
+          <w:szCs w:val="28"/>
+        </w:rPr>
+      </w:r>
     </w:p>
     <w:tbl>
       <w:tblPr>
         <w:tblW w:w="9355" w:type="dxa"/>
+        <w:tblCellMar>
+          <w:left w:w="80" w:type="dxa"/>
+          <w:top w:w="80" w:type="dxa"/>
+          <w:right w:w="80" w:type="dxa"/>
+          <w:bottom w:w="80" w:type="dxa"/>
+        </w:tblCellMar>
+        <w:tblBorders>
+          <w:top w:val="single" w:color="d9d9d9" w:sz="4" w:space="0"/>
+          <w:left w:val="single" w:color="d9d9d9" w:sz="4" w:space="0"/>
+          <w:bottom w:val="single" w:color="d9d9d9" w:sz="4" w:space="0"/>
+          <w:right w:val="single" w:color="d9d9d9" w:sz="4" w:space="0"/>
+          <w:insideH w:val="single" w:color="d9d9d9" w:sz="4" w:space="0"/>
+          <w:insideV w:val="single" w:color="d9d9d9" w:sz="4" w:space="0"/>
+        </w:tblBorders>
         <w:tblLayout w:type="fixed"/>
-        <w:tblBorders>
-          <w:top w:val="single" w:sz="4" w:color="D9D9D9"/>
-          <w:left w:val="single" w:sz="4" w:color="D9D9D9"/>
-          <w:bottom w:val="single" w:sz="4" w:color="D9D9D9"/>
-          <w:right w:val="single" w:sz="4" w:color="D9D9D9"/>
-          <w:insideH w:val="single" w:sz="4" w:color="D9D9D9"/>
-          <w:insideV w:val="single" w:sz="4" w:color="D9D9D9"/>
-        </w:tblBorders>
-        <w:tblCellMar>
-          <w:top w:w="80" w:type="dxa"/>
-          <w:bottom w:w="80" w:type="dxa"/>
-          <w:left w:w="80" w:type="dxa"/>
-          <w:right w:w="80" w:type="dxa"/>
-        </w:tblCellMar>
+        <w:tblLook w:val="04A0" w:firstRow="1" w:lastRow="0" w:firstColumn="1" w:lastColumn="0" w:noHBand="0" w:noVBand="1"/>
       </w:tblPr>
       <w:tblGrid>
         <w:gridCol w:w="7300"/>
@@ -3590,45 +4963,71 @@
         </w:trPr>
         <w:tc>
           <w:tcPr>
+            <w:shd w:val="clear" w:color="auto" w:fill="ededed"/>
+            <w:tcBorders/>
             <w:tcW w:w="7300" w:type="dxa"/>
             <w:vAlign w:val="center"/>
-            <w:shd w:fill="EDEDED"/>
           </w:tcPr>
           <w:p>
             <w:pPr>
-              <w:spacing w:before="0" w:after="0" w:line="240" w:lineRule="auto"/>
+              <w:spacing w:after="0" w:before="0" w:line="240" w:lineRule="auto"/>
+              <w:ind/>
               <w:jc w:val="left"/>
+              <w:rPr>
+                <w:sz w:val="28"/>
+                <w:szCs w:val="28"/>
+              </w:rPr>
             </w:pPr>
             <w:r>
               <w:rPr>
                 <w:rFonts w:ascii="Times New Roman" w:hAnsi="Times New Roman"/>
-                <w:sz w:val="24"/>
+                <w:b/>
                 <w:color w:val="000000"/>
-                <w:b/>
+                <w:sz w:val="28"/>
+                <w:szCs w:val="28"/>
               </w:rPr>
-              <w:t>Показатель</w:t>
+              <w:t xml:space="preserve">Показатель</w:t>
+            </w:r>
+            <w:r>
+              <w:rPr>
+                <w:sz w:val="28"/>
+                <w:szCs w:val="28"/>
+              </w:rPr>
             </w:r>
           </w:p>
         </w:tc>
         <w:tc>
           <w:tcPr>
+            <w:shd w:val="clear" w:color="auto" w:fill="ededed"/>
+            <w:tcBorders/>
             <w:tcW w:w="2055" w:type="dxa"/>
             <w:vAlign w:val="center"/>
-            <w:shd w:fill="EDEDED"/>
           </w:tcPr>
           <w:p>
             <w:pPr>
-              <w:spacing w:before="0" w:after="0" w:line="240" w:lineRule="auto"/>
+              <w:spacing w:after="0" w:before="0" w:line="240" w:lineRule="auto"/>
+              <w:ind/>
               <w:jc w:val="center"/>
+              <w:rPr>
+                <w:sz w:val="28"/>
+                <w:szCs w:val="28"/>
+              </w:rPr>
             </w:pPr>
             <w:r>
               <w:rPr>
                 <w:rFonts w:ascii="Times New Roman" w:hAnsi="Times New Roman"/>
-                <w:sz w:val="24"/>
+                <w:b/>
                 <w:color w:val="000000"/>
-                <w:b/>
+                <w:sz w:val="28"/>
+                <w:szCs w:val="28"/>
               </w:rPr>
-              <w:t>Значение</w:t>
+              <w:t xml:space="preserve">Значение</w:t>
+            </w:r>
+            <w:r>
+              <w:rPr>
+                <w:sz w:val="28"/>
+                <w:szCs w:val="28"/>
+              </w:rPr>
             </w:r>
           </w:p>
         </w:tc>
@@ -3639,41 +5038,67 @@
         </w:trPr>
         <w:tc>
           <w:tcPr>
+            <w:tcBorders/>
             <w:tcW w:w="7300" w:type="dxa"/>
             <w:vAlign w:val="center"/>
           </w:tcPr>
           <w:p>
             <w:pPr>
-              <w:spacing w:before="0" w:after="0" w:line="240" w:lineRule="auto"/>
+              <w:spacing w:after="0" w:before="0" w:line="240" w:lineRule="auto"/>
+              <w:ind/>
               <w:jc w:val="left"/>
+              <w:rPr>
+                <w:sz w:val="28"/>
+                <w:szCs w:val="28"/>
+              </w:rPr>
             </w:pPr>
             <w:r>
               <w:rPr>
                 <w:rFonts w:ascii="Times New Roman" w:hAnsi="Times New Roman"/>
-                <w:sz w:val="24"/>
                 <w:color w:val="000000"/>
+                <w:sz w:val="28"/>
+                <w:szCs w:val="28"/>
               </w:rPr>
-              <w:t>Ошибки ESLint</w:t>
+              <w:t xml:space="preserve">Ошибки ESLint</w:t>
+            </w:r>
+            <w:r>
+              <w:rPr>
+                <w:sz w:val="28"/>
+                <w:szCs w:val="28"/>
+              </w:rPr>
             </w:r>
           </w:p>
         </w:tc>
         <w:tc>
           <w:tcPr>
+            <w:tcBorders/>
             <w:tcW w:w="2055" w:type="dxa"/>
             <w:vAlign w:val="center"/>
           </w:tcPr>
           <w:p>
             <w:pPr>
-              <w:spacing w:before="0" w:after="0" w:line="240" w:lineRule="auto"/>
+              <w:spacing w:after="0" w:before="0" w:line="240" w:lineRule="auto"/>
+              <w:ind/>
               <w:jc w:val="center"/>
+              <w:rPr>
+                <w:sz w:val="28"/>
+                <w:szCs w:val="28"/>
+              </w:rPr>
             </w:pPr>
             <w:r>
               <w:rPr>
                 <w:rFonts w:ascii="Times New Roman" w:hAnsi="Times New Roman"/>
-                <w:sz w:val="24"/>
                 <w:color w:val="000000"/>
+                <w:sz w:val="28"/>
+                <w:szCs w:val="28"/>
               </w:rPr>
-              <w:t>0</w:t>
+              <w:t xml:space="preserve">0</w:t>
+            </w:r>
+            <w:r>
+              <w:rPr>
+                <w:sz w:val="28"/>
+                <w:szCs w:val="28"/>
+              </w:rPr>
             </w:r>
           </w:p>
         </w:tc>
@@ -3684,41 +5109,67 @@
         </w:trPr>
         <w:tc>
           <w:tcPr>
+            <w:tcBorders/>
             <w:tcW w:w="7300" w:type="dxa"/>
             <w:vAlign w:val="center"/>
           </w:tcPr>
           <w:p>
             <w:pPr>
-              <w:spacing w:before="0" w:after="0" w:line="240" w:lineRule="auto"/>
+              <w:spacing w:after="0" w:before="0" w:line="240" w:lineRule="auto"/>
+              <w:ind/>
               <w:jc w:val="left"/>
+              <w:rPr>
+                <w:sz w:val="28"/>
+                <w:szCs w:val="28"/>
+              </w:rPr>
             </w:pPr>
             <w:r>
               <w:rPr>
                 <w:rFonts w:ascii="Times New Roman" w:hAnsi="Times New Roman"/>
-                <w:sz w:val="24"/>
                 <w:color w:val="000000"/>
+                <w:sz w:val="28"/>
+                <w:szCs w:val="28"/>
               </w:rPr>
-              <w:t>Предупреждения ESLint</w:t>
+              <w:t xml:space="preserve">Предупреждения ESLint</w:t>
+            </w:r>
+            <w:r>
+              <w:rPr>
+                <w:sz w:val="28"/>
+                <w:szCs w:val="28"/>
+              </w:rPr>
             </w:r>
           </w:p>
         </w:tc>
         <w:tc>
           <w:tcPr>
+            <w:tcBorders/>
             <w:tcW w:w="2055" w:type="dxa"/>
             <w:vAlign w:val="center"/>
           </w:tcPr>
           <w:p>
             <w:pPr>
-              <w:spacing w:before="0" w:after="0" w:line="240" w:lineRule="auto"/>
+              <w:spacing w:after="0" w:before="0" w:line="240" w:lineRule="auto"/>
+              <w:ind/>
               <w:jc w:val="center"/>
+              <w:rPr>
+                <w:sz w:val="28"/>
+                <w:szCs w:val="28"/>
+              </w:rPr>
             </w:pPr>
             <w:r>
               <w:rPr>
                 <w:rFonts w:ascii="Times New Roman" w:hAnsi="Times New Roman"/>
-                <w:sz w:val="24"/>
                 <w:color w:val="000000"/>
+                <w:sz w:val="28"/>
+                <w:szCs w:val="28"/>
               </w:rPr>
-              <w:t>0</w:t>
+              <w:t xml:space="preserve">0</w:t>
+            </w:r>
+            <w:r>
+              <w:rPr>
+                <w:sz w:val="28"/>
+                <w:szCs w:val="28"/>
+              </w:rPr>
             </w:r>
           </w:p>
         </w:tc>
@@ -3729,41 +5180,67 @@
         </w:trPr>
         <w:tc>
           <w:tcPr>
+            <w:tcBorders/>
             <w:tcW w:w="7300" w:type="dxa"/>
             <w:vAlign w:val="center"/>
           </w:tcPr>
           <w:p>
             <w:pPr>
-              <w:spacing w:before="0" w:after="0" w:line="240" w:lineRule="auto"/>
+              <w:spacing w:after="0" w:before="0" w:line="240" w:lineRule="auto"/>
+              <w:ind/>
               <w:jc w:val="left"/>
+              <w:rPr>
+                <w:sz w:val="28"/>
+                <w:szCs w:val="28"/>
+              </w:rPr>
             </w:pPr>
             <w:r>
               <w:rPr>
                 <w:rFonts w:ascii="Times New Roman" w:hAnsi="Times New Roman"/>
-                <w:sz w:val="24"/>
                 <w:color w:val="000000"/>
+                <w:sz w:val="28"/>
+                <w:szCs w:val="28"/>
               </w:rPr>
-              <w:t>Покрытие операторов Go</w:t>
+              <w:t xml:space="preserve">Покрытие операторов Go</w:t>
+            </w:r>
+            <w:r>
+              <w:rPr>
+                <w:sz w:val="28"/>
+                <w:szCs w:val="28"/>
+              </w:rPr>
             </w:r>
           </w:p>
         </w:tc>
         <w:tc>
           <w:tcPr>
+            <w:tcBorders/>
             <w:tcW w:w="2055" w:type="dxa"/>
             <w:vAlign w:val="center"/>
           </w:tcPr>
           <w:p>
             <w:pPr>
-              <w:spacing w:before="0" w:after="0" w:line="240" w:lineRule="auto"/>
+              <w:spacing w:after="0" w:before="0" w:line="240" w:lineRule="auto"/>
+              <w:ind/>
               <w:jc w:val="center"/>
+              <w:rPr>
+                <w:sz w:val="28"/>
+                <w:szCs w:val="28"/>
+              </w:rPr>
             </w:pPr>
             <w:r>
               <w:rPr>
                 <w:rFonts w:ascii="Times New Roman" w:hAnsi="Times New Roman"/>
-                <w:sz w:val="24"/>
                 <w:color w:val="000000"/>
+                <w:sz w:val="28"/>
+                <w:szCs w:val="28"/>
               </w:rPr>
-              <w:t>85.7 %</w:t>
+              <w:t xml:space="preserve">85.7 %</w:t>
+            </w:r>
+            <w:r>
+              <w:rPr>
+                <w:sz w:val="28"/>
+                <w:szCs w:val="28"/>
+              </w:rPr>
             </w:r>
           </w:p>
         </w:tc>
@@ -3774,41 +5251,67 @@
         </w:trPr>
         <w:tc>
           <w:tcPr>
+            <w:tcBorders/>
             <w:tcW w:w="7300" w:type="dxa"/>
             <w:vAlign w:val="center"/>
           </w:tcPr>
           <w:p>
             <w:pPr>
-              <w:spacing w:before="0" w:after="0" w:line="240" w:lineRule="auto"/>
+              <w:spacing w:after="0" w:before="0" w:line="240" w:lineRule="auto"/>
+              <w:ind/>
               <w:jc w:val="left"/>
+              <w:rPr>
+                <w:sz w:val="28"/>
+                <w:szCs w:val="28"/>
+              </w:rPr>
             </w:pPr>
             <w:r>
               <w:rPr>
                 <w:rFonts w:ascii="Times New Roman" w:hAnsi="Times New Roman"/>
-                <w:sz w:val="24"/>
                 <w:color w:val="000000"/>
+                <w:sz w:val="28"/>
+                <w:szCs w:val="28"/>
               </w:rPr>
-              <w:t>Покрытие строк React</w:t>
+              <w:t xml:space="preserve">Покрытие строк React</w:t>
+            </w:r>
+            <w:r>
+              <w:rPr>
+                <w:sz w:val="28"/>
+                <w:szCs w:val="28"/>
+              </w:rPr>
             </w:r>
           </w:p>
         </w:tc>
         <w:tc>
           <w:tcPr>
+            <w:tcBorders/>
             <w:tcW w:w="2055" w:type="dxa"/>
             <w:vAlign w:val="center"/>
           </w:tcPr>
           <w:p>
             <w:pPr>
-              <w:spacing w:before="0" w:after="0" w:line="240" w:lineRule="auto"/>
+              <w:spacing w:after="0" w:before="0" w:line="240" w:lineRule="auto"/>
+              <w:ind/>
               <w:jc w:val="center"/>
+              <w:rPr>
+                <w:sz w:val="28"/>
+                <w:szCs w:val="28"/>
+              </w:rPr>
             </w:pPr>
             <w:r>
               <w:rPr>
                 <w:rFonts w:ascii="Times New Roman" w:hAnsi="Times New Roman"/>
-                <w:sz w:val="24"/>
                 <w:color w:val="000000"/>
+                <w:sz w:val="28"/>
+                <w:szCs w:val="28"/>
               </w:rPr>
-              <w:t>100 %</w:t>
+              <w:t xml:space="preserve">100 %</w:t>
+            </w:r>
+            <w:r>
+              <w:rPr>
+                <w:sz w:val="28"/>
+                <w:szCs w:val="28"/>
+              </w:rPr>
             </w:r>
           </w:p>
         </w:tc>
@@ -3819,41 +5322,67 @@
         </w:trPr>
         <w:tc>
           <w:tcPr>
+            <w:tcBorders/>
             <w:tcW w:w="7300" w:type="dxa"/>
             <w:vAlign w:val="center"/>
           </w:tcPr>
           <w:p>
             <w:pPr>
-              <w:spacing w:before="0" w:after="0" w:line="240" w:lineRule="auto"/>
+              <w:spacing w:after="0" w:before="0" w:line="240" w:lineRule="auto"/>
+              <w:ind/>
               <w:jc w:val="left"/>
+              <w:rPr>
+                <w:sz w:val="28"/>
+                <w:szCs w:val="28"/>
+              </w:rPr>
             </w:pPr>
             <w:r>
               <w:rPr>
                 <w:rFonts w:ascii="Times New Roman" w:hAnsi="Times New Roman"/>
-                <w:sz w:val="24"/>
                 <w:color w:val="000000"/>
+                <w:sz w:val="28"/>
+                <w:szCs w:val="28"/>
               </w:rPr>
-              <w:t>Покрытие ветвлений React</w:t>
+              <w:t xml:space="preserve">Покрытие ветвлений React</w:t>
+            </w:r>
+            <w:r>
+              <w:rPr>
+                <w:sz w:val="28"/>
+                <w:szCs w:val="28"/>
+              </w:rPr>
             </w:r>
           </w:p>
         </w:tc>
         <w:tc>
           <w:tcPr>
+            <w:tcBorders/>
             <w:tcW w:w="2055" w:type="dxa"/>
             <w:vAlign w:val="center"/>
           </w:tcPr>
           <w:p>
             <w:pPr>
-              <w:spacing w:before="0" w:after="0" w:line="240" w:lineRule="auto"/>
+              <w:spacing w:after="0" w:before="0" w:line="240" w:lineRule="auto"/>
+              <w:ind/>
               <w:jc w:val="center"/>
+              <w:rPr>
+                <w:sz w:val="28"/>
+                <w:szCs w:val="28"/>
+              </w:rPr>
             </w:pPr>
             <w:r>
               <w:rPr>
                 <w:rFonts w:ascii="Times New Roman" w:hAnsi="Times New Roman"/>
-                <w:sz w:val="24"/>
                 <w:color w:val="000000"/>
+                <w:sz w:val="28"/>
+                <w:szCs w:val="28"/>
               </w:rPr>
-              <w:t>100 %</w:t>
+              <w:t xml:space="preserve">100 %</w:t>
+            </w:r>
+            <w:r>
+              <w:rPr>
+                <w:sz w:val="28"/>
+                <w:szCs w:val="28"/>
+              </w:rPr>
             </w:r>
           </w:p>
         </w:tc>
@@ -3864,41 +5393,67 @@
         </w:trPr>
         <w:tc>
           <w:tcPr>
+            <w:tcBorders/>
             <w:tcW w:w="7300" w:type="dxa"/>
             <w:vAlign w:val="center"/>
           </w:tcPr>
           <w:p>
             <w:pPr>
-              <w:spacing w:before="0" w:after="0" w:line="240" w:lineRule="auto"/>
+              <w:spacing w:after="0" w:before="0" w:line="240" w:lineRule="auto"/>
+              <w:ind/>
               <w:jc w:val="left"/>
+              <w:rPr>
+                <w:sz w:val="28"/>
+                <w:szCs w:val="28"/>
+              </w:rPr>
             </w:pPr>
             <w:r>
               <w:rPr>
                 <w:rFonts w:ascii="Times New Roman" w:hAnsi="Times New Roman"/>
-                <w:sz w:val="24"/>
                 <w:color w:val="000000"/>
+                <w:sz w:val="28"/>
+                <w:szCs w:val="28"/>
               </w:rPr>
-              <w:t>Успешные тесты приложения</w:t>
+              <w:t xml:space="preserve">Успешные тесты приложения</w:t>
+            </w:r>
+            <w:r>
+              <w:rPr>
+                <w:sz w:val="28"/>
+                <w:szCs w:val="28"/>
+              </w:rPr>
             </w:r>
           </w:p>
         </w:tc>
         <w:tc>
           <w:tcPr>
+            <w:tcBorders/>
             <w:tcW w:w="2055" w:type="dxa"/>
             <w:vAlign w:val="center"/>
           </w:tcPr>
           <w:p>
             <w:pPr>
-              <w:spacing w:before="0" w:after="0" w:line="240" w:lineRule="auto"/>
+              <w:spacing w:after="0" w:before="0" w:line="240" w:lineRule="auto"/>
+              <w:ind/>
               <w:jc w:val="center"/>
+              <w:rPr>
+                <w:sz w:val="28"/>
+                <w:szCs w:val="28"/>
+              </w:rPr>
             </w:pPr>
             <w:r>
               <w:rPr>
                 <w:rFonts w:ascii="Times New Roman" w:hAnsi="Times New Roman"/>
-                <w:sz w:val="24"/>
                 <w:color w:val="000000"/>
+                <w:sz w:val="28"/>
+                <w:szCs w:val="28"/>
               </w:rPr>
-              <w:t>17</w:t>
+              <w:t xml:space="preserve">17</w:t>
+            </w:r>
+            <w:r>
+              <w:rPr>
+                <w:sz w:val="28"/>
+                <w:szCs w:val="28"/>
+              </w:rPr>
             </w:r>
           </w:p>
         </w:tc>
@@ -3909,41 +5464,67 @@
         </w:trPr>
         <w:tc>
           <w:tcPr>
+            <w:tcBorders/>
             <w:tcW w:w="7300" w:type="dxa"/>
             <w:vAlign w:val="center"/>
           </w:tcPr>
           <w:p>
             <w:pPr>
-              <w:spacing w:before="0" w:after="0" w:line="240" w:lineRule="auto"/>
+              <w:spacing w:after="0" w:before="0" w:line="240" w:lineRule="auto"/>
+              <w:ind/>
               <w:jc w:val="left"/>
+              <w:rPr>
+                <w:sz w:val="28"/>
+                <w:szCs w:val="28"/>
+              </w:rPr>
             </w:pPr>
             <w:r>
               <w:rPr>
                 <w:rFonts w:ascii="Times New Roman" w:hAnsi="Times New Roman"/>
-                <w:sz w:val="24"/>
                 <w:color w:val="000000"/>
+                <w:sz w:val="28"/>
+                <w:szCs w:val="28"/>
               </w:rPr>
-              <w:t>Упавшие тесты приложения</w:t>
+              <w:t xml:space="preserve">Упавшие тесты приложения</w:t>
+            </w:r>
+            <w:r>
+              <w:rPr>
+                <w:sz w:val="28"/>
+                <w:szCs w:val="28"/>
+              </w:rPr>
             </w:r>
           </w:p>
         </w:tc>
         <w:tc>
           <w:tcPr>
+            <w:tcBorders/>
             <w:tcW w:w="2055" w:type="dxa"/>
             <w:vAlign w:val="center"/>
           </w:tcPr>
           <w:p>
             <w:pPr>
-              <w:spacing w:before="0" w:after="0" w:line="240" w:lineRule="auto"/>
+              <w:spacing w:after="0" w:before="0" w:line="240" w:lineRule="auto"/>
+              <w:ind/>
               <w:jc w:val="center"/>
+              <w:rPr>
+                <w:sz w:val="28"/>
+                <w:szCs w:val="28"/>
+              </w:rPr>
             </w:pPr>
             <w:r>
               <w:rPr>
                 <w:rFonts w:ascii="Times New Roman" w:hAnsi="Times New Roman"/>
-                <w:sz w:val="24"/>
                 <w:color w:val="000000"/>
+                <w:sz w:val="28"/>
+                <w:szCs w:val="28"/>
               </w:rPr>
-              <w:t>0</w:t>
+              <w:t xml:space="preserve">0</w:t>
+            </w:r>
+            <w:r>
+              <w:rPr>
+                <w:sz w:val="28"/>
+                <w:szCs w:val="28"/>
+              </w:rPr>
             </w:r>
           </w:p>
         </w:tc>
@@ -3954,41 +5535,67 @@
         </w:trPr>
         <w:tc>
           <w:tcPr>
+            <w:tcBorders/>
             <w:tcW w:w="7300" w:type="dxa"/>
             <w:vAlign w:val="center"/>
           </w:tcPr>
           <w:p>
             <w:pPr>
-              <w:spacing w:before="0" w:after="0" w:line="240" w:lineRule="auto"/>
+              <w:spacing w:after="0" w:before="0" w:line="240" w:lineRule="auto"/>
+              <w:ind/>
               <w:jc w:val="left"/>
+              <w:rPr>
+                <w:sz w:val="28"/>
+                <w:szCs w:val="28"/>
+              </w:rPr>
             </w:pPr>
             <w:r>
               <w:rPr>
                 <w:rFonts w:ascii="Times New Roman" w:hAnsi="Times New Roman"/>
-                <w:sz w:val="24"/>
                 <w:color w:val="000000"/>
+                <w:sz w:val="28"/>
+                <w:szCs w:val="28"/>
               </w:rPr>
-              <w:t>Время выполнения тестов</w:t>
+              <w:t xml:space="preserve">Время выполнения тестов</w:t>
+            </w:r>
+            <w:r>
+              <w:rPr>
+                <w:sz w:val="28"/>
+                <w:szCs w:val="28"/>
+              </w:rPr>
             </w:r>
           </w:p>
         </w:tc>
         <w:tc>
           <w:tcPr>
+            <w:tcBorders/>
             <w:tcW w:w="2055" w:type="dxa"/>
             <w:vAlign w:val="center"/>
           </w:tcPr>
           <w:p>
             <w:pPr>
-              <w:spacing w:before="0" w:after="0" w:line="240" w:lineRule="auto"/>
+              <w:spacing w:after="0" w:before="0" w:line="240" w:lineRule="auto"/>
+              <w:ind/>
               <w:jc w:val="center"/>
+              <w:rPr>
+                <w:sz w:val="28"/>
+                <w:szCs w:val="28"/>
+              </w:rPr>
             </w:pPr>
             <w:r>
               <w:rPr>
                 <w:rFonts w:ascii="Times New Roman" w:hAnsi="Times New Roman"/>
-                <w:sz w:val="24"/>
                 <w:color w:val="000000"/>
+                <w:sz w:val="28"/>
+                <w:szCs w:val="28"/>
               </w:rPr>
-              <w:t>1.179 с</w:t>
+              <w:t xml:space="preserve">1.179 с</w:t>
+            </w:r>
+            <w:r>
+              <w:rPr>
+                <w:sz w:val="28"/>
+                <w:szCs w:val="28"/>
+              </w:rPr>
             </w:r>
           </w:p>
         </w:tc>
@@ -3996,7 +5603,6 @@
     </w:tbl>
     <w:p>
       <w:pPr>
-        <w:pBdr/>
         <w:spacing w:after="120" w:line="276" w:lineRule="auto"/>
         <w:ind/>
         <w:jc w:val="both"/>
@@ -4013,12 +5619,16 @@
           <w:sz w:val="28"/>
           <w:szCs w:val="28"/>
         </w:rPr>
-        <w:t xml:space="preserve"/>
+      </w:r>
+      <w:r>
+        <w:rPr>
+          <w:sz w:val="28"/>
+          <w:szCs w:val="28"/>
+        </w:rPr>
       </w:r>
     </w:p>
     <w:p>
       <w:pPr>
-        <w:pBdr/>
         <w:spacing w:after="120" w:line="276" w:lineRule="auto"/>
         <w:ind/>
         <w:jc w:val="both"/>
@@ -4035,12 +5645,27 @@
           <w:sz w:val="28"/>
           <w:szCs w:val="28"/>
         </w:rPr>
-        <w:t xml:space="preserve">Восемь числовых полей покрывают пять видов показателей из задания: замечания линтера, покрытие кода, покрытие ветвлений, результаты тестов и время тестов. Go-покрытие относится к internal, React-покрытие — к App.jsx. Родительские Go-тесты не считаются повторно. Две отдельные проверки сборщика метрик в числа приложения не включены.</w:t>
+        <w:t xml:space="preserve">Восемь числовых полей покрывают пять видов показателей из задания: замечания</w:t>
+      </w:r>
+      <w:r>
+        <w:rPr>
+          <w:rFonts w:ascii="Times New Roman" w:hAnsi="Times New Roman"/>
+          <w:b w:val="0"/>
+          <w:color w:val="000000"/>
+          <w:sz w:val="28"/>
+          <w:szCs w:val="28"/>
+        </w:rPr>
+        <w:t xml:space="preserve"> линтера, покрытие кода, покрытие ветвлений, результаты тестов и время тестов. Go-покрытие относится к internal, React-покрытие — к App.jsx. Родительские Go-тесты не считаются повторно. Две отдельные проверки сборщика метрик в числа приложения не включены.</w:t>
+      </w:r>
+      <w:r>
+        <w:rPr>
+          <w:sz w:val="28"/>
+          <w:szCs w:val="28"/>
+        </w:rPr>
       </w:r>
     </w:p>
     <w:p>
       <w:pPr>
-        <w:pBdr/>
         <w:spacing w:after="120" w:line="276" w:lineRule="auto"/>
         <w:ind/>
         <w:jc w:val="both"/>
@@ -4059,10 +5684,15 @@
         </w:rPr>
         <w:t xml:space="preserve">Время — сумма длительностей Go-пакетов и тестовых файлов React, без установки зависимостей и сборки. Отсутствующий отчёт вызывает ошибку сбора вместо подстановки нуля.</w:t>
       </w:r>
+      <w:r>
+        <w:rPr>
+          <w:sz w:val="28"/>
+          <w:szCs w:val="28"/>
+        </w:rPr>
+      </w:r>
     </w:p>
     <w:p>
       <w:pPr>
-        <w:pBdr/>
         <w:spacing w:after="120" w:line="276" w:lineRule="auto"/>
         <w:ind/>
         <w:jc w:val="both"/>
@@ -4079,12 +5709,27 @@
           <w:sz w:val="28"/>
           <w:szCs w:val="28"/>
         </w:rPr>
-        <w:t xml:space="preserve">Замер, приведённый в таблице, выполнен 22.10.2026. Плановая дата инфраструктуры 03.10.2026 сохранена; задним числом измерения не создавались. Для SGT-14 и будущих этапов вымышленные значения не записывались. При их фактической сдаче используется тот же workflow.</w:t>
+        <w:t xml:space="preserve">Замер,</w:t>
+      </w:r>
+      <w:r>
+        <w:rPr>
+          <w:rFonts w:ascii="Times New Roman" w:hAnsi="Times New Roman"/>
+          <w:b w:val="0"/>
+          <w:color w:val="000000"/>
+          <w:sz w:val="28"/>
+          <w:szCs w:val="28"/>
+        </w:rPr>
+        <w:t xml:space="preserve"> приведённый в таблице, выполнен 22.10.2026. Плановая дата инфраструктуры 03.10.2026 сохранена; задним числом измерения не создавались. Для SGT-14 и будущих этапов вымышленные значения не записывались. При их фактической сдаче используется тот же workflow.</w:t>
+      </w:r>
+      <w:r>
+        <w:rPr>
+          <w:sz w:val="28"/>
+          <w:szCs w:val="28"/>
+        </w:rPr>
       </w:r>
     </w:p>
     <w:p>
       <w:pPr>
-        <w:pBdr/>
         <w:spacing w:after="120" w:line="276" w:lineRule="auto"/>
         <w:ind/>
         <w:jc w:val="both"/>
@@ -4103,16 +5748,26 @@
         </w:rPr>
         <w:t xml:space="preserve">Измеренная версия: 8c75137c623f; тег v0.1.1.</w:t>
       </w:r>
-    </w:p>
-    <w:p>
-      <w:pPr>
-        <w:pBdr/>
-        <w:spacing w:after="120" w:line="276" w:lineRule="auto"/>
-        <w:ind/>
-        <w:jc w:val="both"/>
+      <w:r>
         <w:rPr>
           <w:sz w:val="28"/>
           <w:szCs w:val="28"/>
+        </w:rPr>
+      </w:r>
+    </w:p>
+    <w:p>
+      <w:pPr>
+        <w:spacing w:after="120" w:line="276" w:lineRule="auto"/>
+        <w:ind/>
+        <w:jc w:val="both"/>
+        <w:rPr>
+          <w:rFonts w:ascii="Times New Roman" w:hAnsi="Times New Roman"/>
+          <w:b w:val="0"/>
+          <w:bCs w:val="0"/>
+          <w:color w:val="000000"/>
+          <w:sz w:val="28"/>
+          <w:szCs w:val="28"/>
+          <w:highlight w:val="none"/>
         </w:rPr>
       </w:pPr>
       <w:r>
@@ -4123,14 +5778,78 @@
           <w:sz w:val="28"/>
           <w:szCs w:val="28"/>
         </w:rPr>
-        <w:t xml:space="preserve">https://github.com/vasmaae/software-engineering/actions/runs/39684392913</w:t>
+      </w:r>
+      <w:hyperlink r:id="rId13" w:tooltip="https://github.com/vasmaae/software-engineering/actions/runs/39684392913" w:history="1">
+        <w:r>
+          <w:rPr>
+            <w:rStyle w:val="874"/>
+            <w:rFonts w:ascii="Times New Roman" w:hAnsi="Times New Roman"/>
+            <w:b w:val="0"/>
+            <w:sz w:val="28"/>
+            <w:szCs w:val="28"/>
+          </w:rPr>
+          <w:t xml:space="preserve">https://github.com/vasmaae/software-engineering/actions/runs/39684392913</w:t>
+        </w:r>
+        <w:r>
+          <w:rPr>
+            <w:rStyle w:val="874"/>
+            <w:sz w:val="28"/>
+            <w:szCs w:val="28"/>
+          </w:rPr>
+        </w:r>
+      </w:hyperlink>
+      <w:r>
+        <w:rPr>
+          <w:sz w:val="28"/>
+          <w:szCs w:val="28"/>
+        </w:rPr>
+      </w:r>
+      <w:r>
+        <w:rPr>
+          <w:rFonts w:ascii="Times New Roman" w:hAnsi="Times New Roman"/>
+          <w:b w:val="0"/>
+          <w:color w:val="000000"/>
+          <w:sz w:val="28"/>
+          <w:szCs w:val="28"/>
+          <w:highlight w:val="none"/>
+        </w:rPr>
+      </w:r>
+      <w:r>
+        <w:rPr>
+          <w:rFonts w:ascii="Times New Roman" w:hAnsi="Times New Roman"/>
+          <w:b w:val="0"/>
+          <w:color w:val="000000"/>
+          <w:sz w:val="28"/>
+          <w:szCs w:val="28"/>
+          <w:highlight w:val="none"/>
+        </w:rPr>
+      </w:r>
+      <w:r>
+        <w:rPr>
+          <w:rFonts w:ascii="Times New Roman" w:hAnsi="Times New Roman"/>
+          <w:b w:val="0"/>
+          <w:color w:val="000000"/>
+          <w:sz w:val="28"/>
+          <w:szCs w:val="28"/>
+          <w:highlight w:val="none"/>
+        </w:rPr>
+      </w:r>
+      <w:r>
+        <w:rPr>
+          <w:rFonts w:ascii="Times New Roman" w:hAnsi="Times New Roman"/>
+          <w:b w:val="0"/>
+          <w:bCs w:val="0"/>
+          <w:color w:val="000000"/>
+          <w:sz w:val="28"/>
+          <w:szCs w:val="28"/>
+          <w:highlight w:val="none"/>
+        </w:rPr>
       </w:r>
     </w:p>
     <w:p>
       <w:pPr>
         <w:keepNext w:val="true"/>
         <w:pageBreakBefore w:val="true"/>
-        <w:pBdr/>
         <w:spacing w:after="120" w:before="180" w:line="276" w:lineRule="auto"/>
         <w:ind/>
         <w:jc w:val="center"/>
@@ -4149,10 +5868,15 @@
         </w:rPr>
         <w:t xml:space="preserve">Измерения по этапам и связь с YouTrack</w:t>
       </w:r>
+      <w:r>
+        <w:rPr>
+          <w:sz w:val="28"/>
+          <w:szCs w:val="28"/>
+        </w:rPr>
+      </w:r>
     </w:p>
     <w:p>
       <w:pPr>
-        <w:pBdr/>
         <w:spacing w:after="120" w:line="276" w:lineRule="auto"/>
         <w:ind/>
         <w:jc w:val="both"/>
@@ -4171,25 +5895,32 @@
         </w:rPr>
         <w:t xml:space="preserve">Используется существующий проект SGT. Инфраструктура относится к SGT-15; демонстрационный каталог связан с SGT-3 и SGT-4. Завершение ЛР5 не закрывает отсутствующие функции справочника. Оценки, плановые даты и фактическое время других задач не изменялись.</w:t>
       </w:r>
+      <w:r>
+        <w:rPr>
+          <w:sz w:val="28"/>
+          <w:szCs w:val="28"/>
+        </w:rPr>
+      </w:r>
     </w:p>
     <w:tbl>
       <w:tblPr>
         <w:tblW w:w="9355" w:type="dxa"/>
+        <w:tblCellMar>
+          <w:left w:w="80" w:type="dxa"/>
+          <w:top w:w="80" w:type="dxa"/>
+          <w:right w:w="80" w:type="dxa"/>
+          <w:bottom w:w="80" w:type="dxa"/>
+        </w:tblCellMar>
+        <w:tblBorders>
+          <w:top w:val="single" w:color="d9d9d9" w:sz="4" w:space="0"/>
+          <w:left w:val="single" w:color="d9d9d9" w:sz="4" w:space="0"/>
+          <w:bottom w:val="single" w:color="d9d9d9" w:sz="4" w:space="0"/>
+          <w:right w:val="single" w:color="d9d9d9" w:sz="4" w:space="0"/>
+          <w:insideH w:val="single" w:color="d9d9d9" w:sz="4" w:space="0"/>
+          <w:insideV w:val="single" w:color="d9d9d9" w:sz="4" w:space="0"/>
+        </w:tblBorders>
         <w:tblLayout w:type="fixed"/>
-        <w:tblBorders>
-          <w:top w:val="single" w:sz="4" w:color="D9D9D9"/>
-          <w:left w:val="single" w:sz="4" w:color="D9D9D9"/>
-          <w:bottom w:val="single" w:sz="4" w:color="D9D9D9"/>
-          <w:right w:val="single" w:sz="4" w:color="D9D9D9"/>
-          <w:insideH w:val="single" w:sz="4" w:color="D9D9D9"/>
-          <w:insideV w:val="single" w:sz="4" w:color="D9D9D9"/>
-        </w:tblBorders>
-        <w:tblCellMar>
-          <w:top w:w="80" w:type="dxa"/>
-          <w:bottom w:w="80" w:type="dxa"/>
-          <w:left w:w="80" w:type="dxa"/>
-          <w:right w:w="80" w:type="dxa"/>
-        </w:tblCellMar>
+        <w:tblLook w:val="04A0" w:firstRow="1" w:lastRow="0" w:firstColumn="1" w:lastColumn="0" w:noHBand="0" w:noVBand="1"/>
       </w:tblPr>
       <w:tblGrid>
         <w:gridCol w:w="1500"/>
@@ -4203,67 +5934,106 @@
         </w:trPr>
         <w:tc>
           <w:tcPr>
+            <w:shd w:val="clear" w:color="auto" w:fill="ededed"/>
+            <w:tcBorders/>
             <w:tcW w:w="1500" w:type="dxa"/>
             <w:vAlign w:val="center"/>
-            <w:shd w:fill="EDEDED"/>
           </w:tcPr>
           <w:p>
             <w:pPr>
-              <w:spacing w:before="0" w:after="0" w:line="240" w:lineRule="auto"/>
+              <w:spacing w:after="0" w:before="0" w:line="240" w:lineRule="auto"/>
+              <w:ind/>
               <w:jc w:val="left"/>
+              <w:rPr>
+                <w:sz w:val="28"/>
+                <w:szCs w:val="28"/>
+              </w:rPr>
             </w:pPr>
             <w:r>
               <w:rPr>
                 <w:rFonts w:ascii="Times New Roman" w:hAnsi="Times New Roman"/>
-                <w:sz w:val="24"/>
+                <w:b/>
                 <w:color w:val="000000"/>
-                <w:b/>
+                <w:sz w:val="28"/>
+                <w:szCs w:val="28"/>
               </w:rPr>
-              <w:t>Этап</w:t>
+              <w:t xml:space="preserve">Этап</w:t>
+            </w:r>
+            <w:r>
+              <w:rPr>
+                <w:sz w:val="28"/>
+                <w:szCs w:val="28"/>
+              </w:rPr>
             </w:r>
           </w:p>
         </w:tc>
         <w:tc>
           <w:tcPr>
+            <w:shd w:val="clear" w:color="auto" w:fill="ededed"/>
+            <w:tcBorders/>
             <w:tcW w:w="2350" w:type="dxa"/>
             <w:vAlign w:val="center"/>
-            <w:shd w:fill="EDEDED"/>
           </w:tcPr>
           <w:p>
             <w:pPr>
-              <w:spacing w:before="0" w:after="0" w:line="240" w:lineRule="auto"/>
+              <w:spacing w:after="0" w:before="0" w:line="240" w:lineRule="auto"/>
+              <w:ind/>
               <w:jc w:val="center"/>
+              <w:rPr>
+                <w:sz w:val="28"/>
+                <w:szCs w:val="28"/>
+              </w:rPr>
             </w:pPr>
             <w:r>
               <w:rPr>
                 <w:rFonts w:ascii="Times New Roman" w:hAnsi="Times New Roman"/>
-                <w:sz w:val="24"/>
+                <w:b/>
                 <w:color w:val="000000"/>
-                <w:b/>
+                <w:sz w:val="28"/>
+                <w:szCs w:val="28"/>
               </w:rPr>
-              <w:t>Плановая сдача</w:t>
+              <w:t xml:space="preserve">Плановая сдача</w:t>
+            </w:r>
+            <w:r>
+              <w:rPr>
+                <w:sz w:val="28"/>
+                <w:szCs w:val="28"/>
+              </w:rPr>
             </w:r>
           </w:p>
         </w:tc>
         <w:tc>
           <w:tcPr>
+            <w:shd w:val="clear" w:color="auto" w:fill="ededed"/>
+            <w:tcBorders/>
             <w:tcW w:w="5505" w:type="dxa"/>
             <w:vAlign w:val="center"/>
-            <w:shd w:fill="EDEDED"/>
           </w:tcPr>
           <w:p>
             <w:pPr>
-              <w:spacing w:before="0" w:after="0" w:line="240" w:lineRule="auto"/>
+              <w:spacing w:after="0" w:before="0" w:line="240" w:lineRule="auto"/>
+              <w:ind/>
               <w:jc w:val="left"/>
+              <w:rPr>
+                <w:sz w:val="28"/>
+                <w:szCs w:val="28"/>
+              </w:rPr>
             </w:pPr>
             <w:r>
               <w:rPr>
                 <w:rFonts w:ascii="Times New Roman" w:hAnsi="Times New Roman"/>
-                <w:sz w:val="24"/>
+                <w:b/>
                 <w:color w:val="000000"/>
-                <w:b/>
+                <w:sz w:val="28"/>
+                <w:szCs w:val="28"/>
               </w:rPr>
-              <w:t>Результат</w:t>
+              <w:t xml:space="preserve">Результат</w:t>
+            </w:r>
+            <w:r>
+              <w:rPr>
+                <w:sz w:val="28"/>
+                <w:szCs w:val="28"/>
+              </w:rPr>
             </w:r>
           </w:p>
         </w:tc>
@@ -4274,61 +6044,100 @@
         </w:trPr>
         <w:tc>
           <w:tcPr>
+            <w:tcBorders/>
             <w:tcW w:w="1500" w:type="dxa"/>
             <w:vAlign w:val="center"/>
           </w:tcPr>
           <w:p>
             <w:pPr>
-              <w:spacing w:before="0" w:after="0" w:line="240" w:lineRule="auto"/>
+              <w:spacing w:after="0" w:before="0" w:line="240" w:lineRule="auto"/>
+              <w:ind/>
               <w:jc w:val="left"/>
+              <w:rPr>
+                <w:sz w:val="28"/>
+                <w:szCs w:val="28"/>
+              </w:rPr>
             </w:pPr>
             <w:r>
               <w:rPr>
                 <w:rFonts w:ascii="Times New Roman" w:hAnsi="Times New Roman"/>
-                <w:sz w:val="24"/>
                 <w:color w:val="000000"/>
+                <w:sz w:val="28"/>
+                <w:szCs w:val="28"/>
               </w:rPr>
-              <w:t>SGT-14</w:t>
+              <w:t xml:space="preserve">SGT-14</w:t>
+            </w:r>
+            <w:r>
+              <w:rPr>
+                <w:sz w:val="28"/>
+                <w:szCs w:val="28"/>
+              </w:rPr>
             </w:r>
           </w:p>
         </w:tc>
         <w:tc>
           <w:tcPr>
+            <w:tcBorders/>
             <w:tcW w:w="2350" w:type="dxa"/>
             <w:vAlign w:val="center"/>
           </w:tcPr>
           <w:p>
             <w:pPr>
-              <w:spacing w:before="0" w:after="0" w:line="240" w:lineRule="auto"/>
+              <w:spacing w:after="0" w:before="0" w:line="240" w:lineRule="auto"/>
+              <w:ind/>
               <w:jc w:val="center"/>
+              <w:rPr>
+                <w:sz w:val="28"/>
+                <w:szCs w:val="28"/>
+              </w:rPr>
             </w:pPr>
             <w:r>
               <w:rPr>
                 <w:rFonts w:ascii="Times New Roman" w:hAnsi="Times New Roman"/>
-                <w:sz w:val="24"/>
                 <w:color w:val="000000"/>
+                <w:sz w:val="28"/>
+                <w:szCs w:val="28"/>
               </w:rPr>
-              <w:t>26.09.2026</w:t>
+              <w:t xml:space="preserve">26.09.2026</w:t>
+            </w:r>
+            <w:r>
+              <w:rPr>
+                <w:sz w:val="28"/>
+                <w:szCs w:val="28"/>
+              </w:rPr>
             </w:r>
           </w:p>
         </w:tc>
         <w:tc>
           <w:tcPr>
+            <w:tcBorders/>
             <w:tcW w:w="5505" w:type="dxa"/>
             <w:vAlign w:val="center"/>
           </w:tcPr>
           <w:p>
             <w:pPr>
-              <w:spacing w:before="0" w:after="0" w:line="240" w:lineRule="auto"/>
+              <w:spacing w:after="0" w:before="0" w:line="240" w:lineRule="auto"/>
+              <w:ind/>
               <w:jc w:val="left"/>
+              <w:rPr>
+                <w:sz w:val="28"/>
+                <w:szCs w:val="28"/>
+              </w:rPr>
             </w:pPr>
             <w:r>
               <w:rPr>
                 <w:rFonts w:ascii="Times New Roman" w:hAnsi="Times New Roman"/>
-                <w:sz w:val="24"/>
                 <w:color w:val="000000"/>
+                <w:sz w:val="28"/>
+                <w:szCs w:val="28"/>
               </w:rPr>
-              <w:t>Прототип интерфейса</w:t>
+              <w:t xml:space="preserve">Прототип интерфейса</w:t>
+            </w:r>
+            <w:r>
+              <w:rPr>
+                <w:sz w:val="28"/>
+                <w:szCs w:val="28"/>
+              </w:rPr>
             </w:r>
           </w:p>
         </w:tc>
@@ -4339,61 +6148,100 @@
         </w:trPr>
         <w:tc>
           <w:tcPr>
+            <w:tcBorders/>
             <w:tcW w:w="1500" w:type="dxa"/>
             <w:vAlign w:val="center"/>
           </w:tcPr>
           <w:p>
             <w:pPr>
-              <w:spacing w:before="0" w:after="0" w:line="240" w:lineRule="auto"/>
+              <w:spacing w:after="0" w:before="0" w:line="240" w:lineRule="auto"/>
+              <w:ind/>
               <w:jc w:val="left"/>
+              <w:rPr>
+                <w:sz w:val="28"/>
+                <w:szCs w:val="28"/>
+              </w:rPr>
             </w:pPr>
             <w:r>
               <w:rPr>
                 <w:rFonts w:ascii="Times New Roman" w:hAnsi="Times New Roman"/>
-                <w:sz w:val="24"/>
                 <w:color w:val="000000"/>
+                <w:sz w:val="28"/>
+                <w:szCs w:val="28"/>
               </w:rPr>
-              <w:t>SGT-15</w:t>
+              <w:t xml:space="preserve">SGT-15</w:t>
+            </w:r>
+            <w:r>
+              <w:rPr>
+                <w:sz w:val="28"/>
+                <w:szCs w:val="28"/>
+              </w:rPr>
             </w:r>
           </w:p>
         </w:tc>
         <w:tc>
           <w:tcPr>
+            <w:tcBorders/>
             <w:tcW w:w="2350" w:type="dxa"/>
             <w:vAlign w:val="center"/>
           </w:tcPr>
           <w:p>
             <w:pPr>
-              <w:spacing w:before="0" w:after="0" w:line="240" w:lineRule="auto"/>
+              <w:spacing w:after="0" w:before="0" w:line="240" w:lineRule="auto"/>
+              <w:ind/>
               <w:jc w:val="center"/>
+              <w:rPr>
+                <w:sz w:val="28"/>
+                <w:szCs w:val="28"/>
+              </w:rPr>
             </w:pPr>
             <w:r>
               <w:rPr>
                 <w:rFonts w:ascii="Times New Roman" w:hAnsi="Times New Roman"/>
-                <w:sz w:val="24"/>
                 <w:color w:val="000000"/>
+                <w:sz w:val="28"/>
+                <w:szCs w:val="28"/>
               </w:rPr>
-              <w:t>03.10.2026</w:t>
+              <w:t xml:space="preserve">03.10.2026</w:t>
+            </w:r>
+            <w:r>
+              <w:rPr>
+                <w:sz w:val="28"/>
+                <w:szCs w:val="28"/>
+              </w:rPr>
             </w:r>
           </w:p>
         </w:tc>
         <w:tc>
           <w:tcPr>
+            <w:tcBorders/>
             <w:tcW w:w="5505" w:type="dxa"/>
             <w:vAlign w:val="center"/>
           </w:tcPr>
           <w:p>
             <w:pPr>
-              <w:spacing w:before="0" w:after="0" w:line="240" w:lineRule="auto"/>
+              <w:spacing w:after="0" w:before="0" w:line="240" w:lineRule="auto"/>
+              <w:ind/>
               <w:jc w:val="left"/>
+              <w:rPr>
+                <w:sz w:val="28"/>
+                <w:szCs w:val="28"/>
+              </w:rPr>
             </w:pPr>
             <w:r>
               <w:rPr>
                 <w:rFonts w:ascii="Times New Roman" w:hAnsi="Times New Roman"/>
-                <w:sz w:val="24"/>
                 <w:color w:val="000000"/>
+                <w:sz w:val="28"/>
+                <w:szCs w:val="28"/>
               </w:rPr>
-              <w:t>Инфраструктура</w:t>
+              <w:t xml:space="preserve">Инфраструктура</w:t>
+            </w:r>
+            <w:r>
+              <w:rPr>
+                <w:sz w:val="28"/>
+                <w:szCs w:val="28"/>
+              </w:rPr>
             </w:r>
           </w:p>
         </w:tc>
@@ -4404,61 +6252,100 @@
         </w:trPr>
         <w:tc>
           <w:tcPr>
+            <w:tcBorders/>
             <w:tcW w:w="1500" w:type="dxa"/>
             <w:vAlign w:val="center"/>
           </w:tcPr>
           <w:p>
             <w:pPr>
-              <w:spacing w:before="0" w:after="0" w:line="240" w:lineRule="auto"/>
+              <w:spacing w:after="0" w:before="0" w:line="240" w:lineRule="auto"/>
+              <w:ind/>
               <w:jc w:val="left"/>
+              <w:rPr>
+                <w:sz w:val="28"/>
+                <w:szCs w:val="28"/>
+              </w:rPr>
             </w:pPr>
             <w:r>
               <w:rPr>
                 <w:rFonts w:ascii="Times New Roman" w:hAnsi="Times New Roman"/>
-                <w:sz w:val="24"/>
                 <w:color w:val="000000"/>
+                <w:sz w:val="28"/>
+                <w:szCs w:val="28"/>
               </w:rPr>
-              <w:t>SGT-16</w:t>
+              <w:t xml:space="preserve">SGT-16</w:t>
+            </w:r>
+            <w:r>
+              <w:rPr>
+                <w:sz w:val="28"/>
+                <w:szCs w:val="28"/>
+              </w:rPr>
             </w:r>
           </w:p>
         </w:tc>
         <w:tc>
           <w:tcPr>
+            <w:tcBorders/>
             <w:tcW w:w="2350" w:type="dxa"/>
             <w:vAlign w:val="center"/>
           </w:tcPr>
           <w:p>
             <w:pPr>
-              <w:spacing w:before="0" w:after="0" w:line="240" w:lineRule="auto"/>
+              <w:spacing w:after="0" w:before="0" w:line="240" w:lineRule="auto"/>
+              <w:ind/>
               <w:jc w:val="center"/>
+              <w:rPr>
+                <w:sz w:val="28"/>
+                <w:szCs w:val="28"/>
+              </w:rPr>
             </w:pPr>
             <w:r>
               <w:rPr>
                 <w:rFonts w:ascii="Times New Roman" w:hAnsi="Times New Roman"/>
-                <w:sz w:val="24"/>
                 <w:color w:val="000000"/>
+                <w:sz w:val="28"/>
+                <w:szCs w:val="28"/>
               </w:rPr>
-              <w:t>24.10.2026</w:t>
+              <w:t xml:space="preserve">24.10.2026</w:t>
+            </w:r>
+            <w:r>
+              <w:rPr>
+                <w:sz w:val="28"/>
+                <w:szCs w:val="28"/>
+              </w:rPr>
             </w:r>
           </w:p>
         </w:tc>
         <w:tc>
           <w:tcPr>
+            <w:tcBorders/>
             <w:tcW w:w="5505" w:type="dxa"/>
             <w:vAlign w:val="center"/>
           </w:tcPr>
           <w:p>
             <w:pPr>
-              <w:spacing w:before="0" w:after="0" w:line="240" w:lineRule="auto"/>
+              <w:spacing w:after="0" w:before="0" w:line="240" w:lineRule="auto"/>
+              <w:ind/>
               <w:jc w:val="left"/>
+              <w:rPr>
+                <w:sz w:val="28"/>
+                <w:szCs w:val="28"/>
+              </w:rPr>
             </w:pPr>
             <w:r>
               <w:rPr>
                 <w:rFonts w:ascii="Times New Roman" w:hAnsi="Times New Roman"/>
-                <w:sz w:val="24"/>
                 <w:color w:val="000000"/>
+                <w:sz w:val="28"/>
+                <w:szCs w:val="28"/>
               </w:rPr>
-              <w:t>Данные и администрирование</w:t>
+              <w:t xml:space="preserve">Данные и администрирование</w:t>
+            </w:r>
+            <w:r>
+              <w:rPr>
+                <w:sz w:val="28"/>
+                <w:szCs w:val="28"/>
+              </w:rPr>
             </w:r>
           </w:p>
         </w:tc>
@@ -4469,61 +6356,100 @@
         </w:trPr>
         <w:tc>
           <w:tcPr>
+            <w:tcBorders/>
             <w:tcW w:w="1500" w:type="dxa"/>
             <w:vAlign w:val="center"/>
           </w:tcPr>
           <w:p>
             <w:pPr>
-              <w:spacing w:before="0" w:after="0" w:line="240" w:lineRule="auto"/>
+              <w:spacing w:after="0" w:before="0" w:line="240" w:lineRule="auto"/>
+              <w:ind/>
               <w:jc w:val="left"/>
+              <w:rPr>
+                <w:sz w:val="28"/>
+                <w:szCs w:val="28"/>
+              </w:rPr>
             </w:pPr>
             <w:r>
               <w:rPr>
                 <w:rFonts w:ascii="Times New Roman" w:hAnsi="Times New Roman"/>
-                <w:sz w:val="24"/>
                 <w:color w:val="000000"/>
+                <w:sz w:val="28"/>
+                <w:szCs w:val="28"/>
               </w:rPr>
-              <w:t>SGT-17</w:t>
+              <w:t xml:space="preserve">SGT-17</w:t>
+            </w:r>
+            <w:r>
+              <w:rPr>
+                <w:sz w:val="28"/>
+                <w:szCs w:val="28"/>
+              </w:rPr>
             </w:r>
           </w:p>
         </w:tc>
         <w:tc>
           <w:tcPr>
+            <w:tcBorders/>
             <w:tcW w:w="2350" w:type="dxa"/>
             <w:vAlign w:val="center"/>
           </w:tcPr>
           <w:p>
             <w:pPr>
-              <w:spacing w:before="0" w:after="0" w:line="240" w:lineRule="auto"/>
+              <w:spacing w:after="0" w:before="0" w:line="240" w:lineRule="auto"/>
+              <w:ind/>
               <w:jc w:val="center"/>
+              <w:rPr>
+                <w:sz w:val="28"/>
+                <w:szCs w:val="28"/>
+              </w:rPr>
             </w:pPr>
             <w:r>
               <w:rPr>
                 <w:rFonts w:ascii="Times New Roman" w:hAnsi="Times New Roman"/>
-                <w:sz w:val="24"/>
                 <w:color w:val="000000"/>
+                <w:sz w:val="28"/>
+                <w:szCs w:val="28"/>
               </w:rPr>
-              <w:t>14.11.2026</w:t>
+              <w:t xml:space="preserve">14.11.2026</w:t>
+            </w:r>
+            <w:r>
+              <w:rPr>
+                <w:sz w:val="28"/>
+                <w:szCs w:val="28"/>
+              </w:rPr>
             </w:r>
           </w:p>
         </w:tc>
         <w:tc>
           <w:tcPr>
+            <w:tcBorders/>
             <w:tcW w:w="5505" w:type="dxa"/>
             <w:vAlign w:val="center"/>
           </w:tcPr>
           <w:p>
             <w:pPr>
-              <w:spacing w:before="0" w:after="0" w:line="240" w:lineRule="auto"/>
+              <w:spacing w:after="0" w:before="0" w:line="240" w:lineRule="auto"/>
+              <w:ind/>
               <w:jc w:val="left"/>
+              <w:rPr>
+                <w:sz w:val="28"/>
+                <w:szCs w:val="28"/>
+              </w:rPr>
             </w:pPr>
             <w:r>
               <w:rPr>
                 <w:rFonts w:ascii="Times New Roman" w:hAnsi="Times New Roman"/>
-                <w:sz w:val="24"/>
                 <w:color w:val="000000"/>
+                <w:sz w:val="28"/>
+                <w:szCs w:val="28"/>
               </w:rPr>
-              <w:t>Публичный справочник</w:t>
+              <w:t xml:space="preserve">Публичный справочник</w:t>
+            </w:r>
+            <w:r>
+              <w:rPr>
+                <w:sz w:val="28"/>
+                <w:szCs w:val="28"/>
+              </w:rPr>
             </w:r>
           </w:p>
         </w:tc>
@@ -4534,61 +6460,100 @@
         </w:trPr>
         <w:tc>
           <w:tcPr>
+            <w:tcBorders/>
             <w:tcW w:w="1500" w:type="dxa"/>
             <w:vAlign w:val="center"/>
           </w:tcPr>
           <w:p>
             <w:pPr>
-              <w:spacing w:before="0" w:after="0" w:line="240" w:lineRule="auto"/>
+              <w:spacing w:after="0" w:before="0" w:line="240" w:lineRule="auto"/>
+              <w:ind/>
               <w:jc w:val="left"/>
+              <w:rPr>
+                <w:sz w:val="28"/>
+                <w:szCs w:val="28"/>
+              </w:rPr>
             </w:pPr>
             <w:r>
               <w:rPr>
                 <w:rFonts w:ascii="Times New Roman" w:hAnsi="Times New Roman"/>
-                <w:sz w:val="24"/>
                 <w:color w:val="000000"/>
+                <w:sz w:val="28"/>
+                <w:szCs w:val="28"/>
               </w:rPr>
-              <w:t>SGT-18</w:t>
+              <w:t xml:space="preserve">SGT-18</w:t>
+            </w:r>
+            <w:r>
+              <w:rPr>
+                <w:sz w:val="28"/>
+                <w:szCs w:val="28"/>
+              </w:rPr>
             </w:r>
           </w:p>
         </w:tc>
         <w:tc>
           <w:tcPr>
+            <w:tcBorders/>
             <w:tcW w:w="2350" w:type="dxa"/>
             <w:vAlign w:val="center"/>
           </w:tcPr>
           <w:p>
             <w:pPr>
-              <w:spacing w:before="0" w:after="0" w:line="240" w:lineRule="auto"/>
+              <w:spacing w:after="0" w:before="0" w:line="240" w:lineRule="auto"/>
+              <w:ind/>
               <w:jc w:val="center"/>
+              <w:rPr>
+                <w:sz w:val="28"/>
+                <w:szCs w:val="28"/>
+              </w:rPr>
             </w:pPr>
             <w:r>
               <w:rPr>
                 <w:rFonts w:ascii="Times New Roman" w:hAnsi="Times New Roman"/>
-                <w:sz w:val="24"/>
                 <w:color w:val="000000"/>
+                <w:sz w:val="28"/>
+                <w:szCs w:val="28"/>
               </w:rPr>
-              <w:t>28.11.2026</w:t>
+              <w:t xml:space="preserve">28.11.2026</w:t>
+            </w:r>
+            <w:r>
+              <w:rPr>
+                <w:sz w:val="28"/>
+                <w:szCs w:val="28"/>
+              </w:rPr>
             </w:r>
           </w:p>
         </w:tc>
         <w:tc>
           <w:tcPr>
+            <w:tcBorders/>
             <w:tcW w:w="5505" w:type="dxa"/>
             <w:vAlign w:val="center"/>
           </w:tcPr>
           <w:p>
             <w:pPr>
-              <w:spacing w:before="0" w:after="0" w:line="240" w:lineRule="auto"/>
+              <w:spacing w:after="0" w:before="0" w:line="240" w:lineRule="auto"/>
+              <w:ind/>
               <w:jc w:val="left"/>
+              <w:rPr>
+                <w:sz w:val="28"/>
+                <w:szCs w:val="28"/>
+              </w:rPr>
             </w:pPr>
             <w:r>
               <w:rPr>
                 <w:rFonts w:ascii="Times New Roman" w:hAnsi="Times New Roman"/>
-                <w:sz w:val="24"/>
                 <w:color w:val="000000"/>
+                <w:sz w:val="28"/>
+                <w:szCs w:val="28"/>
               </w:rPr>
-              <w:t>Расписания и адаптация</w:t>
+              <w:t xml:space="preserve">Расписания и адаптация</w:t>
+            </w:r>
+            <w:r>
+              <w:rPr>
+                <w:sz w:val="28"/>
+                <w:szCs w:val="28"/>
+              </w:rPr>
             </w:r>
           </w:p>
         </w:tc>
@@ -4599,61 +6564,100 @@
         </w:trPr>
         <w:tc>
           <w:tcPr>
+            <w:tcBorders/>
             <w:tcW w:w="1500" w:type="dxa"/>
             <w:vAlign w:val="center"/>
           </w:tcPr>
           <w:p>
             <w:pPr>
-              <w:spacing w:before="0" w:after="0" w:line="240" w:lineRule="auto"/>
+              <w:spacing w:after="0" w:before="0" w:line="240" w:lineRule="auto"/>
+              <w:ind/>
               <w:jc w:val="left"/>
+              <w:rPr>
+                <w:sz w:val="28"/>
+                <w:szCs w:val="28"/>
+              </w:rPr>
             </w:pPr>
             <w:r>
               <w:rPr>
                 <w:rFonts w:ascii="Times New Roman" w:hAnsi="Times New Roman"/>
-                <w:sz w:val="24"/>
                 <w:color w:val="000000"/>
+                <w:sz w:val="28"/>
+                <w:szCs w:val="28"/>
               </w:rPr>
-              <w:t>SGT-19</w:t>
+              <w:t xml:space="preserve">SGT-19</w:t>
+            </w:r>
+            <w:r>
+              <w:rPr>
+                <w:sz w:val="28"/>
+                <w:szCs w:val="28"/>
+              </w:rPr>
             </w:r>
           </w:p>
         </w:tc>
         <w:tc>
           <w:tcPr>
+            <w:tcBorders/>
             <w:tcW w:w="2350" w:type="dxa"/>
             <w:vAlign w:val="center"/>
           </w:tcPr>
           <w:p>
             <w:pPr>
-              <w:spacing w:before="0" w:after="0" w:line="240" w:lineRule="auto"/>
+              <w:spacing w:after="0" w:before="0" w:line="240" w:lineRule="auto"/>
+              <w:ind/>
               <w:jc w:val="center"/>
+              <w:rPr>
+                <w:sz w:val="28"/>
+                <w:szCs w:val="28"/>
+              </w:rPr>
             </w:pPr>
             <w:r>
               <w:rPr>
                 <w:rFonts w:ascii="Times New Roman" w:hAnsi="Times New Roman"/>
-                <w:sz w:val="24"/>
                 <w:color w:val="000000"/>
+                <w:sz w:val="28"/>
+                <w:szCs w:val="28"/>
               </w:rPr>
-              <w:t>05.12.2026</w:t>
+              <w:t xml:space="preserve">05.12.2026</w:t>
+            </w:r>
+            <w:r>
+              <w:rPr>
+                <w:sz w:val="28"/>
+                <w:szCs w:val="28"/>
+              </w:rPr>
             </w:r>
           </w:p>
         </w:tc>
         <w:tc>
           <w:tcPr>
+            <w:tcBorders/>
             <w:tcW w:w="5505" w:type="dxa"/>
             <w:vAlign w:val="center"/>
           </w:tcPr>
           <w:p>
             <w:pPr>
-              <w:spacing w:before="0" w:after="0" w:line="240" w:lineRule="auto"/>
+              <w:spacing w:after="0" w:before="0" w:line="240" w:lineRule="auto"/>
+              <w:ind/>
               <w:jc w:val="left"/>
+              <w:rPr>
+                <w:sz w:val="28"/>
+                <w:szCs w:val="28"/>
+              </w:rPr>
             </w:pPr>
             <w:r>
               <w:rPr>
                 <w:rFonts w:ascii="Times New Roman" w:hAnsi="Times New Roman"/>
-                <w:sz w:val="24"/>
                 <w:color w:val="000000"/>
+                <w:sz w:val="28"/>
+                <w:szCs w:val="28"/>
               </w:rPr>
-              <w:t>Итоговое тестирование</w:t>
+              <w:t xml:space="preserve">Итоговое тестирование</w:t>
+            </w:r>
+            <w:r>
+              <w:rPr>
+                <w:sz w:val="28"/>
+                <w:szCs w:val="28"/>
+              </w:rPr>
             </w:r>
           </w:p>
         </w:tc>
@@ -4664,61 +6668,100 @@
         </w:trPr>
         <w:tc>
           <w:tcPr>
+            <w:tcBorders/>
             <w:tcW w:w="1500" w:type="dxa"/>
             <w:vAlign w:val="center"/>
           </w:tcPr>
           <w:p>
             <w:pPr>
-              <w:spacing w:before="0" w:after="0" w:line="240" w:lineRule="auto"/>
+              <w:spacing w:after="0" w:before="0" w:line="240" w:lineRule="auto"/>
+              <w:ind/>
               <w:jc w:val="left"/>
+              <w:rPr>
+                <w:sz w:val="28"/>
+                <w:szCs w:val="28"/>
+              </w:rPr>
             </w:pPr>
             <w:r>
               <w:rPr>
                 <w:rFonts w:ascii="Times New Roman" w:hAnsi="Times New Roman"/>
-                <w:sz w:val="24"/>
                 <w:color w:val="000000"/>
+                <w:sz w:val="28"/>
+                <w:szCs w:val="28"/>
               </w:rPr>
-              <w:t>SGT-20</w:t>
+              <w:t xml:space="preserve">SGT-20</w:t>
+            </w:r>
+            <w:r>
+              <w:rPr>
+                <w:sz w:val="28"/>
+                <w:szCs w:val="28"/>
+              </w:rPr>
             </w:r>
           </w:p>
         </w:tc>
         <w:tc>
           <w:tcPr>
+            <w:tcBorders/>
             <w:tcW w:w="2350" w:type="dxa"/>
             <w:vAlign w:val="center"/>
           </w:tcPr>
           <w:p>
             <w:pPr>
-              <w:spacing w:before="0" w:after="0" w:line="240" w:lineRule="auto"/>
+              <w:spacing w:after="0" w:before="0" w:line="240" w:lineRule="auto"/>
+              <w:ind/>
               <w:jc w:val="center"/>
+              <w:rPr>
+                <w:sz w:val="28"/>
+                <w:szCs w:val="28"/>
+              </w:rPr>
             </w:pPr>
             <w:r>
               <w:rPr>
                 <w:rFonts w:ascii="Times New Roman" w:hAnsi="Times New Roman"/>
-                <w:sz w:val="24"/>
                 <w:color w:val="000000"/>
+                <w:sz w:val="28"/>
+                <w:szCs w:val="28"/>
               </w:rPr>
-              <w:t>08.12.2026</w:t>
+              <w:t xml:space="preserve">08.12.2026</w:t>
+            </w:r>
+            <w:r>
+              <w:rPr>
+                <w:sz w:val="28"/>
+                <w:szCs w:val="28"/>
+              </w:rPr>
             </w:r>
           </w:p>
         </w:tc>
         <w:tc>
           <w:tcPr>
+            <w:tcBorders/>
             <w:tcW w:w="5505" w:type="dxa"/>
             <w:vAlign w:val="center"/>
           </w:tcPr>
           <w:p>
             <w:pPr>
-              <w:spacing w:before="0" w:after="0" w:line="240" w:lineRule="auto"/>
+              <w:spacing w:after="0" w:before="0" w:line="240" w:lineRule="auto"/>
+              <w:ind/>
               <w:jc w:val="left"/>
+              <w:rPr>
+                <w:sz w:val="28"/>
+                <w:szCs w:val="28"/>
+              </w:rPr>
             </w:pPr>
             <w:r>
               <w:rPr>
                 <w:rFonts w:ascii="Times New Roman" w:hAnsi="Times New Roman"/>
-                <w:sz w:val="24"/>
                 <w:color w:val="000000"/>
+                <w:sz w:val="28"/>
+                <w:szCs w:val="28"/>
               </w:rPr>
-              <w:t>Релиз и итоговая сдача</w:t>
+              <w:t xml:space="preserve">Релиз и итоговая сдача</w:t>
+            </w:r>
+            <w:r>
+              <w:rPr>
+                <w:sz w:val="28"/>
+                <w:szCs w:val="28"/>
+              </w:rPr>
             </w:r>
           </w:p>
         </w:tc>
@@ -4726,7 +6769,6 @@
     </w:tbl>
     <w:p>
       <w:pPr>
-        <w:pBdr/>
         <w:spacing w:after="120" w:line="276" w:lineRule="auto"/>
         <w:ind/>
         <w:jc w:val="both"/>
@@ -4743,12 +6785,16 @@
           <w:sz w:val="28"/>
           <w:szCs w:val="28"/>
         </w:rPr>
-        <w:t xml:space="preserve"/>
+      </w:r>
+      <w:r>
+        <w:rPr>
+          <w:sz w:val="28"/>
+          <w:szCs w:val="28"/>
+        </w:rPr>
       </w:r>
     </w:p>
     <w:p>
       <w:pPr>
-        <w:pBdr/>
         <w:spacing w:after="120" w:line="276" w:lineRule="auto"/>
         <w:ind/>
         <w:jc w:val="both"/>
@@ -4765,20 +6811,8 @@
           <w:sz w:val="28"/>
           <w:szCs w:val="28"/>
         </w:rPr>
-        <w:t xml:space="preserve">CI измеряет качество при каждом изменении. Для фиксации завершённого этапа отправляется тег stage/SGT-15 либо запускается CI вручную с полем stage. JSON содержит ID этапа, фактическое время, SHA и ссылку на запуск. Тег сохраняет точную версию кода; снимок и исходные отчёты сохраняются в docs/measurements/SGT-15 через PR.</w:t>
+        <w:t xml:space="preserve">CI измеряет качество при каждом изменении. Для фиксации завершённо</w:t>
       </w:r>
-    </w:p>
-    <w:p>
-      <w:pPr>
-        <w:pBdr/>
-        <w:spacing w:after="120" w:line="276" w:lineRule="auto"/>
-        <w:ind/>
-        <w:jc w:val="both"/>
-        <w:rPr>
-          <w:sz w:val="28"/>
-          <w:szCs w:val="28"/>
-        </w:rPr>
-      </w:pPr>
       <w:r>
         <w:rPr>
           <w:rFonts w:ascii="Times New Roman" w:hAnsi="Times New Roman"/>
@@ -4787,7 +6821,50 @@
           <w:sz w:val="28"/>
           <w:szCs w:val="28"/>
         </w:rPr>
-        <w:t xml:space="preserve">Настроен воспроизводимый процесс от коммита и PR до проверенной сборки и предварительного релиза. Метрики собираются автоматически и привязываются к этапам существующего плана YouTrack. Оставшиеся функциональные задачи и сроки их фактической сдачи продолжают отслеживаться в YouTrack.</w:t>
+        <w:t xml:space="preserve">го этапа отправляется тег stage/SGT-15 либо запускается CI вручную с полем stage. JSON содержит ID этапа, фактическое время, SHA и ссылку на запуск. Тег сохраняет точную версию кода; снимок и исходные отчёты сохраняются в docs/measurements/SGT-15 через PR.</w:t>
+      </w:r>
+      <w:r>
+        <w:rPr>
+          <w:sz w:val="28"/>
+          <w:szCs w:val="28"/>
+        </w:rPr>
+      </w:r>
+    </w:p>
+    <w:p>
+      <w:pPr>
+        <w:spacing w:after="120" w:line="276" w:lineRule="auto"/>
+        <w:ind/>
+        <w:jc w:val="both"/>
+        <w:rPr>
+          <w:sz w:val="28"/>
+          <w:szCs w:val="28"/>
+        </w:rPr>
+      </w:pPr>
+      <w:r>
+        <w:rPr>
+          <w:rFonts w:ascii="Times New Roman" w:hAnsi="Times New Roman"/>
+          <w:b w:val="0"/>
+          <w:color w:val="000000"/>
+          <w:sz w:val="28"/>
+          <w:szCs w:val="28"/>
+        </w:rPr>
+        <w:t xml:space="preserve">Настроен воспроизводимый про</w:t>
+      </w:r>
+      <w:r>
+        <w:rPr>
+          <w:rFonts w:ascii="Times New Roman" w:hAnsi="Times New Roman"/>
+          <w:b w:val="0"/>
+          <w:color w:val="000000"/>
+          <w:sz w:val="28"/>
+          <w:szCs w:val="28"/>
+        </w:rPr>
+        <w:t xml:space="preserve">цесс от коммита и PR до проверенной сборки и предварительного релиза. Метрики собираются автоматически и привязываются к этапам существующего плана YouTrack. Оставшиеся функциональные задачи и сроки их фактической сдачи продолжают отслеживаться в YouTrack.</w:t>
+      </w:r>
+      <w:r>
+        <w:rPr>
+          <w:sz w:val="28"/>
+          <w:szCs w:val="28"/>
+        </w:rPr>
       </w:r>
     </w:p>
     <w:sectPr>
@@ -4807,7 +6884,6 @@
   <w:endnote w:type="separator" w:id="-1">
     <w:p>
       <w:pPr>
-        <w:pBdr/>
         <w:spacing w:after="0" w:line="240" w:lineRule="auto"/>
         <w:ind/>
         <w:rPr/>
@@ -4821,7 +6897,6 @@
   <w:endnote w:type="continuationSeparator" w:id="0">
     <w:p>
       <w:pPr>
-        <w:pBdr/>
         <w:spacing w:after="0" w:line="240" w:lineRule="auto"/>
         <w:ind/>
         <w:rPr/>
@@ -4840,7 +6915,6 @@
   <w:footnote w:type="separator" w:id="-1">
     <w:p>
       <w:pPr>
-        <w:pBdr/>
         <w:spacing w:after="0" w:line="240" w:lineRule="auto"/>
         <w:ind/>
         <w:rPr/>
@@ -4854,7 +6928,6 @@
   <w:footnote w:type="continuationSeparator" w:id="0">
     <w:p>
       <w:pPr>
-        <w:pBdr/>
         <w:spacing w:after="0" w:line="240" w:lineRule="auto"/>
         <w:ind/>
         <w:rPr/>

</xml_diff>